<commit_message>
Worked on project book, small refactors
</commit_message>
<xml_diff>
--- a/Uri_Cohen_Project_book.docx
+++ b/Uri_Cohen_Project_book.docx
@@ -6,7 +6,7 @@
       <w:pPr>
         <w:bidi/>
         <w:rPr>
-          <w:rFonts w:ascii="Arial" w:hAnsi="Arial" w:hint="cs"/>
+          <w:rFonts w:ascii="Arial" w:hAnsi="Arial"/>
           <w:sz w:val="32"/>
           <w:szCs w:val="32"/>
           <w:rtl/>
@@ -665,12 +665,6 @@
         <w:gridCol w:w="6553"/>
       </w:tblGrid>
       <w:tr>
-        <w:tblPrEx>
-          <w:tblCellMar>
-            <w:top w:w="0" w:type="dxa"/>
-            <w:bottom w:w="0" w:type="dxa"/>
-          </w:tblCellMar>
-        </w:tblPrEx>
         <w:trPr>
           <w:trHeight w:val="480"/>
           <w:jc w:val="center"/>
@@ -770,12 +764,6 @@
         </w:tc>
       </w:tr>
       <w:tr>
-        <w:tblPrEx>
-          <w:tblCellMar>
-            <w:top w:w="0" w:type="dxa"/>
-            <w:bottom w:w="0" w:type="dxa"/>
-          </w:tblCellMar>
-        </w:tblPrEx>
         <w:trPr>
           <w:trHeight w:val="480"/>
           <w:jc w:val="center"/>
@@ -867,12 +855,6 @@
         </w:tc>
       </w:tr>
       <w:tr>
-        <w:tblPrEx>
-          <w:tblCellMar>
-            <w:top w:w="0" w:type="dxa"/>
-            <w:bottom w:w="0" w:type="dxa"/>
-          </w:tblCellMar>
-        </w:tblPrEx>
         <w:trPr>
           <w:trHeight w:val="480"/>
           <w:jc w:val="center"/>
@@ -950,7 +932,7 @@
               <w:bidi/>
               <w:ind w:left="0"/>
               <w:rPr>
-                <w:rFonts w:ascii="Arial" w:hAnsi="Arial" w:hint="cs"/>
+                <w:rFonts w:ascii="Arial" w:hAnsi="Arial"/>
                 <w:sz w:val="20"/>
                 <w:lang w:bidi="he-IL"/>
               </w:rPr>
@@ -969,12 +951,6 @@
         </w:tc>
       </w:tr>
       <w:tr>
-        <w:tblPrEx>
-          <w:tblCellMar>
-            <w:top w:w="0" w:type="dxa"/>
-            <w:bottom w:w="0" w:type="dxa"/>
-          </w:tblCellMar>
-        </w:tblPrEx>
         <w:trPr>
           <w:trHeight w:val="480"/>
           <w:jc w:val="center"/>
@@ -994,7 +970,7 @@
               <w:bidi/>
               <w:ind w:left="34"/>
               <w:rPr>
-                <w:rFonts w:ascii="Arial" w:hAnsi="Arial" w:hint="cs"/>
+                <w:rFonts w:ascii="Arial" w:hAnsi="Arial"/>
                 <w:sz w:val="28"/>
                 <w:szCs w:val="28"/>
                 <w:lang w:bidi="he-IL"/>
@@ -1027,7 +1003,7 @@
               <w:bidi/>
               <w:ind w:left="0"/>
               <w:rPr>
-                <w:rFonts w:ascii="Arial" w:hAnsi="Arial" w:hint="cs"/>
+                <w:rFonts w:ascii="Arial" w:hAnsi="Arial"/>
                 <w:sz w:val="28"/>
                 <w:szCs w:val="28"/>
                 <w:lang w:bidi="he-IL"/>
@@ -1060,7 +1036,7 @@
               <w:bidi/>
               <w:ind w:left="0"/>
               <w:rPr>
-                <w:rFonts w:ascii="Arial" w:hAnsi="Arial" w:hint="cs"/>
+                <w:rFonts w:ascii="Arial" w:hAnsi="Arial"/>
                 <w:sz w:val="28"/>
                 <w:szCs w:val="28"/>
                 <w:lang w:bidi="he-IL"/>
@@ -1080,12 +1056,6 @@
         </w:tc>
       </w:tr>
       <w:tr>
-        <w:tblPrEx>
-          <w:tblCellMar>
-            <w:top w:w="0" w:type="dxa"/>
-            <w:bottom w:w="0" w:type="dxa"/>
-          </w:tblCellMar>
-        </w:tblPrEx>
         <w:trPr>
           <w:trHeight w:val="480"/>
           <w:jc w:val="center"/>
@@ -1105,7 +1075,7 @@
               <w:bidi/>
               <w:ind w:left="34"/>
               <w:rPr>
-                <w:rFonts w:ascii="Arial" w:hAnsi="Arial" w:hint="cs"/>
+                <w:rFonts w:ascii="Arial" w:hAnsi="Arial"/>
                 <w:sz w:val="28"/>
                 <w:szCs w:val="28"/>
                 <w:lang w:bidi="he-IL"/>
@@ -1138,7 +1108,7 @@
               <w:bidi/>
               <w:ind w:left="0"/>
               <w:rPr>
-                <w:rFonts w:ascii="Arial" w:hAnsi="Arial" w:hint="cs"/>
+                <w:rFonts w:ascii="Arial" w:hAnsi="Arial"/>
                 <w:sz w:val="28"/>
                 <w:szCs w:val="28"/>
                 <w:lang w:bidi="he-IL"/>
@@ -1171,7 +1141,7 @@
               <w:bidi/>
               <w:ind w:left="0"/>
               <w:rPr>
-                <w:rFonts w:ascii="Arial" w:hAnsi="Arial" w:hint="cs"/>
+                <w:rFonts w:ascii="Arial" w:hAnsi="Arial"/>
                 <w:sz w:val="28"/>
                 <w:szCs w:val="28"/>
                 <w:lang w:bidi="he-IL"/>
@@ -1191,12 +1161,6 @@
         </w:tc>
       </w:tr>
       <w:tr>
-        <w:tblPrEx>
-          <w:tblCellMar>
-            <w:top w:w="0" w:type="dxa"/>
-            <w:bottom w:w="0" w:type="dxa"/>
-          </w:tblCellMar>
-        </w:tblPrEx>
         <w:trPr>
           <w:trHeight w:val="480"/>
           <w:jc w:val="center"/>
@@ -1216,7 +1180,7 @@
               <w:bidi/>
               <w:ind w:left="34"/>
               <w:rPr>
-                <w:rFonts w:ascii="Arial" w:hAnsi="Arial" w:hint="cs"/>
+                <w:rFonts w:ascii="Arial" w:hAnsi="Arial"/>
                 <w:sz w:val="28"/>
                 <w:szCs w:val="28"/>
                 <w:lang w:bidi="he-IL"/>
@@ -1249,7 +1213,7 @@
               <w:bidi/>
               <w:ind w:left="0"/>
               <w:rPr>
-                <w:rFonts w:ascii="Arial" w:hAnsi="Arial" w:hint="cs"/>
+                <w:rFonts w:ascii="Arial" w:hAnsi="Arial"/>
                 <w:sz w:val="28"/>
                 <w:szCs w:val="28"/>
                 <w:lang w:bidi="he-IL"/>
@@ -1282,21 +1246,21 @@
               <w:bidi/>
               <w:ind w:left="0"/>
               <w:rPr>
+                <w:rFonts w:ascii="Arial" w:hAnsi="Arial"/>
+                <w:sz w:val="28"/>
+                <w:szCs w:val="28"/>
+                <w:rtl/>
+                <w:lang w:bidi="he-IL"/>
+              </w:rPr>
+            </w:pPr>
+            <w:r>
+              <w:rPr>
                 <w:rFonts w:ascii="Arial" w:hAnsi="Arial" w:hint="cs"/>
                 <w:sz w:val="28"/>
                 <w:szCs w:val="28"/>
                 <w:rtl/>
                 <w:lang w:bidi="he-IL"/>
               </w:rPr>
-            </w:pPr>
-            <w:r>
-              <w:rPr>
-                <w:rFonts w:ascii="Arial" w:hAnsi="Arial" w:hint="cs"/>
-                <w:sz w:val="28"/>
-                <w:szCs w:val="28"/>
-                <w:rtl/>
-                <w:lang w:bidi="he-IL"/>
-              </w:rPr>
               <w:t xml:space="preserve">הוספת </w:t>
             </w:r>
             <w:r>
@@ -1312,12 +1276,6 @@
         </w:tc>
       </w:tr>
       <w:tr>
-        <w:tblPrEx>
-          <w:tblCellMar>
-            <w:top w:w="0" w:type="dxa"/>
-            <w:bottom w:w="0" w:type="dxa"/>
-          </w:tblCellMar>
-        </w:tblPrEx>
         <w:trPr>
           <w:trHeight w:val="480"/>
           <w:jc w:val="center"/>
@@ -1337,7 +1295,7 @@
               <w:bidi/>
               <w:ind w:left="34"/>
               <w:rPr>
-                <w:rFonts w:ascii="Arial" w:hAnsi="Arial" w:hint="cs"/>
+                <w:rFonts w:ascii="Arial" w:hAnsi="Arial"/>
                 <w:sz w:val="28"/>
                 <w:szCs w:val="28"/>
                 <w:lang w:bidi="he-IL"/>
@@ -1370,7 +1328,7 @@
               <w:bidi/>
               <w:ind w:left="0"/>
               <w:rPr>
-                <w:rFonts w:ascii="Arial" w:hAnsi="Arial" w:hint="cs"/>
+                <w:rFonts w:ascii="Arial" w:hAnsi="Arial"/>
                 <w:sz w:val="28"/>
                 <w:szCs w:val="28"/>
                 <w:lang w:bidi="he-IL"/>
@@ -1403,7 +1361,7 @@
               <w:bidi/>
               <w:ind w:left="0"/>
               <w:rPr>
-                <w:rFonts w:ascii="Arial" w:hAnsi="Arial" w:hint="cs"/>
+                <w:rFonts w:ascii="Arial" w:hAnsi="Arial"/>
                 <w:sz w:val="28"/>
                 <w:szCs w:val="28"/>
                 <w:lang w:bidi="he-IL"/>
@@ -1423,12 +1381,6 @@
         </w:tc>
       </w:tr>
       <w:tr>
-        <w:tblPrEx>
-          <w:tblCellMar>
-            <w:top w:w="0" w:type="dxa"/>
-            <w:bottom w:w="0" w:type="dxa"/>
-          </w:tblCellMar>
-        </w:tblPrEx>
         <w:trPr>
           <w:trHeight w:val="480"/>
           <w:jc w:val="center"/>
@@ -1448,7 +1400,7 @@
               <w:bidi/>
               <w:ind w:left="34"/>
               <w:rPr>
-                <w:rFonts w:ascii="Arial" w:hAnsi="Arial" w:hint="cs"/>
+                <w:rFonts w:ascii="Arial" w:hAnsi="Arial"/>
                 <w:sz w:val="28"/>
                 <w:szCs w:val="28"/>
                 <w:lang w:bidi="he-IL"/>
@@ -1481,7 +1433,7 @@
               <w:bidi/>
               <w:ind w:left="0"/>
               <w:rPr>
-                <w:rFonts w:ascii="Arial" w:hAnsi="Arial" w:hint="cs"/>
+                <w:rFonts w:ascii="Arial" w:hAnsi="Arial"/>
                 <w:sz w:val="28"/>
                 <w:szCs w:val="28"/>
                 <w:lang w:bidi="he-IL"/>
@@ -1514,13 +1466,32 @@
               <w:bidi/>
               <w:ind w:left="0"/>
               <w:rPr>
+                <w:rFonts w:ascii="Arial" w:hAnsi="Arial"/>
+                <w:sz w:val="28"/>
+                <w:szCs w:val="28"/>
+                <w:rtl/>
+                <w:lang w:bidi="he-IL"/>
+              </w:rPr>
+            </w:pPr>
+            <w:r>
+              <w:rPr>
                 <w:rFonts w:ascii="Arial" w:hAnsi="Arial" w:hint="cs"/>
                 <w:sz w:val="28"/>
                 <w:szCs w:val="28"/>
                 <w:rtl/>
                 <w:lang w:bidi="he-IL"/>
               </w:rPr>
-            </w:pPr>
+              <w:t>חיבור ל-</w:t>
+            </w:r>
+            <w:r>
+              <w:rPr>
+                <w:rFonts w:ascii="Arial" w:hAnsi="Arial"/>
+                <w:sz w:val="28"/>
+                <w:szCs w:val="28"/>
+                <w:lang w:bidi="he-IL"/>
+              </w:rPr>
+              <w:t>API</w:t>
+            </w:r>
             <w:r>
               <w:rPr>
                 <w:rFonts w:ascii="Arial" w:hAnsi="Arial" w:hint="cs"/>
@@ -1529,37 +1500,12 @@
                 <w:rtl/>
                 <w:lang w:bidi="he-IL"/>
               </w:rPr>
-              <w:t>חיבור ל-</w:t>
-            </w:r>
-            <w:r>
-              <w:rPr>
-                <w:rFonts w:ascii="Arial" w:hAnsi="Arial"/>
-                <w:sz w:val="28"/>
-                <w:szCs w:val="28"/>
-                <w:lang w:bidi="he-IL"/>
-              </w:rPr>
-              <w:t>API</w:t>
-            </w:r>
-            <w:r>
-              <w:rPr>
-                <w:rFonts w:ascii="Arial" w:hAnsi="Arial" w:hint="cs"/>
-                <w:sz w:val="28"/>
-                <w:szCs w:val="28"/>
-                <w:rtl/>
-                <w:lang w:bidi="he-IL"/>
-              </w:rPr>
               <w:t xml:space="preserve"> המתעדכן בזמן אמת</w:t>
             </w:r>
           </w:p>
         </w:tc>
       </w:tr>
       <w:tr>
-        <w:tblPrEx>
-          <w:tblCellMar>
-            <w:top w:w="0" w:type="dxa"/>
-            <w:bottom w:w="0" w:type="dxa"/>
-          </w:tblCellMar>
-        </w:tblPrEx>
         <w:trPr>
           <w:trHeight w:val="480"/>
           <w:jc w:val="center"/>
@@ -1579,7 +1525,7 @@
               <w:bidi/>
               <w:ind w:left="34"/>
               <w:rPr>
-                <w:rFonts w:ascii="Arial" w:hAnsi="Arial" w:hint="cs"/>
+                <w:rFonts w:ascii="Arial" w:hAnsi="Arial"/>
                 <w:sz w:val="28"/>
                 <w:szCs w:val="28"/>
                 <w:lang w:bidi="he-IL"/>
@@ -1612,7 +1558,7 @@
               <w:bidi/>
               <w:ind w:left="0"/>
               <w:rPr>
-                <w:rFonts w:ascii="Arial" w:hAnsi="Arial" w:hint="cs"/>
+                <w:rFonts w:ascii="Arial" w:hAnsi="Arial"/>
                 <w:sz w:val="28"/>
                 <w:szCs w:val="28"/>
                 <w:lang w:bidi="he-IL"/>
@@ -1645,7 +1591,7 @@
               <w:bidi/>
               <w:ind w:left="0"/>
               <w:rPr>
-                <w:rFonts w:ascii="Arial" w:hAnsi="Arial" w:hint="cs"/>
+                <w:rFonts w:ascii="Arial" w:hAnsi="Arial"/>
                 <w:sz w:val="28"/>
                 <w:szCs w:val="28"/>
                 <w:lang w:bidi="he-IL"/>
@@ -1665,12 +1611,6 @@
         </w:tc>
       </w:tr>
       <w:tr>
-        <w:tblPrEx>
-          <w:tblCellMar>
-            <w:top w:w="0" w:type="dxa"/>
-            <w:bottom w:w="0" w:type="dxa"/>
-          </w:tblCellMar>
-        </w:tblPrEx>
         <w:trPr>
           <w:trHeight w:val="480"/>
           <w:jc w:val="center"/>
@@ -1690,7 +1630,7 @@
               <w:bidi/>
               <w:ind w:left="34"/>
               <w:rPr>
-                <w:rFonts w:ascii="Arial" w:hAnsi="Arial" w:hint="cs"/>
+                <w:rFonts w:ascii="Arial" w:hAnsi="Arial"/>
                 <w:sz w:val="28"/>
                 <w:szCs w:val="28"/>
                 <w:lang w:bidi="he-IL"/>
@@ -1723,7 +1663,7 @@
               <w:bidi/>
               <w:ind w:left="0"/>
               <w:rPr>
-                <w:rFonts w:ascii="Arial" w:hAnsi="Arial" w:hint="cs"/>
+                <w:rFonts w:ascii="Arial" w:hAnsi="Arial"/>
                 <w:sz w:val="28"/>
                 <w:szCs w:val="28"/>
                 <w:lang w:bidi="he-IL"/>
@@ -1756,7 +1696,7 @@
               <w:bidi/>
               <w:ind w:left="0"/>
               <w:rPr>
-                <w:rFonts w:ascii="Arial" w:hAnsi="Arial" w:hint="cs"/>
+                <w:rFonts w:ascii="Arial" w:hAnsi="Arial"/>
                 <w:sz w:val="28"/>
                 <w:szCs w:val="28"/>
                 <w:lang w:bidi="he-IL"/>
@@ -1776,12 +1716,6 @@
         </w:tc>
       </w:tr>
       <w:tr>
-        <w:tblPrEx>
-          <w:tblCellMar>
-            <w:top w:w="0" w:type="dxa"/>
-            <w:bottom w:w="0" w:type="dxa"/>
-          </w:tblCellMar>
-        </w:tblPrEx>
         <w:trPr>
           <w:trHeight w:val="480"/>
           <w:jc w:val="center"/>
@@ -1801,7 +1735,7 @@
               <w:bidi/>
               <w:ind w:left="34"/>
               <w:rPr>
-                <w:rFonts w:ascii="Arial" w:hAnsi="Arial" w:hint="cs"/>
+                <w:rFonts w:ascii="Arial" w:hAnsi="Arial"/>
                 <w:sz w:val="28"/>
                 <w:szCs w:val="28"/>
                 <w:lang w:bidi="he-IL"/>
@@ -1835,7 +1769,7 @@
               <w:bidi/>
               <w:ind w:left="0"/>
               <w:rPr>
-                <w:rFonts w:ascii="Arial" w:hAnsi="Arial" w:hint="cs"/>
+                <w:rFonts w:ascii="Arial" w:hAnsi="Arial"/>
                 <w:sz w:val="28"/>
                 <w:szCs w:val="28"/>
                 <w:lang w:bidi="he-IL"/>
@@ -1868,7 +1802,7 @@
               <w:bidi/>
               <w:ind w:left="0"/>
               <w:rPr>
-                <w:rFonts w:ascii="Arial" w:hAnsi="Arial" w:hint="cs"/>
+                <w:rFonts w:ascii="Arial" w:hAnsi="Arial"/>
                 <w:sz w:val="28"/>
                 <w:szCs w:val="28"/>
                 <w:lang w:bidi="he-IL"/>
@@ -1888,12 +1822,6 @@
         </w:tc>
       </w:tr>
       <w:tr>
-        <w:tblPrEx>
-          <w:tblCellMar>
-            <w:top w:w="0" w:type="dxa"/>
-            <w:bottom w:w="0" w:type="dxa"/>
-          </w:tblCellMar>
-        </w:tblPrEx>
         <w:trPr>
           <w:trHeight w:val="480"/>
           <w:jc w:val="center"/>
@@ -1966,12 +1894,6 @@
         </w:tc>
       </w:tr>
       <w:tr>
-        <w:tblPrEx>
-          <w:tblCellMar>
-            <w:top w:w="0" w:type="dxa"/>
-            <w:bottom w:w="0" w:type="dxa"/>
-          </w:tblCellMar>
-        </w:tblPrEx>
         <w:trPr>
           <w:trHeight w:val="480"/>
           <w:jc w:val="center"/>
@@ -2044,12 +1966,6 @@
         </w:tc>
       </w:tr>
       <w:tr>
-        <w:tblPrEx>
-          <w:tblCellMar>
-            <w:top w:w="0" w:type="dxa"/>
-            <w:bottom w:w="0" w:type="dxa"/>
-          </w:tblCellMar>
-        </w:tblPrEx>
         <w:trPr>
           <w:trHeight w:val="480"/>
           <w:jc w:val="center"/>
@@ -4232,7 +4148,7 @@
       <w:pPr>
         <w:bidi/>
         <w:rPr>
-          <w:rFonts w:ascii="Arial" w:hAnsi="Arial" w:hint="cs"/>
+          <w:rFonts w:ascii="Arial" w:hAnsi="Arial"/>
           <w:sz w:val="28"/>
           <w:szCs w:val="28"/>
           <w:rtl/>
@@ -4286,7 +4202,7 @@
         <w:pStyle w:val="Comment"/>
         <w:bidi/>
         <w:rPr>
-          <w:rFonts w:ascii="Arial" w:hAnsi="Arial" w:cs="Arial" w:hint="cs"/>
+          <w:rFonts w:ascii="Arial" w:hAnsi="Arial" w:cs="Arial"/>
           <w:i w:val="0"/>
           <w:iCs w:val="0"/>
           <w:rtl/>
@@ -4528,7 +4444,7 @@
         <w:pStyle w:val="Comment"/>
         <w:bidi/>
         <w:rPr>
-          <w:rFonts w:ascii="Arial" w:hAnsi="Arial" w:cs="Arial" w:hint="cs"/>
+          <w:rFonts w:ascii="Arial" w:hAnsi="Arial" w:cs="Arial"/>
           <w:i w:val="0"/>
           <w:iCs w:val="0"/>
           <w:rtl/>
@@ -4659,7 +4575,36 @@
           <w:iCs w:val="0"/>
           <w:lang w:eastAsia="en-US"/>
         </w:rPr>
-        <w:t>pillow, dotenv, requests</w:t>
+        <w:t xml:space="preserve">pillow, </w:t>
+      </w:r>
+      <w:proofErr w:type="spellStart"/>
+      <w:r>
+        <w:rPr>
+          <w:rFonts w:ascii="Arial" w:hAnsi="Arial" w:cs="Arial"/>
+          <w:i w:val="0"/>
+          <w:iCs w:val="0"/>
+          <w:lang w:eastAsia="en-US"/>
+        </w:rPr>
+        <w:t>dotenv</w:t>
+      </w:r>
+      <w:proofErr w:type="spellEnd"/>
+      <w:r>
+        <w:rPr>
+          <w:rFonts w:ascii="Arial" w:hAnsi="Arial" w:cs="Arial"/>
+          <w:i w:val="0"/>
+          <w:iCs w:val="0"/>
+          <w:lang w:eastAsia="en-US"/>
+        </w:rPr>
+        <w:t>, requests</w:t>
+      </w:r>
+      <w:r>
+        <w:rPr>
+          <w:rFonts w:ascii="Arial" w:hAnsi="Arial" w:cs="Arial"/>
+          <w:i w:val="0"/>
+          <w:iCs w:val="0"/>
+          <w:lang w:eastAsia="en-US"/>
+        </w:rPr>
+        <w:t>, email-validator</w:t>
       </w:r>
       <w:r>
         <w:rPr>
@@ -4881,7 +4826,7 @@
         <w:pStyle w:val="Comment"/>
         <w:bidi/>
         <w:rPr>
-          <w:rFonts w:ascii="Arial" w:hAnsi="Arial" w:cs="Arial" w:hint="cs"/>
+          <w:rFonts w:ascii="Arial" w:hAnsi="Arial" w:cs="Arial"/>
           <w:i w:val="0"/>
           <w:iCs w:val="0"/>
           <w:rtl/>
@@ -5944,8 +5889,7 @@
     </w:p>
     <w:tbl>
       <w:tblPr>
-        <w:tblW w:w="12795" w:type="dxa"/>
-        <w:tblInd w:w="284" w:type="dxa"/>
+        <w:tblW w:w="5000" w:type="pct"/>
         <w:tblBorders>
           <w:top w:val="single" w:sz="4" w:space="0" w:color="auto"/>
           <w:left w:val="single" w:sz="4" w:space="0" w:color="auto"/>
@@ -5958,16 +5902,16 @@
         <w:tblLook w:val="04A0" w:firstRow="1" w:lastRow="0" w:firstColumn="1" w:lastColumn="0" w:noHBand="0" w:noVBand="1"/>
       </w:tblPr>
       <w:tblGrid>
-        <w:gridCol w:w="2234"/>
-        <w:gridCol w:w="2410"/>
-        <w:gridCol w:w="1701"/>
-        <w:gridCol w:w="4749"/>
-        <w:gridCol w:w="1701"/>
+        <w:gridCol w:w="1568"/>
+        <w:gridCol w:w="1687"/>
+        <w:gridCol w:w="1702"/>
+        <w:gridCol w:w="1984"/>
+        <w:gridCol w:w="2120"/>
       </w:tblGrid>
       <w:tr>
         <w:tc>
           <w:tcPr>
-            <w:tcW w:w="2234" w:type="dxa"/>
+            <w:tcW w:w="865" w:type="pct"/>
           </w:tcPr>
           <w:p>
             <w:pPr>
@@ -5986,7 +5930,7 @@
         </w:tc>
         <w:tc>
           <w:tcPr>
-            <w:tcW w:w="2410" w:type="dxa"/>
+            <w:tcW w:w="931" w:type="pct"/>
           </w:tcPr>
           <w:p>
             <w:pPr>
@@ -6005,7 +5949,7 @@
         </w:tc>
         <w:tc>
           <w:tcPr>
-            <w:tcW w:w="1701" w:type="dxa"/>
+            <w:tcW w:w="939" w:type="pct"/>
           </w:tcPr>
           <w:p>
             <w:pPr>
@@ -6014,17 +5958,19 @@
                 <w:rFonts w:ascii="Arial" w:hAnsi="Arial"/>
               </w:rPr>
             </w:pPr>
+            <w:proofErr w:type="spellStart"/>
             <w:r>
               <w:rPr>
                 <w:rFonts w:ascii="Arial" w:hAnsi="Arial"/>
               </w:rPr>
               <w:t>Args</w:t>
             </w:r>
-          </w:p>
-        </w:tc>
-        <w:tc>
-          <w:tcPr>
-            <w:tcW w:w="4749" w:type="dxa"/>
+            <w:proofErr w:type="spellEnd"/>
+          </w:p>
+        </w:tc>
+        <w:tc>
+          <w:tcPr>
+            <w:tcW w:w="1095" w:type="pct"/>
           </w:tcPr>
           <w:p>
             <w:pPr>
@@ -6043,7 +5989,7 @@
         </w:tc>
         <w:tc>
           <w:tcPr>
-            <w:tcW w:w="1701" w:type="dxa"/>
+            <w:tcW w:w="1170" w:type="pct"/>
           </w:tcPr>
           <w:p>
             <w:pPr>
@@ -6064,7 +6010,7 @@
       <w:tr>
         <w:tc>
           <w:tcPr>
-            <w:tcW w:w="2234" w:type="dxa"/>
+            <w:tcW w:w="865" w:type="pct"/>
           </w:tcPr>
           <w:p>
             <w:pPr>
@@ -6073,17 +6019,19 @@
                 <w:rFonts w:ascii="Arial" w:hAnsi="Arial"/>
               </w:rPr>
             </w:pPr>
+            <w:proofErr w:type="spellStart"/>
             <w:r>
               <w:rPr>
                 <w:rFonts w:ascii="Arial" w:hAnsi="Arial"/>
               </w:rPr>
               <w:t>gettimeastext</w:t>
             </w:r>
-          </w:p>
-        </w:tc>
-        <w:tc>
-          <w:tcPr>
-            <w:tcW w:w="2410" w:type="dxa"/>
+            <w:proofErr w:type="spellEnd"/>
+          </w:p>
+        </w:tc>
+        <w:tc>
+          <w:tcPr>
+            <w:tcW w:w="931" w:type="pct"/>
           </w:tcPr>
           <w:p>
             <w:pPr>
@@ -6102,7 +6050,7 @@
         </w:tc>
         <w:tc>
           <w:tcPr>
-            <w:tcW w:w="1701" w:type="dxa"/>
+            <w:tcW w:w="939" w:type="pct"/>
           </w:tcPr>
           <w:p>
             <w:pPr>
@@ -6121,7 +6069,7 @@
         </w:tc>
         <w:tc>
           <w:tcPr>
-            <w:tcW w:w="4749" w:type="dxa"/>
+            <w:tcW w:w="1095" w:type="pct"/>
           </w:tcPr>
           <w:p>
             <w:pPr>
@@ -6140,7 +6088,7 @@
         </w:tc>
         <w:tc>
           <w:tcPr>
-            <w:tcW w:w="1701" w:type="dxa"/>
+            <w:tcW w:w="1170" w:type="pct"/>
           </w:tcPr>
           <w:p>
             <w:pPr>
@@ -6161,7 +6109,7 @@
       <w:tr>
         <w:tc>
           <w:tcPr>
-            <w:tcW w:w="2234" w:type="dxa"/>
+            <w:tcW w:w="865" w:type="pct"/>
           </w:tcPr>
           <w:p>
             <w:pPr>
@@ -6170,17 +6118,19 @@
                 <w:rFonts w:ascii="Arial" w:hAnsi="Arial"/>
               </w:rPr>
             </w:pPr>
+            <w:proofErr w:type="spellStart"/>
             <w:r>
               <w:rPr>
                 <w:rFonts w:ascii="Arial" w:hAnsi="Arial"/>
               </w:rPr>
               <w:t>on_click_signup</w:t>
             </w:r>
-          </w:p>
-        </w:tc>
-        <w:tc>
-          <w:tcPr>
-            <w:tcW w:w="2410" w:type="dxa"/>
+            <w:proofErr w:type="spellEnd"/>
+          </w:p>
+        </w:tc>
+        <w:tc>
+          <w:tcPr>
+            <w:tcW w:w="931" w:type="pct"/>
           </w:tcPr>
           <w:p>
             <w:pPr>
@@ -6199,7 +6149,7 @@
         </w:tc>
         <w:tc>
           <w:tcPr>
-            <w:tcW w:w="1701" w:type="dxa"/>
+            <w:tcW w:w="939" w:type="pct"/>
           </w:tcPr>
           <w:p>
             <w:pPr>
@@ -6218,7 +6168,7 @@
         </w:tc>
         <w:tc>
           <w:tcPr>
-            <w:tcW w:w="4749" w:type="dxa"/>
+            <w:tcW w:w="1095" w:type="pct"/>
           </w:tcPr>
           <w:p>
             <w:pPr>
@@ -6237,7 +6187,7 @@
         </w:tc>
         <w:tc>
           <w:tcPr>
-            <w:tcW w:w="1701" w:type="dxa"/>
+            <w:tcW w:w="1170" w:type="pct"/>
           </w:tcPr>
           <w:p>
             <w:pPr>
@@ -6258,7 +6208,7 @@
       <w:tr>
         <w:tc>
           <w:tcPr>
-            <w:tcW w:w="2234" w:type="dxa"/>
+            <w:tcW w:w="865" w:type="pct"/>
           </w:tcPr>
           <w:p>
             <w:pPr>
@@ -6267,17 +6217,19 @@
                 <w:rFonts w:ascii="Arial" w:hAnsi="Arial"/>
               </w:rPr>
             </w:pPr>
+            <w:proofErr w:type="spellStart"/>
             <w:r>
               <w:rPr>
                 <w:rFonts w:ascii="Arial" w:hAnsi="Arial"/>
               </w:rPr>
               <w:t>on_click_login</w:t>
             </w:r>
-          </w:p>
-        </w:tc>
-        <w:tc>
-          <w:tcPr>
-            <w:tcW w:w="2410" w:type="dxa"/>
+            <w:proofErr w:type="spellEnd"/>
+          </w:p>
+        </w:tc>
+        <w:tc>
+          <w:tcPr>
+            <w:tcW w:w="931" w:type="pct"/>
           </w:tcPr>
           <w:p>
             <w:pPr>
@@ -6296,7 +6248,7 @@
         </w:tc>
         <w:tc>
           <w:tcPr>
-            <w:tcW w:w="1701" w:type="dxa"/>
+            <w:tcW w:w="939" w:type="pct"/>
           </w:tcPr>
           <w:p>
             <w:pPr>
@@ -6315,7 +6267,7 @@
         </w:tc>
         <w:tc>
           <w:tcPr>
-            <w:tcW w:w="4749" w:type="dxa"/>
+            <w:tcW w:w="1095" w:type="pct"/>
           </w:tcPr>
           <w:p>
             <w:pPr>
@@ -6334,7 +6286,7 @@
         </w:tc>
         <w:tc>
           <w:tcPr>
-            <w:tcW w:w="1701" w:type="dxa"/>
+            <w:tcW w:w="1170" w:type="pct"/>
           </w:tcPr>
           <w:p>
             <w:pPr>
@@ -6355,7 +6307,7 @@
       <w:tr>
         <w:tc>
           <w:tcPr>
-            <w:tcW w:w="2234" w:type="dxa"/>
+            <w:tcW w:w="865" w:type="pct"/>
           </w:tcPr>
           <w:p>
             <w:pPr>
@@ -6364,17 +6316,19 @@
                 <w:rFonts w:ascii="Arial" w:hAnsi="Arial"/>
               </w:rPr>
             </w:pPr>
+            <w:proofErr w:type="spellStart"/>
             <w:r>
               <w:rPr>
                 <w:rFonts w:ascii="Arial" w:hAnsi="Arial"/>
               </w:rPr>
               <w:t>send_email</w:t>
             </w:r>
-          </w:p>
-        </w:tc>
-        <w:tc>
-          <w:tcPr>
-            <w:tcW w:w="2410" w:type="dxa"/>
+            <w:proofErr w:type="spellEnd"/>
+          </w:p>
+        </w:tc>
+        <w:tc>
+          <w:tcPr>
+            <w:tcW w:w="931" w:type="pct"/>
           </w:tcPr>
           <w:p>
             <w:pPr>
@@ -6405,7 +6359,7 @@
         </w:tc>
         <w:tc>
           <w:tcPr>
-            <w:tcW w:w="1701" w:type="dxa"/>
+            <w:tcW w:w="939" w:type="pct"/>
           </w:tcPr>
           <w:p>
             <w:pPr>
@@ -6424,7 +6378,7 @@
         </w:tc>
         <w:tc>
           <w:tcPr>
-            <w:tcW w:w="4749" w:type="dxa"/>
+            <w:tcW w:w="1095" w:type="pct"/>
           </w:tcPr>
           <w:p>
             <w:pPr>
@@ -6443,7 +6397,7 @@
         </w:tc>
         <w:tc>
           <w:tcPr>
-            <w:tcW w:w="1701" w:type="dxa"/>
+            <w:tcW w:w="1170" w:type="pct"/>
           </w:tcPr>
           <w:p>
             <w:pPr>
@@ -6470,7 +6424,7 @@
       <w:tr>
         <w:tc>
           <w:tcPr>
-            <w:tcW w:w="2234" w:type="dxa"/>
+            <w:tcW w:w="865" w:type="pct"/>
           </w:tcPr>
           <w:p>
             <w:pPr>
@@ -6479,17 +6433,19 @@
                 <w:rFonts w:ascii="Arial" w:hAnsi="Arial"/>
               </w:rPr>
             </w:pPr>
+            <w:proofErr w:type="spellStart"/>
             <w:r>
               <w:rPr>
                 <w:rFonts w:ascii="Arial" w:hAnsi="Arial"/>
               </w:rPr>
               <w:t>get_currency</w:t>
             </w:r>
-          </w:p>
-        </w:tc>
-        <w:tc>
-          <w:tcPr>
-            <w:tcW w:w="2410" w:type="dxa"/>
+            <w:proofErr w:type="spellEnd"/>
+          </w:p>
+        </w:tc>
+        <w:tc>
+          <w:tcPr>
+            <w:tcW w:w="931" w:type="pct"/>
           </w:tcPr>
           <w:p>
             <w:pPr>
@@ -6509,7 +6465,7 @@
         </w:tc>
         <w:tc>
           <w:tcPr>
-            <w:tcW w:w="1701" w:type="dxa"/>
+            <w:tcW w:w="939" w:type="pct"/>
           </w:tcPr>
           <w:p>
             <w:pPr>
@@ -6518,17 +6474,33 @@
                 <w:rFonts w:ascii="Arial" w:hAnsi="Arial"/>
               </w:rPr>
             </w:pPr>
-            <w:r>
-              <w:rPr>
-                <w:rFonts w:ascii="Arial" w:hAnsi="Arial"/>
-              </w:rPr>
-              <w:t>src_currency, dest_currency</w:t>
-            </w:r>
-          </w:p>
-        </w:tc>
-        <w:tc>
-          <w:tcPr>
-            <w:tcW w:w="4749" w:type="dxa"/>
+            <w:proofErr w:type="spellStart"/>
+            <w:r>
+              <w:rPr>
+                <w:rFonts w:ascii="Arial" w:hAnsi="Arial"/>
+              </w:rPr>
+              <w:t>src_currency</w:t>
+            </w:r>
+            <w:proofErr w:type="spellEnd"/>
+            <w:r>
+              <w:rPr>
+                <w:rFonts w:ascii="Arial" w:hAnsi="Arial"/>
+              </w:rPr>
+              <w:t xml:space="preserve">, </w:t>
+            </w:r>
+            <w:proofErr w:type="spellStart"/>
+            <w:r>
+              <w:rPr>
+                <w:rFonts w:ascii="Arial" w:hAnsi="Arial"/>
+              </w:rPr>
+              <w:t>dest_currency</w:t>
+            </w:r>
+            <w:proofErr w:type="spellEnd"/>
+          </w:p>
+        </w:tc>
+        <w:tc>
+          <w:tcPr>
+            <w:tcW w:w="1095" w:type="pct"/>
           </w:tcPr>
           <w:p>
             <w:pPr>
@@ -6551,7 +6523,7 @@
         </w:tc>
         <w:tc>
           <w:tcPr>
-            <w:tcW w:w="1701" w:type="dxa"/>
+            <w:tcW w:w="1170" w:type="pct"/>
           </w:tcPr>
           <w:p>
             <w:pPr>
@@ -6572,7 +6544,7 @@
       <w:tr>
         <w:tc>
           <w:tcPr>
-            <w:tcW w:w="2234" w:type="dxa"/>
+            <w:tcW w:w="865" w:type="pct"/>
           </w:tcPr>
           <w:p>
             <w:pPr>
@@ -6591,7 +6563,7 @@
         </w:tc>
         <w:tc>
           <w:tcPr>
-            <w:tcW w:w="2410" w:type="dxa"/>
+            <w:tcW w:w="931" w:type="pct"/>
           </w:tcPr>
           <w:p>
             <w:pPr>
@@ -6612,7 +6584,7 @@
         </w:tc>
         <w:tc>
           <w:tcPr>
-            <w:tcW w:w="1701" w:type="dxa"/>
+            <w:tcW w:w="939" w:type="pct"/>
           </w:tcPr>
           <w:p>
             <w:pPr>
@@ -6631,7 +6603,7 @@
         </w:tc>
         <w:tc>
           <w:tcPr>
-            <w:tcW w:w="4749" w:type="dxa"/>
+            <w:tcW w:w="1095" w:type="pct"/>
           </w:tcPr>
           <w:p>
             <w:pPr>
@@ -6654,7 +6626,7 @@
         </w:tc>
         <w:tc>
           <w:tcPr>
-            <w:tcW w:w="1701" w:type="dxa"/>
+            <w:tcW w:w="1170" w:type="pct"/>
           </w:tcPr>
           <w:p>
             <w:pPr>
@@ -6675,7 +6647,7 @@
       <w:tr>
         <w:tc>
           <w:tcPr>
-            <w:tcW w:w="2234" w:type="dxa"/>
+            <w:tcW w:w="865" w:type="pct"/>
           </w:tcPr>
           <w:p>
             <w:pPr>
@@ -6684,17 +6656,19 @@
                 <w:rFonts w:ascii="Arial" w:hAnsi="Arial"/>
               </w:rPr>
             </w:pPr>
+            <w:proofErr w:type="spellStart"/>
             <w:r>
               <w:rPr>
                 <w:rFonts w:ascii="Arial" w:hAnsi="Arial"/>
               </w:rPr>
               <w:t>get_hash</w:t>
             </w:r>
-          </w:p>
-        </w:tc>
-        <w:tc>
-          <w:tcPr>
-            <w:tcW w:w="2410" w:type="dxa"/>
+            <w:proofErr w:type="spellEnd"/>
+          </w:p>
+        </w:tc>
+        <w:tc>
+          <w:tcPr>
+            <w:tcW w:w="931" w:type="pct"/>
           </w:tcPr>
           <w:p>
             <w:pPr>
@@ -6715,7 +6689,7 @@
         </w:tc>
         <w:tc>
           <w:tcPr>
-            <w:tcW w:w="1701" w:type="dxa"/>
+            <w:tcW w:w="939" w:type="pct"/>
           </w:tcPr>
           <w:p>
             <w:pPr>
@@ -6734,7 +6708,7 @@
         </w:tc>
         <w:tc>
           <w:tcPr>
-            <w:tcW w:w="4749" w:type="dxa"/>
+            <w:tcW w:w="1095" w:type="pct"/>
           </w:tcPr>
           <w:p>
             <w:pPr>
@@ -6757,7 +6731,7 @@
         </w:tc>
         <w:tc>
           <w:tcPr>
-            <w:tcW w:w="1701" w:type="dxa"/>
+            <w:tcW w:w="1170" w:type="pct"/>
           </w:tcPr>
           <w:p>
             <w:pPr>
@@ -6778,7 +6752,248 @@
       <w:tr>
         <w:tc>
           <w:tcPr>
-            <w:tcW w:w="2234" w:type="dxa"/>
+            <w:tcW w:w="865" w:type="pct"/>
+          </w:tcPr>
+          <w:p>
+            <w:pPr>
+              <w:ind w:left="0"/>
+              <w:rPr>
+                <w:rFonts w:ascii="Arial" w:hAnsi="Arial"/>
+              </w:rPr>
+            </w:pPr>
+            <w:r>
+              <w:rPr>
+                <w:rFonts w:ascii="Arial" w:hAnsi="Arial"/>
+              </w:rPr>
+              <w:t>N/A</w:t>
+            </w:r>
+          </w:p>
+        </w:tc>
+        <w:tc>
+          <w:tcPr>
+            <w:tcW w:w="931" w:type="pct"/>
+          </w:tcPr>
+          <w:p>
+            <w:pPr>
+              <w:ind w:left="0"/>
+              <w:rPr>
+                <w:rFonts w:ascii="Arial" w:hAnsi="Arial"/>
+                <w:lang w:bidi="he-IL"/>
+              </w:rPr>
+            </w:pPr>
+            <w:r>
+              <w:rPr>
+                <w:rFonts w:ascii="Arial" w:hAnsi="Arial"/>
+                <w:lang w:bidi="he-IL"/>
+              </w:rPr>
+              <w:t>"SIGNUP" (</w:t>
+            </w:r>
+            <w:proofErr w:type="spellStart"/>
+            <w:r>
+              <w:rPr>
+                <w:rFonts w:ascii="Arial" w:hAnsi="Arial"/>
+                <w:lang w:bidi="he-IL"/>
+              </w:rPr>
+              <w:t>ClientHandler</w:t>
+            </w:r>
+            <w:proofErr w:type="spellEnd"/>
+            <w:r>
+              <w:rPr>
+                <w:rFonts w:ascii="Arial" w:hAnsi="Arial"/>
+                <w:lang w:bidi="he-IL"/>
+              </w:rPr>
+              <w:t>)</w:t>
+            </w:r>
+          </w:p>
+        </w:tc>
+        <w:tc>
+          <w:tcPr>
+            <w:tcW w:w="939" w:type="pct"/>
+          </w:tcPr>
+          <w:p>
+            <w:pPr>
+              <w:ind w:left="0"/>
+              <w:rPr>
+                <w:rFonts w:ascii="Arial" w:hAnsi="Arial"/>
+              </w:rPr>
+            </w:pPr>
+            <w:r>
+              <w:rPr>
+                <w:rFonts w:ascii="Arial" w:hAnsi="Arial"/>
+              </w:rPr>
+              <w:t>username, password, email</w:t>
+            </w:r>
+          </w:p>
+        </w:tc>
+        <w:tc>
+          <w:tcPr>
+            <w:tcW w:w="1095" w:type="pct"/>
+          </w:tcPr>
+          <w:p>
+            <w:pPr>
+              <w:ind w:left="0"/>
+              <w:rPr>
+                <w:rFonts w:ascii="Arial" w:hAnsi="Arial"/>
+                <w:sz w:val="22"/>
+                <w:szCs w:val="22"/>
+              </w:rPr>
+            </w:pPr>
+            <w:r>
+              <w:rPr>
+                <w:rFonts w:ascii="Arial" w:hAnsi="Arial"/>
+                <w:sz w:val="22"/>
+                <w:szCs w:val="22"/>
+              </w:rPr>
+              <w:t>"SIGNUP" if success, "SIGNUPFAIL" if fail</w:t>
+            </w:r>
+          </w:p>
+        </w:tc>
+        <w:tc>
+          <w:tcPr>
+            <w:tcW w:w="1170" w:type="pct"/>
+          </w:tcPr>
+          <w:p>
+            <w:pPr>
+              <w:ind w:left="0"/>
+              <w:rPr>
+                <w:rFonts w:ascii="Arial" w:hAnsi="Arial"/>
+              </w:rPr>
+            </w:pPr>
+            <w:r>
+              <w:rPr>
+                <w:rFonts w:ascii="Arial" w:hAnsi="Arial"/>
+              </w:rPr>
+              <w:t>Used to create new user and save the user into the database</w:t>
+            </w:r>
+          </w:p>
+        </w:tc>
+      </w:tr>
+      <w:tr>
+        <w:trPr>
+          <w:trHeight w:val="1384"/>
+        </w:trPr>
+        <w:tc>
+          <w:tcPr>
+            <w:tcW w:w="865" w:type="pct"/>
+          </w:tcPr>
+          <w:p>
+            <w:pPr>
+              <w:ind w:left="0"/>
+              <w:rPr>
+                <w:rFonts w:ascii="Arial" w:hAnsi="Arial"/>
+              </w:rPr>
+            </w:pPr>
+            <w:r>
+              <w:rPr>
+                <w:rFonts w:ascii="Arial" w:hAnsi="Arial"/>
+              </w:rPr>
+              <w:t>N/A</w:t>
+            </w:r>
+          </w:p>
+        </w:tc>
+        <w:tc>
+          <w:tcPr>
+            <w:tcW w:w="931" w:type="pct"/>
+          </w:tcPr>
+          <w:p>
+            <w:pPr>
+              <w:ind w:left="0"/>
+              <w:rPr>
+                <w:rFonts w:ascii="Arial" w:hAnsi="Arial"/>
+                <w:lang w:bidi="he-IL"/>
+              </w:rPr>
+            </w:pPr>
+            <w:r>
+              <w:rPr>
+                <w:rFonts w:ascii="Arial" w:hAnsi="Arial"/>
+                <w:lang w:bidi="he-IL"/>
+              </w:rPr>
+              <w:t>"LOGIN" (</w:t>
+            </w:r>
+            <w:proofErr w:type="spellStart"/>
+            <w:r>
+              <w:rPr>
+                <w:rFonts w:ascii="Arial" w:hAnsi="Arial"/>
+                <w:lang w:bidi="he-IL"/>
+              </w:rPr>
+              <w:t>ClientHandler</w:t>
+            </w:r>
+            <w:proofErr w:type="spellEnd"/>
+            <w:r>
+              <w:rPr>
+                <w:rFonts w:ascii="Arial" w:hAnsi="Arial"/>
+                <w:lang w:bidi="he-IL"/>
+              </w:rPr>
+              <w:t>)</w:t>
+            </w:r>
+          </w:p>
+        </w:tc>
+        <w:tc>
+          <w:tcPr>
+            <w:tcW w:w="939" w:type="pct"/>
+          </w:tcPr>
+          <w:p>
+            <w:pPr>
+              <w:ind w:left="0"/>
+              <w:rPr>
+                <w:rFonts w:ascii="Arial" w:hAnsi="Arial"/>
+              </w:rPr>
+            </w:pPr>
+            <w:r>
+              <w:rPr>
+                <w:rFonts w:ascii="Arial" w:hAnsi="Arial"/>
+              </w:rPr>
+              <w:t>username, password</w:t>
+            </w:r>
+          </w:p>
+        </w:tc>
+        <w:tc>
+          <w:tcPr>
+            <w:tcW w:w="1095" w:type="pct"/>
+          </w:tcPr>
+          <w:p>
+            <w:pPr>
+              <w:ind w:left="0"/>
+              <w:rPr>
+                <w:rFonts w:ascii="Arial" w:hAnsi="Arial"/>
+                <w:sz w:val="22"/>
+                <w:szCs w:val="22"/>
+              </w:rPr>
+            </w:pPr>
+            <w:r>
+              <w:rPr>
+                <w:rFonts w:ascii="Arial" w:hAnsi="Arial"/>
+                <w:sz w:val="22"/>
+                <w:szCs w:val="22"/>
+              </w:rPr>
+              <w:t>"LOGIN" if success, "LOGINFAIL" if fail</w:t>
+            </w:r>
+          </w:p>
+        </w:tc>
+        <w:tc>
+          <w:tcPr>
+            <w:tcW w:w="1170" w:type="pct"/>
+          </w:tcPr>
+          <w:p>
+            <w:pPr>
+              <w:ind w:left="0"/>
+              <w:rPr>
+                <w:rFonts w:ascii="Arial" w:hAnsi="Arial"/>
+              </w:rPr>
+            </w:pPr>
+            <w:r>
+              <w:rPr>
+                <w:rFonts w:ascii="Arial" w:hAnsi="Arial"/>
+              </w:rPr>
+              <w:t>Used to log into an existing account</w:t>
+            </w:r>
+          </w:p>
+        </w:tc>
+      </w:tr>
+      <w:tr>
+        <w:tc>
+          <w:tcPr>
+            <w:tcW w:w="865" w:type="pct"/>
           </w:tcPr>
           <w:p>
             <w:pPr>
@@ -6798,7 +7013,7 @@
         </w:tc>
         <w:tc>
           <w:tcPr>
-            <w:tcW w:w="2410" w:type="dxa"/>
+            <w:tcW w:w="931" w:type="pct"/>
           </w:tcPr>
           <w:p>
             <w:pPr>
@@ -6813,13 +7028,13 @@
                 <w:rFonts w:ascii="Arial" w:hAnsi="Arial"/>
                 <w:lang w:bidi="he-IL"/>
               </w:rPr>
-              <w:t>"SIGNUP" (ClientHandler)</w:t>
-            </w:r>
-          </w:p>
-        </w:tc>
-        <w:tc>
-          <w:tcPr>
-            <w:tcW w:w="1701" w:type="dxa"/>
+              <w:t>"FORGOTCODE"</w:t>
+            </w:r>
+          </w:p>
+        </w:tc>
+        <w:tc>
+          <w:tcPr>
+            <w:tcW w:w="939" w:type="pct"/>
           </w:tcPr>
           <w:p>
             <w:pPr>
@@ -6832,13 +7047,13 @@
               <w:rPr>
                 <w:rFonts w:ascii="Arial" w:hAnsi="Arial"/>
               </w:rPr>
-              <w:t>username, password, email</w:t>
-            </w:r>
-          </w:p>
-        </w:tc>
-        <w:tc>
-          <w:tcPr>
-            <w:tcW w:w="4749" w:type="dxa"/>
+              <w:t>code</w:t>
+            </w:r>
+          </w:p>
+        </w:tc>
+        <w:tc>
+          <w:tcPr>
+            <w:tcW w:w="1095" w:type="pct"/>
           </w:tcPr>
           <w:p>
             <w:pPr>
@@ -6855,26 +7070,33 @@
                 <w:sz w:val="22"/>
                 <w:szCs w:val="22"/>
               </w:rPr>
-              <w:t>"SIGNUP" if success, "SIGNUPFAIL" if fail</w:t>
-            </w:r>
-          </w:p>
-        </w:tc>
-        <w:tc>
-          <w:tcPr>
-            <w:tcW w:w="1701" w:type="dxa"/>
+              <w:t>"FORGOTCODE" if success, "FORGOTCODEFAIL" if fail</w:t>
+            </w:r>
+          </w:p>
+        </w:tc>
+        <w:tc>
+          <w:tcPr>
+            <w:tcW w:w="1170" w:type="pct"/>
           </w:tcPr>
           <w:p>
             <w:pPr>
               <w:ind w:left="0"/>
               <w:rPr>
                 <w:rFonts w:ascii="Arial" w:hAnsi="Arial"/>
-              </w:rPr>
-            </w:pPr>
-            <w:r>
-              <w:rPr>
-                <w:rFonts w:ascii="Arial" w:hAnsi="Arial"/>
-              </w:rPr>
-              <w:t>Used to create new user and save the user into the database</w:t>
+                <w:vertAlign w:val="subscript"/>
+              </w:rPr>
+            </w:pPr>
+            <w:r>
+              <w:rPr>
+                <w:rFonts w:ascii="Arial" w:hAnsi="Arial"/>
+              </w:rPr>
+              <w:t>Second stage of password reset process, asks the user for sent code</w:t>
+            </w:r>
+            <w:r>
+              <w:rPr>
+                <w:rFonts w:ascii="Arial" w:hAnsi="Arial"/>
+              </w:rPr>
+              <w:softHyphen/>
             </w:r>
           </w:p>
         </w:tc>
@@ -6882,7 +7104,7 @@
       <w:tr>
         <w:tc>
           <w:tcPr>
-            <w:tcW w:w="2234" w:type="dxa"/>
+            <w:tcW w:w="865" w:type="pct"/>
           </w:tcPr>
           <w:p>
             <w:pPr>
@@ -6901,7 +7123,7 @@
         </w:tc>
         <w:tc>
           <w:tcPr>
-            <w:tcW w:w="2410" w:type="dxa"/>
+            <w:tcW w:w="931" w:type="pct"/>
           </w:tcPr>
           <w:p>
             <w:pPr>
@@ -6916,13 +7138,29 @@
                 <w:rFonts w:ascii="Arial" w:hAnsi="Arial"/>
                 <w:lang w:bidi="he-IL"/>
               </w:rPr>
-              <w:t>"LOGIN" (ClientHandler)</w:t>
-            </w:r>
-          </w:p>
-        </w:tc>
-        <w:tc>
-          <w:tcPr>
-            <w:tcW w:w="1701" w:type="dxa"/>
+              <w:t>"FORGOTSETPASSWORD" (</w:t>
+            </w:r>
+            <w:proofErr w:type="spellStart"/>
+            <w:r>
+              <w:rPr>
+                <w:rFonts w:ascii="Arial" w:hAnsi="Arial"/>
+                <w:lang w:bidi="he-IL"/>
+              </w:rPr>
+              <w:t>ClientHandler</w:t>
+            </w:r>
+            <w:proofErr w:type="spellEnd"/>
+            <w:r>
+              <w:rPr>
+                <w:rFonts w:ascii="Arial" w:hAnsi="Arial"/>
+                <w:lang w:bidi="he-IL"/>
+              </w:rPr>
+              <w:t>)</w:t>
+            </w:r>
+          </w:p>
+        </w:tc>
+        <w:tc>
+          <w:tcPr>
+            <w:tcW w:w="939" w:type="pct"/>
           </w:tcPr>
           <w:p>
             <w:pPr>
@@ -6935,13 +7173,13 @@
               <w:rPr>
                 <w:rFonts w:ascii="Arial" w:hAnsi="Arial"/>
               </w:rPr>
-              <w:t>username, password</w:t>
-            </w:r>
-          </w:p>
-        </w:tc>
-        <w:tc>
-          <w:tcPr>
-            <w:tcW w:w="4749" w:type="dxa"/>
+              <w:t>new password</w:t>
+            </w:r>
+          </w:p>
+        </w:tc>
+        <w:tc>
+          <w:tcPr>
+            <w:tcW w:w="1095" w:type="pct"/>
           </w:tcPr>
           <w:p>
             <w:pPr>
@@ -6958,13 +7196,13 @@
                 <w:sz w:val="22"/>
                 <w:szCs w:val="22"/>
               </w:rPr>
-              <w:t>"LOGIN" if success, "LOGINFAIL" if fail</w:t>
-            </w:r>
-          </w:p>
-        </w:tc>
-        <w:tc>
-          <w:tcPr>
-            <w:tcW w:w="1701" w:type="dxa"/>
+              <w:t>"FORGOTSETPASSWORD"</w:t>
+            </w:r>
+          </w:p>
+        </w:tc>
+        <w:tc>
+          <w:tcPr>
+            <w:tcW w:w="1170" w:type="pct"/>
           </w:tcPr>
           <w:p>
             <w:pPr>
@@ -6977,215 +7215,8 @@
               <w:rPr>
                 <w:rFonts w:ascii="Arial" w:hAnsi="Arial"/>
               </w:rPr>
-              <w:t>Used to log into an existing account</w:t>
-            </w:r>
-          </w:p>
-        </w:tc>
-      </w:tr>
-      <w:tr>
-        <w:tc>
-          <w:tcPr>
-            <w:tcW w:w="2234" w:type="dxa"/>
-          </w:tcPr>
-          <w:p>
-            <w:pPr>
-              <w:ind w:left="0"/>
-              <w:rPr>
-                <w:rFonts w:ascii="Arial" w:hAnsi="Arial"/>
-              </w:rPr>
-            </w:pPr>
-            <w:r>
-              <w:rPr>
-                <w:rFonts w:ascii="Arial" w:hAnsi="Arial"/>
-              </w:rPr>
-              <w:t>N/A</w:t>
-            </w:r>
-          </w:p>
-        </w:tc>
-        <w:tc>
-          <w:tcPr>
-            <w:tcW w:w="2410" w:type="dxa"/>
-          </w:tcPr>
-          <w:p>
-            <w:pPr>
-              <w:ind w:left="0"/>
-              <w:rPr>
-                <w:rFonts w:ascii="Arial" w:hAnsi="Arial"/>
-                <w:lang w:bidi="he-IL"/>
-              </w:rPr>
-            </w:pPr>
-            <w:r>
-              <w:rPr>
-                <w:rFonts w:ascii="Arial" w:hAnsi="Arial"/>
-                <w:lang w:bidi="he-IL"/>
-              </w:rPr>
-              <w:t>"FORGOTCODE"</w:t>
-            </w:r>
-          </w:p>
-        </w:tc>
-        <w:tc>
-          <w:tcPr>
-            <w:tcW w:w="1701" w:type="dxa"/>
-          </w:tcPr>
-          <w:p>
-            <w:pPr>
-              <w:ind w:left="0"/>
-              <w:rPr>
-                <w:rFonts w:ascii="Arial" w:hAnsi="Arial"/>
-              </w:rPr>
-            </w:pPr>
-            <w:r>
-              <w:rPr>
-                <w:rFonts w:ascii="Arial" w:hAnsi="Arial"/>
-              </w:rPr>
-              <w:t>code</w:t>
-            </w:r>
-          </w:p>
-        </w:tc>
-        <w:tc>
-          <w:tcPr>
-            <w:tcW w:w="4749" w:type="dxa"/>
-          </w:tcPr>
-          <w:p>
-            <w:pPr>
-              <w:ind w:left="0"/>
-              <w:rPr>
-                <w:rFonts w:ascii="Arial" w:hAnsi="Arial"/>
-                <w:sz w:val="22"/>
-                <w:szCs w:val="22"/>
-              </w:rPr>
-            </w:pPr>
-            <w:r>
-              <w:rPr>
-                <w:rFonts w:ascii="Arial" w:hAnsi="Arial"/>
-                <w:sz w:val="22"/>
-                <w:szCs w:val="22"/>
-              </w:rPr>
-              <w:t>"FORGOTCODE" if success, "FORGOTCODEFAIL" if fail</w:t>
-            </w:r>
-          </w:p>
-        </w:tc>
-        <w:tc>
-          <w:tcPr>
-            <w:tcW w:w="1701" w:type="dxa"/>
-          </w:tcPr>
-          <w:p>
-            <w:pPr>
-              <w:ind w:left="0"/>
-              <w:rPr>
-                <w:rFonts w:ascii="Arial" w:hAnsi="Arial"/>
-                <w:vertAlign w:val="subscript"/>
-              </w:rPr>
-            </w:pPr>
-            <w:r>
-              <w:rPr>
-                <w:rFonts w:ascii="Arial" w:hAnsi="Arial"/>
-              </w:rPr>
-              <w:t>Second stage of password reset process, asks the user for sent code</w:t>
-            </w:r>
-            <w:r>
-              <w:rPr>
-                <w:rFonts w:ascii="Arial" w:hAnsi="Arial"/>
-              </w:rPr>
-              <w:softHyphen/>
-            </w:r>
-          </w:p>
-        </w:tc>
-      </w:tr>
-      <w:tr>
-        <w:tc>
-          <w:tcPr>
-            <w:tcW w:w="2234" w:type="dxa"/>
-          </w:tcPr>
-          <w:p>
-            <w:pPr>
-              <w:ind w:left="0"/>
-              <w:rPr>
-                <w:rFonts w:ascii="Arial" w:hAnsi="Arial"/>
-              </w:rPr>
-            </w:pPr>
-            <w:r>
-              <w:rPr>
-                <w:rFonts w:ascii="Arial" w:hAnsi="Arial"/>
-              </w:rPr>
-              <w:t>N/A</w:t>
-            </w:r>
-          </w:p>
-        </w:tc>
-        <w:tc>
-          <w:tcPr>
-            <w:tcW w:w="2410" w:type="dxa"/>
-          </w:tcPr>
-          <w:p>
-            <w:pPr>
-              <w:ind w:left="0"/>
-              <w:rPr>
-                <w:rFonts w:ascii="Arial" w:hAnsi="Arial"/>
-                <w:lang w:bidi="he-IL"/>
-              </w:rPr>
-            </w:pPr>
-            <w:r>
-              <w:rPr>
-                <w:rFonts w:ascii="Arial" w:hAnsi="Arial"/>
-                <w:lang w:bidi="he-IL"/>
-              </w:rPr>
-              <w:t>"FORGOTSETPASSWORD" (ClientHandler)</w:t>
-            </w:r>
-          </w:p>
-        </w:tc>
-        <w:tc>
-          <w:tcPr>
-            <w:tcW w:w="1701" w:type="dxa"/>
-          </w:tcPr>
-          <w:p>
-            <w:pPr>
-              <w:ind w:left="0"/>
-              <w:rPr>
-                <w:rFonts w:ascii="Arial" w:hAnsi="Arial"/>
-              </w:rPr>
-            </w:pPr>
-            <w:r>
-              <w:rPr>
-                <w:rFonts w:ascii="Arial" w:hAnsi="Arial"/>
-              </w:rPr>
-              <w:t>new password</w:t>
-            </w:r>
-          </w:p>
-        </w:tc>
-        <w:tc>
-          <w:tcPr>
-            <w:tcW w:w="4749" w:type="dxa"/>
-          </w:tcPr>
-          <w:p>
-            <w:pPr>
-              <w:ind w:left="0"/>
-              <w:rPr>
-                <w:rFonts w:ascii="Arial" w:hAnsi="Arial"/>
-                <w:sz w:val="22"/>
-                <w:szCs w:val="22"/>
-              </w:rPr>
-            </w:pPr>
-            <w:r>
-              <w:rPr>
-                <w:rFonts w:ascii="Arial" w:hAnsi="Arial"/>
-                <w:sz w:val="22"/>
-                <w:szCs w:val="22"/>
-              </w:rPr>
-              <w:t>"FORGOTSETPASSWORD"</w:t>
-            </w:r>
-          </w:p>
-        </w:tc>
-        <w:tc>
-          <w:tcPr>
-            <w:tcW w:w="1701" w:type="dxa"/>
-          </w:tcPr>
-          <w:p>
-            <w:pPr>
-              <w:ind w:left="0"/>
-              <w:rPr>
-                <w:rFonts w:ascii="Arial" w:hAnsi="Arial"/>
-              </w:rPr>
-            </w:pPr>
+              <w:t>Used to tell log in the client after password reset is complete</w:t>
+            </w:r>
           </w:p>
         </w:tc>
       </w:tr>
@@ -7224,7 +7255,7 @@
     <w:p>
       <w:pPr>
         <w:rPr>
-          <w:rFonts w:ascii="Arial" w:hAnsi="Arial" w:hint="cs"/>
+          <w:rFonts w:ascii="Arial" w:hAnsi="Arial"/>
           <w:rtl/>
           <w:lang w:bidi="he-IL"/>
         </w:rPr>
@@ -7255,29 +7286,194 @@
       <w:pPr>
         <w:rPr>
           <w:rFonts w:ascii="Arial" w:hAnsi="Arial"/>
-        </w:rPr>
-      </w:pPr>
-      <w:r>
-        <w:rPr>
-          <w:rFonts w:ascii="Arial" w:hAnsi="Arial"/>
-        </w:rPr>
-        <w:t>All frame classes, ClientApp, ClientHandler, ServerGUI, Converter, Emailer.</w:t>
+          <w:rtl/>
+          <w:lang w:val="ru-RU" w:bidi="he-IL"/>
+        </w:rPr>
+      </w:pPr>
+      <w:r>
+        <w:rPr>
+          <w:rFonts w:ascii="Arial" w:hAnsi="Arial" w:hint="cs"/>
+          <w:rtl/>
+          <w:lang w:val="ru-RU" w:bidi="he-IL"/>
+        </w:rPr>
+        <w:t>ארכיטקטורת צד לקוח:</w:t>
       </w:r>
     </w:p>
     <w:p>
       <w:pPr>
-        <w:pStyle w:val="Heading3"/>
-      </w:pPr>
-      <w:r>
-        <w:t>Threading</w:t>
-      </w:r>
+        <w:rPr>
+          <w:rFonts w:ascii="Arial" w:hAnsi="Arial"/>
+          <w:lang w:bidi="he-IL"/>
+        </w:rPr>
+      </w:pPr>
     </w:p>
     <w:p>
       <w:pPr>
+        <w:ind w:left="0"/>
+        <w:rPr>
+          <w:rFonts w:ascii="Arial" w:hAnsi="Arial"/>
+          <w:lang w:bidi="he-IL"/>
+        </w:rPr>
+      </w:pPr>
+      <w:r>
+        <w:rPr>
+          <w:rFonts w:ascii="Arial" w:hAnsi="Arial"/>
+          <w:noProof/>
+          <w:lang w:bidi="he-IL"/>
+        </w:rPr>
+        <w:lastRenderedPageBreak/>
+        <w:drawing>
+          <wp:inline distT="0" distB="0" distL="0" distR="0" wp14:anchorId="6C5C80AB" wp14:editId="431399A8">
+            <wp:extent cx="6528331" cy="6887688"/>
+            <wp:effectExtent l="0" t="0" r="6350" b="8890"/>
+            <wp:docPr id="17" name="Picture 17"/>
+            <wp:cNvGraphicFramePr>
+              <a:graphicFrameLocks xmlns:a="http://schemas.openxmlformats.org/drawingml/2006/main" noChangeAspect="1"/>
+            </wp:cNvGraphicFramePr>
+            <a:graphic xmlns:a="http://schemas.openxmlformats.org/drawingml/2006/main">
+              <a:graphicData uri="http://schemas.openxmlformats.org/drawingml/2006/picture">
+                <pic:pic xmlns:pic="http://schemas.openxmlformats.org/drawingml/2006/picture">
+                  <pic:nvPicPr>
+                    <pic:cNvPr id="17" name="Picture 17"/>
+                    <pic:cNvPicPr/>
+                  </pic:nvPicPr>
+                  <pic:blipFill>
+                    <a:blip r:embed="rId18" cstate="print">
+                      <a:extLst>
+                        <a:ext uri="{28A0092B-C50C-407E-A947-70E740481C1C}">
+                          <a14:useLocalDpi xmlns:a14="http://schemas.microsoft.com/office/drawing/2010/main" val="0"/>
+                        </a:ext>
+                      </a:extLst>
+                    </a:blip>
+                    <a:stretch>
+                      <a:fillRect/>
+                    </a:stretch>
+                  </pic:blipFill>
+                  <pic:spPr>
+                    <a:xfrm>
+                      <a:off x="0" y="0"/>
+                      <a:ext cx="6528331" cy="6887688"/>
+                    </a:xfrm>
+                    <a:prstGeom prst="rect">
+                      <a:avLst/>
+                    </a:prstGeom>
+                  </pic:spPr>
+                </pic:pic>
+              </a:graphicData>
+            </a:graphic>
+          </wp:inline>
+        </w:drawing>
+      </w:r>
+    </w:p>
+    <w:p>
+      <w:pPr>
+        <w:pStyle w:val="Heading3"/>
+        <w:numPr>
+          <w:ilvl w:val="0"/>
+          <w:numId w:val="0"/>
+        </w:numPr>
+        <w:ind w:left="720"/>
+        <w:rPr>
+          <w:b w:val="0"/>
+          <w:bCs w:val="0"/>
+          <w:sz w:val="24"/>
+          <w:szCs w:val="24"/>
+          <w:lang w:val="ru-RU" w:bidi="he-IL"/>
+        </w:rPr>
+      </w:pPr>
+      <w:r>
+        <w:rPr>
+          <w:rFonts w:hint="cs"/>
+          <w:b w:val="0"/>
+          <w:bCs w:val="0"/>
+          <w:sz w:val="24"/>
+          <w:szCs w:val="24"/>
+          <w:rtl/>
+          <w:lang w:val="ru-RU" w:bidi="he-IL"/>
+        </w:rPr>
+        <w:lastRenderedPageBreak/>
+        <w:t>ארכיטקטורת צד שרת:</w:t>
+      </w:r>
+      <w:r>
+        <w:rPr>
+          <w:b w:val="0"/>
+          <w:bCs w:val="0"/>
+          <w:sz w:val="24"/>
+          <w:szCs w:val="24"/>
+          <w:rtl/>
+          <w:lang w:val="ru-RU" w:bidi="he-IL"/>
+        </w:rPr>
+        <w:br/>
+      </w:r>
+    </w:p>
+    <w:p>
+      <w:pPr>
+        <w:rPr>
+          <w:lang w:bidi="he-IL"/>
+        </w:rPr>
+      </w:pPr>
+      <w:r>
+        <w:rPr>
+          <w:noProof/>
+          <w:lang w:bidi="he-IL"/>
+        </w:rPr>
+        <w:drawing>
+          <wp:inline distT="0" distB="0" distL="0" distR="0" wp14:anchorId="2E8D36D3" wp14:editId="2172C11A">
+            <wp:extent cx="6231167" cy="6299860"/>
+            <wp:effectExtent l="0" t="0" r="0" b="5715"/>
+            <wp:docPr id="19" name="Picture 19"/>
+            <wp:cNvGraphicFramePr>
+              <a:graphicFrameLocks xmlns:a="http://schemas.openxmlformats.org/drawingml/2006/main" noChangeAspect="1"/>
+            </wp:cNvGraphicFramePr>
+            <a:graphic xmlns:a="http://schemas.openxmlformats.org/drawingml/2006/main">
+              <a:graphicData uri="http://schemas.openxmlformats.org/drawingml/2006/picture">
+                <pic:pic xmlns:pic="http://schemas.openxmlformats.org/drawingml/2006/picture">
+                  <pic:nvPicPr>
+                    <pic:cNvPr id="19" name="Picture 19"/>
+                    <pic:cNvPicPr/>
+                  </pic:nvPicPr>
+                  <pic:blipFill>
+                    <a:blip r:embed="rId19" cstate="print">
+                      <a:extLst>
+                        <a:ext uri="{28A0092B-C50C-407E-A947-70E740481C1C}">
+                          <a14:useLocalDpi xmlns:a14="http://schemas.microsoft.com/office/drawing/2010/main" val="0"/>
+                        </a:ext>
+                      </a:extLst>
+                    </a:blip>
+                    <a:stretch>
+                      <a:fillRect/>
+                    </a:stretch>
+                  </pic:blipFill>
+                  <pic:spPr>
+                    <a:xfrm>
+                      <a:off x="0" y="0"/>
+                      <a:ext cx="6269639" cy="6338757"/>
+                    </a:xfrm>
+                    <a:prstGeom prst="rect">
+                      <a:avLst/>
+                    </a:prstGeom>
+                  </pic:spPr>
+                </pic:pic>
+              </a:graphicData>
+            </a:graphic>
+          </wp:inline>
+        </w:drawing>
+      </w:r>
+    </w:p>
+    <w:p>
+      <w:pPr>
+        <w:pStyle w:val="Heading3"/>
+      </w:pPr>
+      <w:r>
+        <w:t>Threading</w:t>
+      </w:r>
+    </w:p>
+    <w:p>
+      <w:pPr>
         <w:bidi/>
         <w:ind w:left="0"/>
         <w:rPr>
-          <w:rFonts w:ascii="Arial" w:hAnsi="Arial" w:hint="cs"/>
+          <w:rFonts w:ascii="Arial" w:hAnsi="Arial"/>
           <w:szCs w:val="24"/>
           <w:rtl/>
           <w:lang w:bidi="he-IL"/>
@@ -7369,7 +7565,7 @@
                     </pic:cNvPicPr>
                   </pic:nvPicPr>
                   <pic:blipFill>
-                    <a:blip r:embed="rId18" cstate="print">
+                    <a:blip r:embed="rId20" cstate="print">
                       <a:extLst>
                         <a:ext uri="{28A0092B-C50C-407E-A947-70E740481C1C}">
                           <a14:useLocalDpi xmlns:a14="http://schemas.microsoft.com/office/drawing/2010/main" val="0"/>
@@ -7425,10 +7621,10 @@
           <w:noProof/>
         </w:rPr>
         <w:drawing>
-          <wp:inline distT="0" distB="0" distL="0" distR="0" wp14:anchorId="1CF6052E" wp14:editId="63C62FE3">
-            <wp:extent cx="6122035" cy="8223885"/>
+          <wp:inline distT="0" distB="0" distL="0" distR="0" wp14:anchorId="32289AE8" wp14:editId="148BF193">
+            <wp:extent cx="4940135" cy="8753246"/>
             <wp:effectExtent l="0" t="0" r="0" b="0"/>
-            <wp:docPr id="8" name="Picture 8"/>
+            <wp:docPr id="15" name="Picture 15"/>
             <wp:cNvGraphicFramePr>
               <a:graphicFrameLocks xmlns:a="http://schemas.openxmlformats.org/drawingml/2006/main" noChangeAspect="1"/>
             </wp:cNvGraphicFramePr>
@@ -7436,36 +7632,29 @@
               <a:graphicData uri="http://schemas.openxmlformats.org/drawingml/2006/picture">
                 <pic:pic xmlns:pic="http://schemas.openxmlformats.org/drawingml/2006/picture">
                   <pic:nvPicPr>
-                    <pic:cNvPr id="0" name="Picture 8"/>
-                    <pic:cNvPicPr>
-                      <a:picLocks noChangeAspect="1" noChangeArrowheads="1"/>
-                    </pic:cNvPicPr>
+                    <pic:cNvPr id="15" name="Picture 15"/>
+                    <pic:cNvPicPr/>
                   </pic:nvPicPr>
                   <pic:blipFill>
-                    <a:blip r:embed="rId19">
+                    <a:blip r:embed="rId21">
                       <a:extLst>
                         <a:ext uri="{28A0092B-C50C-407E-A947-70E740481C1C}">
                           <a14:useLocalDpi xmlns:a14="http://schemas.microsoft.com/office/drawing/2010/main" val="0"/>
                         </a:ext>
                       </a:extLst>
                     </a:blip>
-                    <a:srcRect/>
                     <a:stretch>
                       <a:fillRect/>
                     </a:stretch>
                   </pic:blipFill>
-                  <pic:spPr bwMode="auto">
+                  <pic:spPr>
                     <a:xfrm>
                       <a:off x="0" y="0"/>
-                      <a:ext cx="6122035" cy="8223885"/>
+                      <a:ext cx="4955717" cy="8780856"/>
                     </a:xfrm>
                     <a:prstGeom prst="rect">
                       <a:avLst/>
                     </a:prstGeom>
-                    <a:noFill/>
-                    <a:ln>
-                      <a:noFill/>
-                    </a:ln>
                   </pic:spPr>
                 </pic:pic>
               </a:graphicData>
@@ -7515,7 +7704,7 @@
                     </pic:cNvPicPr>
                   </pic:nvPicPr>
                   <pic:blipFill>
-                    <a:blip r:embed="rId20">
+                    <a:blip r:embed="rId22">
                       <a:extLst>
                         <a:ext uri="{28A0092B-C50C-407E-A947-70E740481C1C}">
                           <a14:useLocalDpi xmlns:a14="http://schemas.microsoft.com/office/drawing/2010/main" val="0"/>
@@ -7569,7 +7758,7 @@
                     </pic:cNvPicPr>
                   </pic:nvPicPr>
                   <pic:blipFill>
-                    <a:blip r:embed="rId21">
+                    <a:blip r:embed="rId23">
                       <a:extLst>
                         <a:ext uri="{28A0092B-C50C-407E-A947-70E740481C1C}">
                           <a14:useLocalDpi xmlns:a14="http://schemas.microsoft.com/office/drawing/2010/main" val="0"/>
@@ -7624,7 +7813,7 @@
                     </pic:cNvPicPr>
                   </pic:nvPicPr>
                   <pic:blipFill>
-                    <a:blip r:embed="rId22">
+                    <a:blip r:embed="rId24">
                       <a:extLst>
                         <a:ext uri="{28A0092B-C50C-407E-A947-70E740481C1C}">
                           <a14:useLocalDpi xmlns:a14="http://schemas.microsoft.com/office/drawing/2010/main" val="0"/>
@@ -7678,7 +7867,7 @@
                     </pic:cNvPicPr>
                   </pic:nvPicPr>
                   <pic:blipFill>
-                    <a:blip r:embed="rId23">
+                    <a:blip r:embed="rId25">
                       <a:extLst>
                         <a:ext uri="{28A0092B-C50C-407E-A947-70E740481C1C}">
                           <a14:useLocalDpi xmlns:a14="http://schemas.microsoft.com/office/drawing/2010/main" val="0"/>
@@ -7733,7 +7922,7 @@
                     </pic:cNvPicPr>
                   </pic:nvPicPr>
                   <pic:blipFill>
-                    <a:blip r:embed="rId24">
+                    <a:blip r:embed="rId26">
                       <a:extLst>
                         <a:ext uri="{28A0092B-C50C-407E-A947-70E740481C1C}">
                           <a14:useLocalDpi xmlns:a14="http://schemas.microsoft.com/office/drawing/2010/main" val="0"/>
@@ -7849,9 +8038,9 @@
       </w:pPr>
     </w:p>
     <w:sectPr>
-      <w:headerReference w:type="default" r:id="rId25"/>
-      <w:footerReference w:type="default" r:id="rId26"/>
-      <w:headerReference w:type="first" r:id="rId27"/>
+      <w:headerReference w:type="default" r:id="rId27"/>
+      <w:footerReference w:type="default" r:id="rId28"/>
+      <w:headerReference w:type="first" r:id="rId29"/>
       <w:pgSz w:w="11907" w:h="16840" w:code="9"/>
       <w:pgMar w:top="1440" w:right="1418" w:bottom="879" w:left="1418" w:header="720" w:footer="754" w:gutter="0"/>
       <w:pgNumType w:start="1"/>
@@ -9455,7 +9644,9 @@
   </w:style>
   <w:style w:type="character" w:default="1" w:styleId="DefaultParagraphFont">
     <w:name w:val="Default Paragraph Font"/>
+    <w:uiPriority w:val="1"/>
     <w:semiHidden/>
+    <w:unhideWhenUsed/>
   </w:style>
   <w:style w:type="table" w:default="1" w:styleId="TableNormal">
     <w:name w:val="Normal Table"/>

</xml_diff>

<commit_message>
Worked on project book and handled migration of the API (Finnhub) to version 2. More updates will be necessary to this program once the migration is actually done.
</commit_message>
<xml_diff>
--- a/Uri_Cohen_Project_book.docx
+++ b/Uri_Cohen_Project_book.docx
@@ -1,6 +1,6 @@
 
 <file path=word/document.xml><?xml version="1.0" encoding="utf-8"?>
-<w:document xmlns:wpc="http://schemas.microsoft.com/office/word/2010/wordprocessingCanvas" xmlns:cx="http://schemas.microsoft.com/office/drawing/2014/chartex" xmlns:cx1="http://schemas.microsoft.com/office/drawing/2015/9/8/chartex" xmlns:cx2="http://schemas.microsoft.com/office/drawing/2015/10/21/chartex" xmlns:cx3="http://schemas.microsoft.com/office/drawing/2016/5/9/chartex" xmlns:cx4="http://schemas.microsoft.com/office/drawing/2016/5/10/chartex" xmlns:cx5="http://schemas.microsoft.com/office/drawing/2016/5/11/chartex" xmlns:cx6="http://schemas.microsoft.com/office/drawing/2016/5/12/chartex" xmlns:cx7="http://schemas.microsoft.com/office/drawing/2016/5/13/chartex" xmlns:cx8="http://schemas.microsoft.com/office/drawing/2016/5/14/chartex" xmlns:mc="http://schemas.openxmlformats.org/markup-compatibility/2006" xmlns:aink="http://schemas.microsoft.com/office/drawing/2016/ink" xmlns:am3d="http://schemas.microsoft.com/office/drawing/2017/model3d" xmlns:o="urn:schemas-microsoft-com:office:office" xmlns:r="http://schemas.openxmlformats.org/officeDocument/2006/relationships" xmlns:m="http://schemas.openxmlformats.org/officeDocument/2006/math" xmlns:v="urn:schemas-microsoft-com:vml" xmlns:wp14="http://schemas.microsoft.com/office/word/2010/wordprocessingDrawing" xmlns:wp="http://schemas.openxmlformats.org/drawingml/2006/wordprocessingDrawing" xmlns:w10="urn:schemas-microsoft-com:office:word" xmlns:w="http://schemas.openxmlformats.org/wordprocessingml/2006/main" xmlns:w14="http://schemas.microsoft.com/office/word/2010/wordml" xmlns:w15="http://schemas.microsoft.com/office/word/2012/wordml" xmlns:w16cex="http://schemas.microsoft.com/office/word/2018/wordml/cex" xmlns:w16cid="http://schemas.microsoft.com/office/word/2016/wordml/cid" xmlns:w16="http://schemas.microsoft.com/office/word/2018/wordml" xmlns:w16sdtdh="http://schemas.microsoft.com/office/word/2020/wordml/sdtdatahash" xmlns:w16se="http://schemas.microsoft.com/office/word/2015/wordml/symex" xmlns:wpg="http://schemas.microsoft.com/office/word/2010/wordprocessingGroup" xmlns:wpi="http://schemas.microsoft.com/office/word/2010/wordprocessingInk" xmlns:wne="http://schemas.microsoft.com/office/word/2006/wordml" xmlns:wps="http://schemas.microsoft.com/office/word/2010/wordprocessingShape" mc:Ignorable="w14 w15 w16se w16cid w16 w16cex w16sdtdh wp14">
+<w:document xmlns:wpc="http://schemas.microsoft.com/office/word/2010/wordprocessingCanvas" xmlns:cx="http://schemas.microsoft.com/office/drawing/2014/chartex" xmlns:cx1="http://schemas.microsoft.com/office/drawing/2015/9/8/chartex" xmlns:cx2="http://schemas.microsoft.com/office/drawing/2015/10/21/chartex" xmlns:cx3="http://schemas.microsoft.com/office/drawing/2016/5/9/chartex" xmlns:cx4="http://schemas.microsoft.com/office/drawing/2016/5/10/chartex" xmlns:cx5="http://schemas.microsoft.com/office/drawing/2016/5/11/chartex" xmlns:cx6="http://schemas.microsoft.com/office/drawing/2016/5/12/chartex" xmlns:cx7="http://schemas.microsoft.com/office/drawing/2016/5/13/chartex" xmlns:cx8="http://schemas.microsoft.com/office/drawing/2016/5/14/chartex" xmlns:mc="http://schemas.openxmlformats.org/markup-compatibility/2006" xmlns:aink="http://schemas.microsoft.com/office/drawing/2016/ink" xmlns:am3d="http://schemas.microsoft.com/office/drawing/2017/model3d" xmlns:o="urn:schemas-microsoft-com:office:office" xmlns:oel="http://schemas.microsoft.com/office/2019/extlst" xmlns:r="http://schemas.openxmlformats.org/officeDocument/2006/relationships" xmlns:m="http://schemas.openxmlformats.org/officeDocument/2006/math" xmlns:v="urn:schemas-microsoft-com:vml" xmlns:wp14="http://schemas.microsoft.com/office/word/2010/wordprocessingDrawing" xmlns:wp="http://schemas.openxmlformats.org/drawingml/2006/wordprocessingDrawing" xmlns:w10="urn:schemas-microsoft-com:office:word" xmlns:w="http://schemas.openxmlformats.org/wordprocessingml/2006/main" xmlns:w14="http://schemas.microsoft.com/office/word/2010/wordml" xmlns:w15="http://schemas.microsoft.com/office/word/2012/wordml" xmlns:w16cex="http://schemas.microsoft.com/office/word/2018/wordml/cex" xmlns:w16cid="http://schemas.microsoft.com/office/word/2016/wordml/cid" xmlns:w16="http://schemas.microsoft.com/office/word/2018/wordml" xmlns:w16du="http://schemas.microsoft.com/office/word/2023/wordml/word16du" xmlns:w16sdtdh="http://schemas.microsoft.com/office/word/2020/wordml/sdtdatahash" xmlns:w16sdtfl="http://schemas.microsoft.com/office/word/2024/wordml/sdtformatlock" xmlns:w16se="http://schemas.microsoft.com/office/word/2015/wordml/symex" xmlns:wpg="http://schemas.microsoft.com/office/word/2010/wordprocessingGroup" xmlns:wpi="http://schemas.microsoft.com/office/word/2010/wordprocessingInk" xmlns:wne="http://schemas.microsoft.com/office/word/2006/wordml" xmlns:wps="http://schemas.microsoft.com/office/word/2010/wordprocessingShape" mc:Ignorable="w14 w15 w16se w16cid w16 w16cex w16sdtdh w16sdtfl w16du wp14">
   <w:body>
     <w:p>
       <w:pPr>
@@ -469,46 +469,19 @@
             <w:pPr>
               <w:bidi/>
               <w:rPr>
-                <w:rFonts w:ascii="Arial" w:hAnsi="Arial"/>
-                <w:szCs w:val="24"/>
-                <w:lang w:bidi="he-IL"/>
-              </w:rPr>
-            </w:pPr>
-            <w:r>
-              <w:rPr>
                 <w:rFonts w:ascii="Arial" w:hAnsi="Arial" w:hint="cs"/>
                 <w:szCs w:val="24"/>
                 <w:rtl/>
                 <w:lang w:bidi="he-IL"/>
               </w:rPr>
-              <w:t>12</w:t>
-            </w:r>
+            </w:pPr>
             <w:r>
               <w:rPr>
                 <w:rFonts w:ascii="Arial" w:hAnsi="Arial"/>
                 <w:szCs w:val="24"/>
-                <w:rtl/>
                 <w:lang w:bidi="he-IL"/>
               </w:rPr>
-              <w:t>.</w:t>
-            </w:r>
-            <w:r>
-              <w:rPr>
-                <w:rFonts w:ascii="Arial" w:hAnsi="Arial" w:hint="cs"/>
-                <w:szCs w:val="24"/>
-                <w:rtl/>
-                <w:lang w:bidi="he-IL"/>
-              </w:rPr>
-              <w:t>04</w:t>
-            </w:r>
-            <w:r>
-              <w:rPr>
-                <w:rFonts w:ascii="Arial" w:hAnsi="Arial"/>
-                <w:szCs w:val="24"/>
-                <w:rtl/>
-                <w:lang w:bidi="he-IL"/>
-              </w:rPr>
-              <w:t>.2026</w:t>
+              <w:t>11.05.2026</w:t>
             </w:r>
           </w:p>
         </w:tc>
@@ -2077,7 +2050,7 @@
     </w:p>
     <w:p>
       <w:pPr>
-        <w:pStyle w:val="TOCHeading"/>
+        <w:pStyle w:val="ad"/>
         <w:rPr>
           <w:rFonts w:ascii="Arial" w:hAnsi="Arial" w:cs="Arial"/>
         </w:rPr>
@@ -2840,7 +2813,23 @@
             <w:rFonts w:ascii="Arial" w:hAnsi="Arial"/>
             <w:noProof/>
           </w:rPr>
-          <w:t>DB tables</w:t>
+          <w:t>DB</w:t>
+        </w:r>
+        <w:r>
+          <w:rPr>
+            <w:rStyle w:val="Hyperlink"/>
+            <w:rFonts w:ascii="Arial" w:hAnsi="Arial"/>
+            <w:noProof/>
+          </w:rPr>
+          <w:t xml:space="preserve"> </w:t>
+        </w:r>
+        <w:r>
+          <w:rPr>
+            <w:rStyle w:val="Hyperlink"/>
+            <w:rFonts w:ascii="Arial" w:hAnsi="Arial"/>
+            <w:noProof/>
+          </w:rPr>
+          <w:t>tables</w:t>
         </w:r>
         <w:r>
           <w:rPr>
@@ -3319,6 +3308,105 @@
           <w:tab w:val="right" w:leader="dot" w:pos="9061"/>
         </w:tabs>
         <w:rPr>
+          <w:rFonts w:ascii="Arial" w:hAnsi="Arial" w:hint="cs"/>
+          <w:noProof/>
+          <w:kern w:val="2"/>
+          <w:szCs w:val="24"/>
+          <w:lang w:bidi="he-IL"/>
+        </w:rPr>
+      </w:pPr>
+      <w:hyperlink w:anchor="_Toc209893734" w:history="1">
+        <w:r>
+          <w:rPr>
+            <w:rStyle w:val="Hyperlink"/>
+            <w:rFonts w:ascii="Arial" w:hAnsi="Arial"/>
+            <w:noProof/>
+          </w:rPr>
+          <w:t>1.6.1</w:t>
+        </w:r>
+        <w:r>
+          <w:rPr>
+            <w:rFonts w:ascii="Arial" w:hAnsi="Arial"/>
+            <w:noProof/>
+            <w:kern w:val="2"/>
+            <w:szCs w:val="24"/>
+            <w:lang w:bidi="he-IL"/>
+          </w:rPr>
+          <w:tab/>
+        </w:r>
+        <w:r>
+          <w:rPr>
+            <w:rStyle w:val="Hyperlink"/>
+            <w:rFonts w:ascii="Arial" w:hAnsi="Arial"/>
+            <w:noProof/>
+          </w:rPr>
+          <w:t>Forms workflow</w:t>
+        </w:r>
+        <w:r>
+          <w:rPr>
+            <w:rFonts w:ascii="Arial" w:hAnsi="Arial"/>
+            <w:noProof/>
+            <w:webHidden/>
+          </w:rPr>
+          <w:tab/>
+        </w:r>
+        <w:r>
+          <w:rPr>
+            <w:rFonts w:ascii="Arial" w:hAnsi="Arial"/>
+            <w:noProof/>
+            <w:webHidden/>
+          </w:rPr>
+          <w:fldChar w:fldCharType="begin"/>
+        </w:r>
+        <w:r>
+          <w:rPr>
+            <w:rFonts w:ascii="Arial" w:hAnsi="Arial"/>
+            <w:noProof/>
+            <w:webHidden/>
+          </w:rPr>
+          <w:instrText xml:space="preserve"> PAGEREF _Toc209893734 \h </w:instrText>
+        </w:r>
+        <w:r>
+          <w:rPr>
+            <w:rFonts w:ascii="Arial" w:hAnsi="Arial"/>
+            <w:noProof/>
+            <w:webHidden/>
+          </w:rPr>
+        </w:r>
+        <w:r>
+          <w:rPr>
+            <w:rFonts w:ascii="Arial" w:hAnsi="Arial"/>
+            <w:noProof/>
+            <w:webHidden/>
+          </w:rPr>
+          <w:fldChar w:fldCharType="separate"/>
+        </w:r>
+        <w:r>
+          <w:rPr>
+            <w:rFonts w:ascii="Arial" w:hAnsi="Arial"/>
+            <w:noProof/>
+            <w:webHidden/>
+          </w:rPr>
+          <w:t>7</w:t>
+        </w:r>
+        <w:r>
+          <w:rPr>
+            <w:rFonts w:ascii="Arial" w:hAnsi="Arial"/>
+            <w:noProof/>
+            <w:webHidden/>
+          </w:rPr>
+          <w:fldChar w:fldCharType="end"/>
+        </w:r>
+      </w:hyperlink>
+    </w:p>
+    <w:p>
+      <w:pPr>
+        <w:pStyle w:val="TOC2"/>
+        <w:tabs>
+          <w:tab w:val="left" w:pos="960"/>
+          <w:tab w:val="right" w:leader="dot" w:pos="9061"/>
+        </w:tabs>
+        <w:rPr>
           <w:rFonts w:ascii="Arial" w:hAnsi="Arial"/>
           <w:noProof/>
           <w:kern w:val="2"/>
@@ -3326,14 +3414,14 @@
           <w:lang w:bidi="he-IL"/>
         </w:rPr>
       </w:pPr>
-      <w:hyperlink w:anchor="_Toc209893734" w:history="1">
+      <w:hyperlink w:anchor="_Toc209893735" w:history="1">
         <w:r>
           <w:rPr>
             <w:rStyle w:val="Hyperlink"/>
             <w:rFonts w:ascii="Arial" w:hAnsi="Arial"/>
             <w:noProof/>
           </w:rPr>
-          <w:t>1.6.1</w:t>
+          <w:t>1.7</w:t>
         </w:r>
         <w:r>
           <w:rPr>
@@ -3351,7 +3439,16 @@
             <w:rFonts w:ascii="Arial" w:hAnsi="Arial"/>
             <w:noProof/>
           </w:rPr>
-          <w:t>Forms workflow</w:t>
+          <w:t>O</w:t>
+        </w:r>
+        <w:r>
+          <w:rPr>
+            <w:rStyle w:val="Hyperlink"/>
+            <w:rFonts w:ascii="Arial" w:hAnsi="Arial"/>
+            <w:noProof/>
+            <w:lang w:bidi="he-IL"/>
+          </w:rPr>
+          <w:t>peration manual</w:t>
         </w:r>
         <w:r>
           <w:rPr>
@@ -3375,7 +3472,7 @@
             <w:noProof/>
             <w:webHidden/>
           </w:rPr>
-          <w:instrText xml:space="preserve"> PAGEREF _Toc209893734 \h </w:instrText>
+          <w:instrText xml:space="preserve"> PAGEREF _Toc209893735 \h </w:instrText>
         </w:r>
         <w:r>
           <w:rPr>
@@ -3432,7 +3529,15 @@
             <w:rFonts w:ascii="Arial" w:hAnsi="Arial"/>
             <w:noProof/>
           </w:rPr>
-          <w:t>1.7</w:t>
+          <w:t>1.</w:t>
+        </w:r>
+        <w:r>
+          <w:rPr>
+            <w:rStyle w:val="Hyperlink"/>
+            <w:rFonts w:ascii="Arial" w:hAnsi="Arial"/>
+            <w:noProof/>
+          </w:rPr>
+          <w:t>8</w:t>
         </w:r>
         <w:r>
           <w:rPr>
@@ -3531,7 +3636,15 @@
             <w:rFonts w:ascii="Arial" w:hAnsi="Arial"/>
             <w:noProof/>
           </w:rPr>
-          <w:t>1.8</w:t>
+          <w:t>1.</w:t>
+        </w:r>
+        <w:r>
+          <w:rPr>
+            <w:rStyle w:val="Hyperlink"/>
+            <w:rFonts w:ascii="Arial" w:hAnsi="Arial"/>
+            <w:noProof/>
+          </w:rPr>
+          <w:t>9</w:t>
         </w:r>
         <w:r>
           <w:rPr>
@@ -3630,7 +3743,23 @@
             <w:rFonts w:ascii="Arial" w:hAnsi="Arial"/>
             <w:noProof/>
           </w:rPr>
-          <w:t>1.8.1</w:t>
+          <w:t>1.</w:t>
+        </w:r>
+        <w:r>
+          <w:rPr>
+            <w:rStyle w:val="Hyperlink"/>
+            <w:rFonts w:ascii="Arial" w:hAnsi="Arial"/>
+            <w:noProof/>
+          </w:rPr>
+          <w:t>9</w:t>
+        </w:r>
+        <w:r>
+          <w:rPr>
+            <w:rStyle w:val="Hyperlink"/>
+            <w:rFonts w:ascii="Arial" w:hAnsi="Arial"/>
+            <w:noProof/>
+          </w:rPr>
+          <w:t>.1</w:t>
         </w:r>
         <w:r>
           <w:rPr>
@@ -3714,6 +3843,306 @@
           <w:tab w:val="left" w:pos="1440"/>
           <w:tab w:val="right" w:leader="dot" w:pos="9061"/>
         </w:tabs>
+      </w:pPr>
+      <w:hyperlink w:anchor="_Toc209893738" w:history="1">
+        <w:r>
+          <w:rPr>
+            <w:rStyle w:val="Hyperlink"/>
+            <w:rFonts w:ascii="Arial" w:hAnsi="Arial"/>
+            <w:noProof/>
+          </w:rPr>
+          <w:t>1.</w:t>
+        </w:r>
+        <w:r>
+          <w:rPr>
+            <w:rStyle w:val="Hyperlink"/>
+            <w:rFonts w:ascii="Arial" w:hAnsi="Arial"/>
+            <w:noProof/>
+          </w:rPr>
+          <w:t>9</w:t>
+        </w:r>
+        <w:r>
+          <w:rPr>
+            <w:rStyle w:val="Hyperlink"/>
+            <w:rFonts w:ascii="Arial" w:hAnsi="Arial"/>
+            <w:noProof/>
+          </w:rPr>
+          <w:t>.2</w:t>
+        </w:r>
+        <w:r>
+          <w:rPr>
+            <w:rFonts w:ascii="Arial" w:hAnsi="Arial"/>
+            <w:noProof/>
+            <w:kern w:val="2"/>
+            <w:szCs w:val="24"/>
+            <w:lang w:bidi="he-IL"/>
+          </w:rPr>
+          <w:tab/>
+        </w:r>
+        <w:r>
+          <w:rPr>
+            <w:rStyle w:val="Hyperlink"/>
+            <w:rFonts w:ascii="Arial" w:hAnsi="Arial"/>
+            <w:noProof/>
+          </w:rPr>
+          <w:t>Test Results</w:t>
+        </w:r>
+        <w:r>
+          <w:rPr>
+            <w:rFonts w:ascii="Arial" w:hAnsi="Arial"/>
+            <w:noProof/>
+            <w:webHidden/>
+          </w:rPr>
+          <w:tab/>
+        </w:r>
+        <w:r>
+          <w:rPr>
+            <w:rFonts w:ascii="Arial" w:hAnsi="Arial"/>
+            <w:noProof/>
+            <w:webHidden/>
+          </w:rPr>
+          <w:fldChar w:fldCharType="begin"/>
+        </w:r>
+        <w:r>
+          <w:rPr>
+            <w:rFonts w:ascii="Arial" w:hAnsi="Arial"/>
+            <w:noProof/>
+            <w:webHidden/>
+          </w:rPr>
+          <w:instrText xml:space="preserve"> PAGEREF _Toc209893738 \h </w:instrText>
+        </w:r>
+        <w:r>
+          <w:rPr>
+            <w:rFonts w:ascii="Arial" w:hAnsi="Arial"/>
+            <w:noProof/>
+            <w:webHidden/>
+          </w:rPr>
+        </w:r>
+        <w:r>
+          <w:rPr>
+            <w:rFonts w:ascii="Arial" w:hAnsi="Arial"/>
+            <w:noProof/>
+            <w:webHidden/>
+          </w:rPr>
+          <w:fldChar w:fldCharType="separate"/>
+        </w:r>
+        <w:r>
+          <w:rPr>
+            <w:rFonts w:ascii="Arial" w:hAnsi="Arial"/>
+            <w:noProof/>
+            <w:webHidden/>
+          </w:rPr>
+          <w:t>8</w:t>
+        </w:r>
+        <w:r>
+          <w:rPr>
+            <w:rFonts w:ascii="Arial" w:hAnsi="Arial"/>
+            <w:noProof/>
+            <w:webHidden/>
+          </w:rPr>
+          <w:fldChar w:fldCharType="end"/>
+        </w:r>
+      </w:hyperlink>
+    </w:p>
+    <w:p>
+      <w:pPr>
+        <w:pStyle w:val="TOC1"/>
+        <w:tabs>
+          <w:tab w:val="left" w:pos="480"/>
+          <w:tab w:val="right" w:leader="dot" w:pos="9061"/>
+        </w:tabs>
+      </w:pPr>
+      <w:hyperlink w:anchor="_Toc209893739" w:history="1">
+        <w:r>
+          <w:rPr>
+            <w:rStyle w:val="Hyperlink"/>
+            <w:rFonts w:ascii="Arial" w:hAnsi="Arial"/>
+            <w:noProof/>
+          </w:rPr>
+          <w:t>2.</w:t>
+        </w:r>
+        <w:r>
+          <w:rPr>
+            <w:rFonts w:ascii="Arial" w:hAnsi="Arial"/>
+            <w:noProof/>
+            <w:kern w:val="2"/>
+            <w:szCs w:val="24"/>
+            <w:lang w:bidi="he-IL"/>
+          </w:rPr>
+          <w:tab/>
+        </w:r>
+        <w:r>
+          <w:rPr>
+            <w:rStyle w:val="Hyperlink"/>
+            <w:rFonts w:ascii="Arial" w:hAnsi="Arial"/>
+            <w:noProof/>
+          </w:rPr>
+          <w:t>The research process</w:t>
+        </w:r>
+        <w:r>
+          <w:rPr>
+            <w:rFonts w:ascii="Arial" w:hAnsi="Arial"/>
+            <w:noProof/>
+            <w:webHidden/>
+          </w:rPr>
+          <w:tab/>
+        </w:r>
+        <w:r>
+          <w:rPr>
+            <w:rFonts w:ascii="Arial" w:hAnsi="Arial"/>
+            <w:noProof/>
+            <w:webHidden/>
+          </w:rPr>
+          <w:fldChar w:fldCharType="begin"/>
+        </w:r>
+        <w:r>
+          <w:rPr>
+            <w:rFonts w:ascii="Arial" w:hAnsi="Arial"/>
+            <w:noProof/>
+            <w:webHidden/>
+          </w:rPr>
+          <w:instrText xml:space="preserve"> PAGEREF _Toc209893739 \h </w:instrText>
+        </w:r>
+        <w:r>
+          <w:rPr>
+            <w:rFonts w:ascii="Arial" w:hAnsi="Arial"/>
+            <w:noProof/>
+            <w:webHidden/>
+          </w:rPr>
+        </w:r>
+        <w:r>
+          <w:rPr>
+            <w:rFonts w:ascii="Arial" w:hAnsi="Arial"/>
+            <w:noProof/>
+            <w:webHidden/>
+          </w:rPr>
+          <w:fldChar w:fldCharType="separate"/>
+        </w:r>
+        <w:r>
+          <w:rPr>
+            <w:rFonts w:ascii="Arial" w:hAnsi="Arial"/>
+            <w:noProof/>
+            <w:webHidden/>
+          </w:rPr>
+          <w:t>8</w:t>
+        </w:r>
+        <w:r>
+          <w:rPr>
+            <w:rFonts w:ascii="Arial" w:hAnsi="Arial"/>
+            <w:noProof/>
+            <w:webHidden/>
+          </w:rPr>
+          <w:fldChar w:fldCharType="end"/>
+        </w:r>
+      </w:hyperlink>
+    </w:p>
+    <w:p>
+      <w:pPr>
+        <w:pStyle w:val="TOC3"/>
+        <w:tabs>
+          <w:tab w:val="left" w:pos="1440"/>
+          <w:tab w:val="right" w:leader="dot" w:pos="9061"/>
+        </w:tabs>
+      </w:pPr>
+      <w:hyperlink w:anchor="_Toc209893737" w:history="1">
+        <w:r>
+          <w:rPr>
+            <w:rStyle w:val="Hyperlink"/>
+            <w:rFonts w:ascii="Arial" w:hAnsi="Arial"/>
+            <w:noProof/>
+          </w:rPr>
+          <w:t>2</w:t>
+        </w:r>
+        <w:r>
+          <w:rPr>
+            <w:rStyle w:val="Hyperlink"/>
+            <w:rFonts w:ascii="Arial" w:hAnsi="Arial"/>
+            <w:noProof/>
+          </w:rPr>
+          <w:t>.1</w:t>
+        </w:r>
+        <w:r>
+          <w:rPr>
+            <w:rFonts w:ascii="Arial" w:hAnsi="Arial"/>
+            <w:noProof/>
+            <w:kern w:val="2"/>
+            <w:szCs w:val="24"/>
+            <w:lang w:bidi="he-IL"/>
+          </w:rPr>
+          <w:tab/>
+        </w:r>
+        <w:r>
+          <w:rPr>
+            <w:rStyle w:val="Hyperlink"/>
+            <w:rFonts w:ascii="Arial" w:hAnsi="Arial"/>
+            <w:noProof/>
+          </w:rPr>
+          <w:t>Challenges</w:t>
+        </w:r>
+        <w:r>
+          <w:rPr>
+            <w:rFonts w:ascii="Arial" w:hAnsi="Arial"/>
+            <w:noProof/>
+            <w:webHidden/>
+          </w:rPr>
+          <w:tab/>
+        </w:r>
+        <w:r>
+          <w:rPr>
+            <w:rFonts w:ascii="Arial" w:hAnsi="Arial"/>
+            <w:noProof/>
+            <w:webHidden/>
+          </w:rPr>
+          <w:fldChar w:fldCharType="begin"/>
+        </w:r>
+        <w:r>
+          <w:rPr>
+            <w:rFonts w:ascii="Arial" w:hAnsi="Arial"/>
+            <w:noProof/>
+            <w:webHidden/>
+          </w:rPr>
+          <w:instrText xml:space="preserve"> PAGEREF _Toc209893737 \h </w:instrText>
+        </w:r>
+        <w:r>
+          <w:rPr>
+            <w:rFonts w:ascii="Arial" w:hAnsi="Arial"/>
+            <w:noProof/>
+            <w:webHidden/>
+          </w:rPr>
+        </w:r>
+        <w:r>
+          <w:rPr>
+            <w:rFonts w:ascii="Arial" w:hAnsi="Arial"/>
+            <w:noProof/>
+            <w:webHidden/>
+          </w:rPr>
+          <w:fldChar w:fldCharType="separate"/>
+        </w:r>
+        <w:r>
+          <w:rPr>
+            <w:rFonts w:ascii="Arial" w:hAnsi="Arial"/>
+            <w:noProof/>
+            <w:webHidden/>
+          </w:rPr>
+          <w:t>8</w:t>
+        </w:r>
+        <w:r>
+          <w:rPr>
+            <w:rFonts w:ascii="Arial" w:hAnsi="Arial"/>
+            <w:noProof/>
+            <w:webHidden/>
+          </w:rPr>
+          <w:fldChar w:fldCharType="end"/>
+        </w:r>
+      </w:hyperlink>
+    </w:p>
+    <w:p>
+      <w:pPr>
+        <w:pStyle w:val="TOC3"/>
+        <w:tabs>
+          <w:tab w:val="left" w:pos="1440"/>
+          <w:tab w:val="right" w:leader="dot" w:pos="9061"/>
+        </w:tabs>
         <w:rPr>
           <w:rFonts w:ascii="Arial" w:hAnsi="Arial"/>
           <w:noProof/>
@@ -3722,14 +4151,14 @@
           <w:lang w:bidi="he-IL"/>
         </w:rPr>
       </w:pPr>
-      <w:hyperlink w:anchor="_Toc209893738" w:history="1">
+      <w:hyperlink w:anchor="_Toc209893737" w:history="1">
         <w:r>
           <w:rPr>
             <w:rStyle w:val="Hyperlink"/>
             <w:rFonts w:ascii="Arial" w:hAnsi="Arial"/>
             <w:noProof/>
           </w:rPr>
-          <w:t>1.8.2</w:t>
+          <w:t>2.2</w:t>
         </w:r>
         <w:r>
           <w:rPr>
@@ -3747,7 +4176,7 @@
             <w:rFonts w:ascii="Arial" w:hAnsi="Arial"/>
             <w:noProof/>
           </w:rPr>
-          <w:t>Test Results</w:t>
+          <w:t>Systemic alternatives analysis</w:t>
         </w:r>
         <w:r>
           <w:rPr>
@@ -3771,7 +4200,7 @@
             <w:noProof/>
             <w:webHidden/>
           </w:rPr>
-          <w:instrText xml:space="preserve"> PAGEREF _Toc209893738 \h </w:instrText>
+          <w:instrText xml:space="preserve"> PAGEREF _Toc209893737 \h </w:instrText>
         </w:r>
         <w:r>
           <w:rPr>
@@ -3805,6 +4234,13 @@
           <w:fldChar w:fldCharType="end"/>
         </w:r>
       </w:hyperlink>
+    </w:p>
+    <w:p>
+      <w:pPr>
+        <w:rPr>
+          <w:lang w:bidi="he-IL"/>
+        </w:rPr>
+      </w:pPr>
     </w:p>
     <w:p>
       <w:pPr>
@@ -3828,7 +4264,125 @@
             <w:rFonts w:ascii="Arial" w:hAnsi="Arial"/>
             <w:noProof/>
           </w:rPr>
-          <w:t>2.</w:t>
+          <w:t>3</w:t>
+        </w:r>
+        <w:r>
+          <w:rPr>
+            <w:rStyle w:val="Hyperlink"/>
+            <w:rFonts w:ascii="Arial" w:hAnsi="Arial"/>
+            <w:noProof/>
+          </w:rPr>
+          <w:t>.</w:t>
+        </w:r>
+        <w:r>
+          <w:rPr>
+            <w:rFonts w:ascii="Arial" w:hAnsi="Arial"/>
+            <w:noProof/>
+            <w:kern w:val="2"/>
+            <w:szCs w:val="24"/>
+            <w:lang w:bidi="he-IL"/>
+          </w:rPr>
+          <w:tab/>
+        </w:r>
+        <w:r>
+          <w:rPr>
+            <w:rStyle w:val="Hyperlink"/>
+            <w:rFonts w:ascii="Arial" w:hAnsi="Arial"/>
+            <w:noProof/>
+          </w:rPr>
+          <w:t>Reflection</w:t>
+        </w:r>
+        <w:r>
+          <w:rPr>
+            <w:rFonts w:ascii="Arial" w:hAnsi="Arial"/>
+            <w:noProof/>
+            <w:webHidden/>
+          </w:rPr>
+          <w:tab/>
+        </w:r>
+        <w:r>
+          <w:rPr>
+            <w:rFonts w:ascii="Arial" w:hAnsi="Arial"/>
+            <w:noProof/>
+            <w:webHidden/>
+          </w:rPr>
+          <w:fldChar w:fldCharType="begin"/>
+        </w:r>
+        <w:r>
+          <w:rPr>
+            <w:rFonts w:ascii="Arial" w:hAnsi="Arial"/>
+            <w:noProof/>
+            <w:webHidden/>
+          </w:rPr>
+          <w:instrText xml:space="preserve"> PAGEREF _Toc209893739 \h </w:instrText>
+        </w:r>
+        <w:r>
+          <w:rPr>
+            <w:rFonts w:ascii="Arial" w:hAnsi="Arial"/>
+            <w:noProof/>
+            <w:webHidden/>
+          </w:rPr>
+        </w:r>
+        <w:r>
+          <w:rPr>
+            <w:rFonts w:ascii="Arial" w:hAnsi="Arial"/>
+            <w:noProof/>
+            <w:webHidden/>
+          </w:rPr>
+          <w:fldChar w:fldCharType="separate"/>
+        </w:r>
+        <w:r>
+          <w:rPr>
+            <w:rFonts w:ascii="Arial" w:hAnsi="Arial"/>
+            <w:noProof/>
+            <w:webHidden/>
+          </w:rPr>
+          <w:t>8</w:t>
+        </w:r>
+        <w:r>
+          <w:rPr>
+            <w:rFonts w:ascii="Arial" w:hAnsi="Arial"/>
+            <w:noProof/>
+            <w:webHidden/>
+          </w:rPr>
+          <w:fldChar w:fldCharType="end"/>
+        </w:r>
+      </w:hyperlink>
+    </w:p>
+    <w:p>
+      <w:pPr>
+        <w:pStyle w:val="TOC1"/>
+        <w:tabs>
+          <w:tab w:val="left" w:pos="480"/>
+          <w:tab w:val="right" w:leader="dot" w:pos="9061"/>
+        </w:tabs>
+        <w:rPr>
+          <w:rFonts w:ascii="Arial" w:hAnsi="Arial"/>
+          <w:noProof/>
+          <w:kern w:val="2"/>
+          <w:szCs w:val="24"/>
+          <w:lang w:bidi="he-IL"/>
+        </w:rPr>
+      </w:pPr>
+      <w:r>
+        <w:br/>
+      </w:r>
+      <w:hyperlink w:anchor="_Toc209893739" w:history="1">
+        <w:r>
+          <w:rPr>
+            <w:rStyle w:val="Hyperlink"/>
+            <w:rFonts w:ascii="Arial" w:hAnsi="Arial"/>
+            <w:noProof/>
+          </w:rPr>
+          <w:t>4</w:t>
+        </w:r>
+        <w:r>
+          <w:rPr>
+            <w:rStyle w:val="Hyperlink"/>
+            <w:rFonts w:ascii="Arial" w:hAnsi="Arial"/>
+            <w:noProof/>
+          </w:rPr>
+          <w:t>.</w:t>
         </w:r>
         <w:r>
           <w:rPr>
@@ -3930,7 +4484,7 @@
     </w:p>
     <w:p>
       <w:pPr>
-        <w:pStyle w:val="Heading1"/>
+        <w:pStyle w:val="1"/>
       </w:pPr>
       <w:bookmarkStart w:id="1" w:name="_Toc209893722"/>
       <w:r>
@@ -3960,7 +4514,6 @@
           <w:color w:val="auto"/>
           <w:lang w:val="ru-RU" w:eastAsia="en-US"/>
         </w:rPr>
-        <w:lastRenderedPageBreak/>
         <w:t xml:space="preserve">API </w:t>
       </w:r>
       <w:r>
@@ -4133,7 +4686,7 @@
     </w:p>
     <w:p>
       <w:pPr>
-        <w:pStyle w:val="Heading2"/>
+        <w:pStyle w:val="2"/>
         <w:jc w:val="both"/>
       </w:pPr>
       <w:bookmarkStart w:id="2" w:name="_Toc186985898"/>
@@ -4186,7 +4739,7 @@
     </w:p>
     <w:p>
       <w:pPr>
-        <w:pStyle w:val="Heading2"/>
+        <w:pStyle w:val="2"/>
       </w:pPr>
       <w:r>
         <w:t>Related software or hardware</w:t>
@@ -4426,7 +4979,7 @@
     </w:p>
     <w:p>
       <w:pPr>
-        <w:pStyle w:val="Heading2"/>
+        <w:pStyle w:val="2"/>
       </w:pPr>
       <w:bookmarkStart w:id="6" w:name="_Toc186985900"/>
       <w:bookmarkStart w:id="7" w:name="_Toc209893725"/>
@@ -4484,7 +5037,7 @@
     </w:p>
     <w:p>
       <w:pPr>
-        <w:pStyle w:val="Heading2"/>
+        <w:pStyle w:val="2"/>
       </w:pPr>
       <w:bookmarkStart w:id="8" w:name="_Toc186985901"/>
       <w:bookmarkStart w:id="9" w:name="_Toc209893726"/>
@@ -4799,11 +5352,12 @@
     </w:p>
     <w:p>
       <w:pPr>
-        <w:pStyle w:val="Heading2"/>
+        <w:pStyle w:val="2"/>
       </w:pPr>
       <w:bookmarkStart w:id="10" w:name="_Toc186985902"/>
       <w:bookmarkStart w:id="11" w:name="_Toc209893727"/>
       <w:r>
+        <w:lastRenderedPageBreak/>
         <w:t>System Architecture</w:t>
       </w:r>
       <w:r>
@@ -4972,7 +5526,6 @@
           <w:rtl/>
           <w:lang w:eastAsia="en-US"/>
         </w:rPr>
-        <w:lastRenderedPageBreak/>
         <w:t>ראשית, התוכנית מבקשת את כתובת הדוא"ל של שם המשתמש. אם כתובת הדוא"ל של שם המשתמש מופיעה במסד הנתונים, נוכל לעבור למסך השני</w:t>
       </w:r>
       <w:r>
@@ -5475,7 +6028,7 @@
     </w:p>
     <w:p>
       <w:pPr>
-        <w:pStyle w:val="Heading3"/>
+        <w:pStyle w:val="3"/>
         <w:jc w:val="both"/>
       </w:pPr>
       <w:bookmarkStart w:id="12" w:name="_Toc186985903"/>
@@ -5489,7 +6042,7 @@
     </w:p>
     <w:p>
       <w:pPr>
-        <w:pStyle w:val="Heading4"/>
+        <w:pStyle w:val="4"/>
       </w:pPr>
       <w:r>
         <w:t xml:space="preserve">Use Case – </w:t>
@@ -5570,7 +6123,7 @@
     </w:p>
     <w:p>
       <w:pPr>
-        <w:pStyle w:val="Heading4"/>
+        <w:pStyle w:val="4"/>
       </w:pPr>
       <w:r>
         <w:t xml:space="preserve">Use Case – </w:t>
@@ -5642,7 +6195,7 @@
     </w:p>
     <w:p>
       <w:pPr>
-        <w:pStyle w:val="Heading4"/>
+        <w:pStyle w:val="4"/>
       </w:pPr>
       <w:r>
         <w:lastRenderedPageBreak/>
@@ -5654,7 +6207,7 @@
     </w:p>
     <w:p>
       <w:pPr>
-        <w:pStyle w:val="Heading4"/>
+        <w:pStyle w:val="4"/>
         <w:numPr>
           <w:ilvl w:val="0"/>
           <w:numId w:val="0"/>
@@ -5722,7 +6275,7 @@
     </w:p>
     <w:p>
       <w:pPr>
-        <w:pStyle w:val="Heading4"/>
+        <w:pStyle w:val="4"/>
       </w:pPr>
       <w:r>
         <w:t xml:space="preserve">Sequence diagram – </w:t>
@@ -5794,7 +6347,7 @@
     </w:p>
     <w:p>
       <w:pPr>
-        <w:pStyle w:val="Heading3"/>
+        <w:pStyle w:val="3"/>
         <w:jc w:val="both"/>
       </w:pPr>
       <w:bookmarkStart w:id="14" w:name="_Toc186985904"/>
@@ -5811,70 +6364,15 @@
           <w:rFonts w:ascii="Arial" w:hAnsi="Arial"/>
         </w:rPr>
       </w:pPr>
-      <w:r>
-        <w:rPr>
-          <w:rFonts w:ascii="Arial" w:hAnsi="Arial"/>
-          <w:noProof/>
-        </w:rPr>
-        <w:drawing>
-          <wp:inline distT="0" distB="0" distL="0" distR="0" wp14:anchorId="2997516E" wp14:editId="77005E21">
-            <wp:extent cx="2161540" cy="3390265"/>
-            <wp:effectExtent l="0" t="0" r="0" b="0"/>
-            <wp:docPr id="6" name="Picture 6"/>
-            <wp:cNvGraphicFramePr>
-              <a:graphicFrameLocks xmlns:a="http://schemas.openxmlformats.org/drawingml/2006/main" noChangeAspect="1"/>
-            </wp:cNvGraphicFramePr>
-            <a:graphic xmlns:a="http://schemas.openxmlformats.org/drawingml/2006/main">
-              <a:graphicData uri="http://schemas.openxmlformats.org/drawingml/2006/picture">
-                <pic:pic xmlns:pic="http://schemas.openxmlformats.org/drawingml/2006/picture">
-                  <pic:nvPicPr>
-                    <pic:cNvPr id="0" name="Picture 6"/>
-                    <pic:cNvPicPr>
-                      <a:picLocks noChangeAspect="1" noChangeArrowheads="1"/>
-                    </pic:cNvPicPr>
-                  </pic:nvPicPr>
-                  <pic:blipFill>
-                    <a:blip r:embed="rId17">
-                      <a:extLst>
-                        <a:ext uri="{28A0092B-C50C-407E-A947-70E740481C1C}">
-                          <a14:useLocalDpi xmlns:a14="http://schemas.microsoft.com/office/drawing/2010/main" val="0"/>
-                        </a:ext>
-                      </a:extLst>
-                    </a:blip>
-                    <a:srcRect/>
-                    <a:stretch>
-                      <a:fillRect/>
-                    </a:stretch>
-                  </pic:blipFill>
-                  <pic:spPr bwMode="auto">
-                    <a:xfrm>
-                      <a:off x="0" y="0"/>
-                      <a:ext cx="2161540" cy="3390265"/>
-                    </a:xfrm>
-                    <a:prstGeom prst="rect">
-                      <a:avLst/>
-                    </a:prstGeom>
-                    <a:noFill/>
-                    <a:ln>
-                      <a:noFill/>
-                    </a:ln>
-                  </pic:spPr>
-                </pic:pic>
-              </a:graphicData>
-            </a:graphic>
-          </wp:inline>
-        </w:drawing>
-      </w:r>
-    </w:p>
-    <w:p>
-      <w:pPr>
-        <w:pStyle w:val="Heading3"/>
+    </w:p>
+    <w:p>
+      <w:pPr>
+        <w:pStyle w:val="3"/>
         <w:jc w:val="both"/>
       </w:pPr>
       <w:bookmarkStart w:id="16" w:name="_Toc186985905"/>
       <w:bookmarkStart w:id="17" w:name="_Toc209893730"/>
       <w:r>
-        <w:lastRenderedPageBreak/>
         <w:t>Protocol</w:t>
       </w:r>
       <w:bookmarkEnd w:id="16"/>
@@ -6321,6 +6819,7 @@
               <w:rPr>
                 <w:rFonts w:ascii="Arial" w:hAnsi="Arial"/>
               </w:rPr>
+              <w:lastRenderedPageBreak/>
               <w:t>send_email</w:t>
             </w:r>
             <w:proofErr w:type="spellEnd"/>
@@ -7006,7 +7505,6 @@
               <w:rPr>
                 <w:rFonts w:ascii="Arial" w:hAnsi="Arial"/>
               </w:rPr>
-              <w:lastRenderedPageBreak/>
               <w:t>N/A</w:t>
             </w:r>
           </w:p>
@@ -7237,7 +7735,7 @@
     </w:p>
     <w:p>
       <w:pPr>
-        <w:pStyle w:val="Heading3"/>
+        <w:pStyle w:val="3"/>
         <w:jc w:val="both"/>
       </w:pPr>
       <w:bookmarkStart w:id="18" w:name="_Toc209893731"/>
@@ -7271,12 +7769,13 @@
     </w:p>
     <w:p>
       <w:pPr>
-        <w:pStyle w:val="Heading3"/>
+        <w:pStyle w:val="3"/>
         <w:jc w:val="both"/>
       </w:pPr>
       <w:bookmarkStart w:id="19" w:name="_Toc186985906"/>
       <w:bookmarkStart w:id="20" w:name="_Toc209893732"/>
       <w:r>
+        <w:lastRenderedPageBreak/>
         <w:t>Classes</w:t>
       </w:r>
       <w:bookmarkEnd w:id="19"/>
@@ -7321,7 +7820,6 @@
           <w:noProof/>
           <w:lang w:bidi="he-IL"/>
         </w:rPr>
-        <w:lastRenderedPageBreak/>
         <w:drawing>
           <wp:inline distT="0" distB="0" distL="0" distR="0" wp14:anchorId="6C5C80AB" wp14:editId="431399A8">
             <wp:extent cx="6528331" cy="6887688"/>
@@ -7338,7 +7836,7 @@
                     <pic:cNvPicPr/>
                   </pic:nvPicPr>
                   <pic:blipFill>
-                    <a:blip r:embed="rId18" cstate="print">
+                    <a:blip r:embed="rId17" cstate="print">
                       <a:extLst>
                         <a:ext uri="{28A0092B-C50C-407E-A947-70E740481C1C}">
                           <a14:useLocalDpi xmlns:a14="http://schemas.microsoft.com/office/drawing/2010/main" val="0"/>
@@ -7367,7 +7865,7 @@
     </w:p>
     <w:p>
       <w:pPr>
-        <w:pStyle w:val="Heading3"/>
+        <w:pStyle w:val="3"/>
         <w:numPr>
           <w:ilvl w:val="0"/>
           <w:numId w:val="0"/>
@@ -7433,7 +7931,7 @@
                     <pic:cNvPicPr/>
                   </pic:nvPicPr>
                   <pic:blipFill>
-                    <a:blip r:embed="rId19" cstate="print">
+                    <a:blip r:embed="rId18" cstate="print">
                       <a:extLst>
                         <a:ext uri="{28A0092B-C50C-407E-A947-70E740481C1C}">
                           <a14:useLocalDpi xmlns:a14="http://schemas.microsoft.com/office/drawing/2010/main" val="0"/>
@@ -7462,7 +7960,7 @@
     </w:p>
     <w:p>
       <w:pPr>
-        <w:pStyle w:val="Heading3"/>
+        <w:pStyle w:val="3"/>
       </w:pPr>
       <w:r>
         <w:t>Threading</w:t>
@@ -7525,7 +8023,7 @@
     </w:p>
     <w:p>
       <w:pPr>
-        <w:pStyle w:val="Heading2"/>
+        <w:pStyle w:val="2"/>
         <w:ind w:left="578" w:hanging="289"/>
       </w:pPr>
       <w:bookmarkStart w:id="21" w:name="_Toc186985907"/>
@@ -7565,7 +8063,7 @@
                     </pic:cNvPicPr>
                   </pic:nvPicPr>
                   <pic:blipFill>
-                    <a:blip r:embed="rId20" cstate="print">
+                    <a:blip r:embed="rId19" cstate="print">
                       <a:extLst>
                         <a:ext uri="{28A0092B-C50C-407E-A947-70E740481C1C}">
                           <a14:useLocalDpi xmlns:a14="http://schemas.microsoft.com/office/drawing/2010/main" val="0"/>
@@ -7599,7 +8097,7 @@
     </w:p>
     <w:p>
       <w:pPr>
-        <w:pStyle w:val="Heading3"/>
+        <w:pStyle w:val="3"/>
         <w:jc w:val="both"/>
       </w:pPr>
       <w:bookmarkStart w:id="23" w:name="_Toc209893734"/>
@@ -7636,7 +8134,7 @@
                     <pic:cNvPicPr/>
                   </pic:nvPicPr>
                   <pic:blipFill>
-                    <a:blip r:embed="rId21">
+                    <a:blip r:embed="rId20">
                       <a:extLst>
                         <a:ext uri="{28A0092B-C50C-407E-A947-70E740481C1C}">
                           <a14:useLocalDpi xmlns:a14="http://schemas.microsoft.com/office/drawing/2010/main" val="0"/>
@@ -7665,12 +8163,22 @@
     </w:p>
     <w:p>
       <w:pPr>
-        <w:pStyle w:val="Heading2"/>
+        <w:pStyle w:val="2"/>
         <w:ind w:left="578" w:hanging="289"/>
       </w:pPr>
       <w:bookmarkStart w:id="24" w:name="_Toc209893735"/>
       <w:r>
         <w:lastRenderedPageBreak/>
+        <w:t>Operation manual</w:t>
+      </w:r>
+    </w:p>
+    <w:p/>
+    <w:p>
+      <w:pPr>
+        <w:pStyle w:val="2"/>
+        <w:ind w:left="578" w:hanging="289"/>
+      </w:pPr>
+      <w:r>
         <w:t>Source Code</w:t>
       </w:r>
       <w:bookmarkEnd w:id="24"/>
@@ -7704,7 +8212,7 @@
                     </pic:cNvPicPr>
                   </pic:nvPicPr>
                   <pic:blipFill>
-                    <a:blip r:embed="rId22">
+                    <a:blip r:embed="rId21">
                       <a:extLst>
                         <a:ext uri="{28A0092B-C50C-407E-A947-70E740481C1C}">
                           <a14:useLocalDpi xmlns:a14="http://schemas.microsoft.com/office/drawing/2010/main" val="0"/>
@@ -7758,7 +8266,7 @@
                     </pic:cNvPicPr>
                   </pic:nvPicPr>
                   <pic:blipFill>
-                    <a:blip r:embed="rId23">
+                    <a:blip r:embed="rId22">
                       <a:extLst>
                         <a:ext uri="{28A0092B-C50C-407E-A947-70E740481C1C}">
                           <a14:useLocalDpi xmlns:a14="http://schemas.microsoft.com/office/drawing/2010/main" val="0"/>
@@ -7813,7 +8321,7 @@
                     </pic:cNvPicPr>
                   </pic:nvPicPr>
                   <pic:blipFill>
-                    <a:blip r:embed="rId24">
+                    <a:blip r:embed="rId23">
                       <a:extLst>
                         <a:ext uri="{28A0092B-C50C-407E-A947-70E740481C1C}">
                           <a14:useLocalDpi xmlns:a14="http://schemas.microsoft.com/office/drawing/2010/main" val="0"/>
@@ -7867,7 +8375,7 @@
                     </pic:cNvPicPr>
                   </pic:nvPicPr>
                   <pic:blipFill>
-                    <a:blip r:embed="rId25">
+                    <a:blip r:embed="rId24">
                       <a:extLst>
                         <a:ext uri="{28A0092B-C50C-407E-A947-70E740481C1C}">
                           <a14:useLocalDpi xmlns:a14="http://schemas.microsoft.com/office/drawing/2010/main" val="0"/>
@@ -7922,7 +8430,7 @@
                     </pic:cNvPicPr>
                   </pic:nvPicPr>
                   <pic:blipFill>
-                    <a:blip r:embed="rId26">
+                    <a:blip r:embed="rId25">
                       <a:extLst>
                         <a:ext uri="{28A0092B-C50C-407E-A947-70E740481C1C}">
                           <a14:useLocalDpi xmlns:a14="http://schemas.microsoft.com/office/drawing/2010/main" val="0"/>
@@ -7956,7 +8464,7 @@
     </w:p>
     <w:p>
       <w:pPr>
-        <w:pStyle w:val="Heading2"/>
+        <w:pStyle w:val="2"/>
         <w:ind w:left="578" w:hanging="289"/>
       </w:pPr>
       <w:bookmarkStart w:id="25" w:name="_Toc209893736"/>
@@ -7967,7 +8475,7 @@
     </w:p>
     <w:p>
       <w:pPr>
-        <w:pStyle w:val="Heading3"/>
+        <w:pStyle w:val="3"/>
         <w:jc w:val="both"/>
       </w:pPr>
       <w:bookmarkStart w:id="26" w:name="_Toc186985910"/>
@@ -7993,7 +8501,7 @@
     </w:p>
     <w:p>
       <w:pPr>
-        <w:pStyle w:val="Heading3"/>
+        <w:pStyle w:val="3"/>
         <w:jc w:val="both"/>
       </w:pPr>
       <w:bookmarkStart w:id="28" w:name="_Toc186985911"/>
@@ -8006,41 +8514,83 @@
     </w:p>
     <w:p>
       <w:pPr>
+        <w:pStyle w:val="1"/>
+        <w:ind w:left="431" w:hanging="142"/>
+      </w:pPr>
+      <w:r>
+        <w:t>The research process</w:t>
+      </w:r>
+    </w:p>
+    <w:p>
+      <w:pPr>
+        <w:pStyle w:val="3"/>
+        <w:numPr>
+          <w:ilvl w:val="2"/>
+          <w:numId w:val="2"/>
+        </w:numPr>
+        <w:jc w:val="both"/>
+      </w:pPr>
+      <w:r>
+        <w:t>Challenges</w:t>
+      </w:r>
+    </w:p>
+    <w:p>
+      <w:pPr>
+        <w:pStyle w:val="3"/>
+        <w:numPr>
+          <w:ilvl w:val="2"/>
+          <w:numId w:val="2"/>
+        </w:numPr>
+        <w:jc w:val="both"/>
+      </w:pPr>
+      <w:r>
+        <w:t>Systemic alternatives analysis</w:t>
+      </w:r>
+    </w:p>
+    <w:p>
+      <w:pPr>
+        <w:ind w:left="289"/>
+      </w:pPr>
+    </w:p>
+    <w:p/>
+    <w:p>
+      <w:pPr>
         <w:rPr>
           <w:rFonts w:ascii="Arial" w:hAnsi="Arial"/>
         </w:rPr>
       </w:pPr>
-      <w:r>
+    </w:p>
+    <w:p>
+      <w:pPr>
+        <w:pStyle w:val="1"/>
+        <w:ind w:left="431" w:hanging="142"/>
+      </w:pPr>
+      <w:r>
+        <w:t>Reflection</w:t>
+      </w:r>
+    </w:p>
+    <w:p>
+      <w:pPr>
+        <w:pStyle w:val="1"/>
+        <w:ind w:left="431" w:hanging="142"/>
+      </w:pPr>
+      <w:r>
+        <w:lastRenderedPageBreak/>
+        <w:t>Bibliography</w:t>
+      </w:r>
+    </w:p>
+    <w:p/>
+    <w:p>
+      <w:pPr>
         <w:rPr>
           <w:rFonts w:ascii="Arial" w:hAnsi="Arial"/>
         </w:rPr>
-        <w:t>…</w:t>
-      </w:r>
-    </w:p>
-    <w:p>
-      <w:pPr>
-        <w:pStyle w:val="Heading1"/>
-        <w:ind w:left="431" w:hanging="142"/>
-      </w:pPr>
-      <w:bookmarkStart w:id="30" w:name="_Toc186985912"/>
-      <w:bookmarkStart w:id="31" w:name="_Toc209893739"/>
-      <w:r>
-        <w:t>Bibliography</w:t>
-      </w:r>
-      <w:bookmarkEnd w:id="30"/>
-      <w:bookmarkEnd w:id="31"/>
-    </w:p>
-    <w:p>
-      <w:pPr>
-        <w:rPr>
-          <w:rFonts w:ascii="Arial" w:hAnsi="Arial"/>
-        </w:rPr>
       </w:pPr>
     </w:p>
     <w:sectPr>
-      <w:headerReference w:type="default" r:id="rId27"/>
-      <w:footerReference w:type="default" r:id="rId28"/>
-      <w:headerReference w:type="first" r:id="rId29"/>
+      <w:headerReference w:type="default" r:id="rId26"/>
+      <w:footerReference w:type="default" r:id="rId27"/>
+      <w:headerReference w:type="first" r:id="rId28"/>
       <w:pgSz w:w="11907" w:h="16840" w:code="9"/>
       <w:pgMar w:top="1440" w:right="1418" w:bottom="879" w:left="1418" w:header="720" w:footer="754" w:gutter="0"/>
       <w:pgNumType w:start="1"/>
@@ -8053,7 +8603,7 @@
 </file>
 
 <file path=word/endnotes.xml><?xml version="1.0" encoding="utf-8"?>
-<w:endnotes xmlns:wpc="http://schemas.microsoft.com/office/word/2010/wordprocessingCanvas" xmlns:cx="http://schemas.microsoft.com/office/drawing/2014/chartex" xmlns:cx1="http://schemas.microsoft.com/office/drawing/2015/9/8/chartex" xmlns:cx2="http://schemas.microsoft.com/office/drawing/2015/10/21/chartex" xmlns:cx3="http://schemas.microsoft.com/office/drawing/2016/5/9/chartex" xmlns:cx4="http://schemas.microsoft.com/office/drawing/2016/5/10/chartex" xmlns:cx5="http://schemas.microsoft.com/office/drawing/2016/5/11/chartex" xmlns:cx6="http://schemas.microsoft.com/office/drawing/2016/5/12/chartex" xmlns:cx7="http://schemas.microsoft.com/office/drawing/2016/5/13/chartex" xmlns:cx8="http://schemas.microsoft.com/office/drawing/2016/5/14/chartex" xmlns:mc="http://schemas.openxmlformats.org/markup-compatibility/2006" xmlns:aink="http://schemas.microsoft.com/office/drawing/2016/ink" xmlns:am3d="http://schemas.microsoft.com/office/drawing/2017/model3d" xmlns:o="urn:schemas-microsoft-com:office:office" xmlns:r="http://schemas.openxmlformats.org/officeDocument/2006/relationships" xmlns:m="http://schemas.openxmlformats.org/officeDocument/2006/math" xmlns:v="urn:schemas-microsoft-com:vml" xmlns:wp14="http://schemas.microsoft.com/office/word/2010/wordprocessingDrawing" xmlns:wp="http://schemas.openxmlformats.org/drawingml/2006/wordprocessingDrawing" xmlns:w10="urn:schemas-microsoft-com:office:word" xmlns:w="http://schemas.openxmlformats.org/wordprocessingml/2006/main" xmlns:w14="http://schemas.microsoft.com/office/word/2010/wordml" xmlns:w15="http://schemas.microsoft.com/office/word/2012/wordml" xmlns:w16cex="http://schemas.microsoft.com/office/word/2018/wordml/cex" xmlns:w16cid="http://schemas.microsoft.com/office/word/2016/wordml/cid" xmlns:w16="http://schemas.microsoft.com/office/word/2018/wordml" xmlns:w16sdtdh="http://schemas.microsoft.com/office/word/2020/wordml/sdtdatahash" xmlns:w16se="http://schemas.microsoft.com/office/word/2015/wordml/symex" xmlns:wpg="http://schemas.microsoft.com/office/word/2010/wordprocessingGroup" xmlns:wpi="http://schemas.microsoft.com/office/word/2010/wordprocessingInk" xmlns:wne="http://schemas.microsoft.com/office/word/2006/wordml" xmlns:wps="http://schemas.microsoft.com/office/word/2010/wordprocessingShape" mc:Ignorable="w14 w15 w16se w16cid w16 w16cex w16sdtdh wp14">
+<w:endnotes xmlns:wpc="http://schemas.microsoft.com/office/word/2010/wordprocessingCanvas" xmlns:cx="http://schemas.microsoft.com/office/drawing/2014/chartex" xmlns:cx1="http://schemas.microsoft.com/office/drawing/2015/9/8/chartex" xmlns:cx2="http://schemas.microsoft.com/office/drawing/2015/10/21/chartex" xmlns:cx3="http://schemas.microsoft.com/office/drawing/2016/5/9/chartex" xmlns:cx4="http://schemas.microsoft.com/office/drawing/2016/5/10/chartex" xmlns:cx5="http://schemas.microsoft.com/office/drawing/2016/5/11/chartex" xmlns:cx6="http://schemas.microsoft.com/office/drawing/2016/5/12/chartex" xmlns:cx7="http://schemas.microsoft.com/office/drawing/2016/5/13/chartex" xmlns:cx8="http://schemas.microsoft.com/office/drawing/2016/5/14/chartex" xmlns:mc="http://schemas.openxmlformats.org/markup-compatibility/2006" xmlns:aink="http://schemas.microsoft.com/office/drawing/2016/ink" xmlns:am3d="http://schemas.microsoft.com/office/drawing/2017/model3d" xmlns:o="urn:schemas-microsoft-com:office:office" xmlns:oel="http://schemas.microsoft.com/office/2019/extlst" xmlns:r="http://schemas.openxmlformats.org/officeDocument/2006/relationships" xmlns:m="http://schemas.openxmlformats.org/officeDocument/2006/math" xmlns:v="urn:schemas-microsoft-com:vml" xmlns:wp14="http://schemas.microsoft.com/office/word/2010/wordprocessingDrawing" xmlns:wp="http://schemas.openxmlformats.org/drawingml/2006/wordprocessingDrawing" xmlns:w10="urn:schemas-microsoft-com:office:word" xmlns:w="http://schemas.openxmlformats.org/wordprocessingml/2006/main" xmlns:w14="http://schemas.microsoft.com/office/word/2010/wordml" xmlns:w15="http://schemas.microsoft.com/office/word/2012/wordml" xmlns:w16cex="http://schemas.microsoft.com/office/word/2018/wordml/cex" xmlns:w16cid="http://schemas.microsoft.com/office/word/2016/wordml/cid" xmlns:w16="http://schemas.microsoft.com/office/word/2018/wordml" xmlns:w16du="http://schemas.microsoft.com/office/word/2023/wordml/word16du" xmlns:w16sdtdh="http://schemas.microsoft.com/office/word/2020/wordml/sdtdatahash" xmlns:w16sdtfl="http://schemas.microsoft.com/office/word/2024/wordml/sdtformatlock" xmlns:w16se="http://schemas.microsoft.com/office/word/2015/wordml/symex" xmlns:wpg="http://schemas.microsoft.com/office/word/2010/wordprocessingGroup" xmlns:wpi="http://schemas.microsoft.com/office/word/2010/wordprocessingInk" xmlns:wne="http://schemas.microsoft.com/office/word/2006/wordml" xmlns:wps="http://schemas.microsoft.com/office/word/2010/wordprocessingShape" mc:Ignorable="w14 w15 w16se w16cid w16 w16cex w16sdtdh w16sdtfl w16du wp14">
   <w:endnote w:type="separator" w:id="-1">
     <w:p>
       <w:pPr>
@@ -8078,10 +8628,10 @@
 </file>
 
 <file path=word/footer1.xml><?xml version="1.0" encoding="utf-8"?>
-<w:ftr xmlns:wpc="http://schemas.microsoft.com/office/word/2010/wordprocessingCanvas" xmlns:cx="http://schemas.microsoft.com/office/drawing/2014/chartex" xmlns:cx1="http://schemas.microsoft.com/office/drawing/2015/9/8/chartex" xmlns:cx2="http://schemas.microsoft.com/office/drawing/2015/10/21/chartex" xmlns:cx3="http://schemas.microsoft.com/office/drawing/2016/5/9/chartex" xmlns:cx4="http://schemas.microsoft.com/office/drawing/2016/5/10/chartex" xmlns:cx5="http://schemas.microsoft.com/office/drawing/2016/5/11/chartex" xmlns:cx6="http://schemas.microsoft.com/office/drawing/2016/5/12/chartex" xmlns:cx7="http://schemas.microsoft.com/office/drawing/2016/5/13/chartex" xmlns:cx8="http://schemas.microsoft.com/office/drawing/2016/5/14/chartex" xmlns:mc="http://schemas.openxmlformats.org/markup-compatibility/2006" xmlns:aink="http://schemas.microsoft.com/office/drawing/2016/ink" xmlns:am3d="http://schemas.microsoft.com/office/drawing/2017/model3d" xmlns:o="urn:schemas-microsoft-com:office:office" xmlns:r="http://schemas.openxmlformats.org/officeDocument/2006/relationships" xmlns:m="http://schemas.openxmlformats.org/officeDocument/2006/math" xmlns:v="urn:schemas-microsoft-com:vml" xmlns:wp14="http://schemas.microsoft.com/office/word/2010/wordprocessingDrawing" xmlns:wp="http://schemas.openxmlformats.org/drawingml/2006/wordprocessingDrawing" xmlns:w10="urn:schemas-microsoft-com:office:word" xmlns:w="http://schemas.openxmlformats.org/wordprocessingml/2006/main" xmlns:w14="http://schemas.microsoft.com/office/word/2010/wordml" xmlns:w15="http://schemas.microsoft.com/office/word/2012/wordml" xmlns:w16cex="http://schemas.microsoft.com/office/word/2018/wordml/cex" xmlns:w16cid="http://schemas.microsoft.com/office/word/2016/wordml/cid" xmlns:w16="http://schemas.microsoft.com/office/word/2018/wordml" xmlns:w16sdtdh="http://schemas.microsoft.com/office/word/2020/wordml/sdtdatahash" xmlns:w16se="http://schemas.microsoft.com/office/word/2015/wordml/symex" xmlns:wpg="http://schemas.microsoft.com/office/word/2010/wordprocessingGroup" xmlns:wpi="http://schemas.microsoft.com/office/word/2010/wordprocessingInk" xmlns:wne="http://schemas.microsoft.com/office/word/2006/wordml" xmlns:wps="http://schemas.microsoft.com/office/word/2010/wordprocessingShape" mc:Ignorable="w14 w15 w16se w16cid w16 w16cex w16sdtdh wp14">
+<w:ftr xmlns:wpc="http://schemas.microsoft.com/office/word/2010/wordprocessingCanvas" xmlns:cx="http://schemas.microsoft.com/office/drawing/2014/chartex" xmlns:cx1="http://schemas.microsoft.com/office/drawing/2015/9/8/chartex" xmlns:cx2="http://schemas.microsoft.com/office/drawing/2015/10/21/chartex" xmlns:cx3="http://schemas.microsoft.com/office/drawing/2016/5/9/chartex" xmlns:cx4="http://schemas.microsoft.com/office/drawing/2016/5/10/chartex" xmlns:cx5="http://schemas.microsoft.com/office/drawing/2016/5/11/chartex" xmlns:cx6="http://schemas.microsoft.com/office/drawing/2016/5/12/chartex" xmlns:cx7="http://schemas.microsoft.com/office/drawing/2016/5/13/chartex" xmlns:cx8="http://schemas.microsoft.com/office/drawing/2016/5/14/chartex" xmlns:mc="http://schemas.openxmlformats.org/markup-compatibility/2006" xmlns:aink="http://schemas.microsoft.com/office/drawing/2016/ink" xmlns:am3d="http://schemas.microsoft.com/office/drawing/2017/model3d" xmlns:o="urn:schemas-microsoft-com:office:office" xmlns:oel="http://schemas.microsoft.com/office/2019/extlst" xmlns:r="http://schemas.openxmlformats.org/officeDocument/2006/relationships" xmlns:m="http://schemas.openxmlformats.org/officeDocument/2006/math" xmlns:v="urn:schemas-microsoft-com:vml" xmlns:wp14="http://schemas.microsoft.com/office/word/2010/wordprocessingDrawing" xmlns:wp="http://schemas.openxmlformats.org/drawingml/2006/wordprocessingDrawing" xmlns:w10="urn:schemas-microsoft-com:office:word" xmlns:w="http://schemas.openxmlformats.org/wordprocessingml/2006/main" xmlns:w14="http://schemas.microsoft.com/office/word/2010/wordml" xmlns:w15="http://schemas.microsoft.com/office/word/2012/wordml" xmlns:w16cex="http://schemas.microsoft.com/office/word/2018/wordml/cex" xmlns:w16cid="http://schemas.microsoft.com/office/word/2016/wordml/cid" xmlns:w16="http://schemas.microsoft.com/office/word/2018/wordml" xmlns:w16du="http://schemas.microsoft.com/office/word/2023/wordml/word16du" xmlns:w16sdtdh="http://schemas.microsoft.com/office/word/2020/wordml/sdtdatahash" xmlns:w16sdtfl="http://schemas.microsoft.com/office/word/2024/wordml/sdtformatlock" xmlns:w16se="http://schemas.microsoft.com/office/word/2015/wordml/symex" xmlns:wpg="http://schemas.microsoft.com/office/word/2010/wordprocessingGroup" xmlns:wpi="http://schemas.microsoft.com/office/word/2010/wordprocessingInk" xmlns:wne="http://schemas.microsoft.com/office/word/2006/wordml" xmlns:wps="http://schemas.microsoft.com/office/word/2010/wordprocessingShape" mc:Ignorable="w14 w15 w16se w16cid w16 w16cex w16sdtdh w16sdtfl w16du wp14">
   <w:p>
     <w:pPr>
-      <w:pStyle w:val="Footer"/>
+      <w:pStyle w:val="a4"/>
       <w:pBdr>
         <w:top w:val="single" w:sz="4" w:space="1" w:color="D9D9D9"/>
       </w:pBdr>
@@ -8123,7 +8673,7 @@
 </file>
 
 <file path=word/footnotes.xml><?xml version="1.0" encoding="utf-8"?>
-<w:footnotes xmlns:wpc="http://schemas.microsoft.com/office/word/2010/wordprocessingCanvas" xmlns:cx="http://schemas.microsoft.com/office/drawing/2014/chartex" xmlns:cx1="http://schemas.microsoft.com/office/drawing/2015/9/8/chartex" xmlns:cx2="http://schemas.microsoft.com/office/drawing/2015/10/21/chartex" xmlns:cx3="http://schemas.microsoft.com/office/drawing/2016/5/9/chartex" xmlns:cx4="http://schemas.microsoft.com/office/drawing/2016/5/10/chartex" xmlns:cx5="http://schemas.microsoft.com/office/drawing/2016/5/11/chartex" xmlns:cx6="http://schemas.microsoft.com/office/drawing/2016/5/12/chartex" xmlns:cx7="http://schemas.microsoft.com/office/drawing/2016/5/13/chartex" xmlns:cx8="http://schemas.microsoft.com/office/drawing/2016/5/14/chartex" xmlns:mc="http://schemas.openxmlformats.org/markup-compatibility/2006" xmlns:aink="http://schemas.microsoft.com/office/drawing/2016/ink" xmlns:am3d="http://schemas.microsoft.com/office/drawing/2017/model3d" xmlns:o="urn:schemas-microsoft-com:office:office" xmlns:r="http://schemas.openxmlformats.org/officeDocument/2006/relationships" xmlns:m="http://schemas.openxmlformats.org/officeDocument/2006/math" xmlns:v="urn:schemas-microsoft-com:vml" xmlns:wp14="http://schemas.microsoft.com/office/word/2010/wordprocessingDrawing" xmlns:wp="http://schemas.openxmlformats.org/drawingml/2006/wordprocessingDrawing" xmlns:w10="urn:schemas-microsoft-com:office:word" xmlns:w="http://schemas.openxmlformats.org/wordprocessingml/2006/main" xmlns:w14="http://schemas.microsoft.com/office/word/2010/wordml" xmlns:w15="http://schemas.microsoft.com/office/word/2012/wordml" xmlns:w16cex="http://schemas.microsoft.com/office/word/2018/wordml/cex" xmlns:w16cid="http://schemas.microsoft.com/office/word/2016/wordml/cid" xmlns:w16="http://schemas.microsoft.com/office/word/2018/wordml" xmlns:w16sdtdh="http://schemas.microsoft.com/office/word/2020/wordml/sdtdatahash" xmlns:w16se="http://schemas.microsoft.com/office/word/2015/wordml/symex" xmlns:wpg="http://schemas.microsoft.com/office/word/2010/wordprocessingGroup" xmlns:wpi="http://schemas.microsoft.com/office/word/2010/wordprocessingInk" xmlns:wne="http://schemas.microsoft.com/office/word/2006/wordml" xmlns:wps="http://schemas.microsoft.com/office/word/2010/wordprocessingShape" mc:Ignorable="w14 w15 w16se w16cid w16 w16cex w16sdtdh wp14">
+<w:footnotes xmlns:wpc="http://schemas.microsoft.com/office/word/2010/wordprocessingCanvas" xmlns:cx="http://schemas.microsoft.com/office/drawing/2014/chartex" xmlns:cx1="http://schemas.microsoft.com/office/drawing/2015/9/8/chartex" xmlns:cx2="http://schemas.microsoft.com/office/drawing/2015/10/21/chartex" xmlns:cx3="http://schemas.microsoft.com/office/drawing/2016/5/9/chartex" xmlns:cx4="http://schemas.microsoft.com/office/drawing/2016/5/10/chartex" xmlns:cx5="http://schemas.microsoft.com/office/drawing/2016/5/11/chartex" xmlns:cx6="http://schemas.microsoft.com/office/drawing/2016/5/12/chartex" xmlns:cx7="http://schemas.microsoft.com/office/drawing/2016/5/13/chartex" xmlns:cx8="http://schemas.microsoft.com/office/drawing/2016/5/14/chartex" xmlns:mc="http://schemas.openxmlformats.org/markup-compatibility/2006" xmlns:aink="http://schemas.microsoft.com/office/drawing/2016/ink" xmlns:am3d="http://schemas.microsoft.com/office/drawing/2017/model3d" xmlns:o="urn:schemas-microsoft-com:office:office" xmlns:oel="http://schemas.microsoft.com/office/2019/extlst" xmlns:r="http://schemas.openxmlformats.org/officeDocument/2006/relationships" xmlns:m="http://schemas.openxmlformats.org/officeDocument/2006/math" xmlns:v="urn:schemas-microsoft-com:vml" xmlns:wp14="http://schemas.microsoft.com/office/word/2010/wordprocessingDrawing" xmlns:wp="http://schemas.openxmlformats.org/drawingml/2006/wordprocessingDrawing" xmlns:w10="urn:schemas-microsoft-com:office:word" xmlns:w="http://schemas.openxmlformats.org/wordprocessingml/2006/main" xmlns:w14="http://schemas.microsoft.com/office/word/2010/wordml" xmlns:w15="http://schemas.microsoft.com/office/word/2012/wordml" xmlns:w16cex="http://schemas.microsoft.com/office/word/2018/wordml/cex" xmlns:w16cid="http://schemas.microsoft.com/office/word/2016/wordml/cid" xmlns:w16="http://schemas.microsoft.com/office/word/2018/wordml" xmlns:w16du="http://schemas.microsoft.com/office/word/2023/wordml/word16du" xmlns:w16sdtdh="http://schemas.microsoft.com/office/word/2020/wordml/sdtdatahash" xmlns:w16sdtfl="http://schemas.microsoft.com/office/word/2024/wordml/sdtformatlock" xmlns:w16se="http://schemas.microsoft.com/office/word/2015/wordml/symex" xmlns:wpg="http://schemas.microsoft.com/office/word/2010/wordprocessingGroup" xmlns:wpi="http://schemas.microsoft.com/office/word/2010/wordprocessingInk" xmlns:wne="http://schemas.microsoft.com/office/word/2006/wordml" xmlns:wps="http://schemas.microsoft.com/office/word/2010/wordprocessingShape" mc:Ignorable="w14 w15 w16se w16cid w16 w16cex w16sdtdh w16sdtfl w16du wp14">
   <w:footnote w:type="separator" w:id="-1">
     <w:p>
       <w:pPr>
@@ -8148,10 +8698,10 @@
 </file>
 
 <file path=word/header1.xml><?xml version="1.0" encoding="utf-8"?>
-<w:hdr xmlns:wpc="http://schemas.microsoft.com/office/word/2010/wordprocessingCanvas" xmlns:cx="http://schemas.microsoft.com/office/drawing/2014/chartex" xmlns:cx1="http://schemas.microsoft.com/office/drawing/2015/9/8/chartex" xmlns:cx2="http://schemas.microsoft.com/office/drawing/2015/10/21/chartex" xmlns:cx3="http://schemas.microsoft.com/office/drawing/2016/5/9/chartex" xmlns:cx4="http://schemas.microsoft.com/office/drawing/2016/5/10/chartex" xmlns:cx5="http://schemas.microsoft.com/office/drawing/2016/5/11/chartex" xmlns:cx6="http://schemas.microsoft.com/office/drawing/2016/5/12/chartex" xmlns:cx7="http://schemas.microsoft.com/office/drawing/2016/5/13/chartex" xmlns:cx8="http://schemas.microsoft.com/office/drawing/2016/5/14/chartex" xmlns:mc="http://schemas.openxmlformats.org/markup-compatibility/2006" xmlns:aink="http://schemas.microsoft.com/office/drawing/2016/ink" xmlns:am3d="http://schemas.microsoft.com/office/drawing/2017/model3d" xmlns:o="urn:schemas-microsoft-com:office:office" xmlns:r="http://schemas.openxmlformats.org/officeDocument/2006/relationships" xmlns:m="http://schemas.openxmlformats.org/officeDocument/2006/math" xmlns:v="urn:schemas-microsoft-com:vml" xmlns:wp14="http://schemas.microsoft.com/office/word/2010/wordprocessingDrawing" xmlns:wp="http://schemas.openxmlformats.org/drawingml/2006/wordprocessingDrawing" xmlns:w10="urn:schemas-microsoft-com:office:word" xmlns:w="http://schemas.openxmlformats.org/wordprocessingml/2006/main" xmlns:w14="http://schemas.microsoft.com/office/word/2010/wordml" xmlns:w15="http://schemas.microsoft.com/office/word/2012/wordml" xmlns:w16cex="http://schemas.microsoft.com/office/word/2018/wordml/cex" xmlns:w16cid="http://schemas.microsoft.com/office/word/2016/wordml/cid" xmlns:w16="http://schemas.microsoft.com/office/word/2018/wordml" xmlns:w16sdtdh="http://schemas.microsoft.com/office/word/2020/wordml/sdtdatahash" xmlns:w16se="http://schemas.microsoft.com/office/word/2015/wordml/symex" xmlns:wpg="http://schemas.microsoft.com/office/word/2010/wordprocessingGroup" xmlns:wpi="http://schemas.microsoft.com/office/word/2010/wordprocessingInk" xmlns:wne="http://schemas.microsoft.com/office/word/2006/wordml" xmlns:wps="http://schemas.microsoft.com/office/word/2010/wordprocessingShape" mc:Ignorable="w14 w15 w16se w16cid w16 w16cex w16sdtdh wp14">
+<w:hdr xmlns:wpc="http://schemas.microsoft.com/office/word/2010/wordprocessingCanvas" xmlns:cx="http://schemas.microsoft.com/office/drawing/2014/chartex" xmlns:cx1="http://schemas.microsoft.com/office/drawing/2015/9/8/chartex" xmlns:cx2="http://schemas.microsoft.com/office/drawing/2015/10/21/chartex" xmlns:cx3="http://schemas.microsoft.com/office/drawing/2016/5/9/chartex" xmlns:cx4="http://schemas.microsoft.com/office/drawing/2016/5/10/chartex" xmlns:cx5="http://schemas.microsoft.com/office/drawing/2016/5/11/chartex" xmlns:cx6="http://schemas.microsoft.com/office/drawing/2016/5/12/chartex" xmlns:cx7="http://schemas.microsoft.com/office/drawing/2016/5/13/chartex" xmlns:cx8="http://schemas.microsoft.com/office/drawing/2016/5/14/chartex" xmlns:mc="http://schemas.openxmlformats.org/markup-compatibility/2006" xmlns:aink="http://schemas.microsoft.com/office/drawing/2016/ink" xmlns:am3d="http://schemas.microsoft.com/office/drawing/2017/model3d" xmlns:o="urn:schemas-microsoft-com:office:office" xmlns:oel="http://schemas.microsoft.com/office/2019/extlst" xmlns:r="http://schemas.openxmlformats.org/officeDocument/2006/relationships" xmlns:m="http://schemas.openxmlformats.org/officeDocument/2006/math" xmlns:v="urn:schemas-microsoft-com:vml" xmlns:wp14="http://schemas.microsoft.com/office/word/2010/wordprocessingDrawing" xmlns:wp="http://schemas.openxmlformats.org/drawingml/2006/wordprocessingDrawing" xmlns:w10="urn:schemas-microsoft-com:office:word" xmlns:w="http://schemas.openxmlformats.org/wordprocessingml/2006/main" xmlns:w14="http://schemas.microsoft.com/office/word/2010/wordml" xmlns:w15="http://schemas.microsoft.com/office/word/2012/wordml" xmlns:w16cex="http://schemas.microsoft.com/office/word/2018/wordml/cex" xmlns:w16cid="http://schemas.microsoft.com/office/word/2016/wordml/cid" xmlns:w16="http://schemas.microsoft.com/office/word/2018/wordml" xmlns:w16du="http://schemas.microsoft.com/office/word/2023/wordml/word16du" xmlns:w16sdtdh="http://schemas.microsoft.com/office/word/2020/wordml/sdtdatahash" xmlns:w16sdtfl="http://schemas.microsoft.com/office/word/2024/wordml/sdtformatlock" xmlns:w16se="http://schemas.microsoft.com/office/word/2015/wordml/symex" xmlns:wpg="http://schemas.microsoft.com/office/word/2010/wordprocessingGroup" xmlns:wpi="http://schemas.microsoft.com/office/word/2010/wordprocessingInk" xmlns:wne="http://schemas.microsoft.com/office/word/2006/wordml" xmlns:wps="http://schemas.microsoft.com/office/word/2010/wordprocessingShape" mc:Ignorable="w14 w15 w16se w16cid w16 w16cex w16sdtdh w16sdtfl w16du wp14">
   <w:p>
     <w:pPr>
-      <w:pStyle w:val="Header"/>
+      <w:pStyle w:val="a6"/>
       <w:pBdr>
         <w:top w:val="none" w:sz="0" w:space="0" w:color="auto"/>
         <w:left w:val="none" w:sz="0" w:space="0" w:color="auto"/>
@@ -8178,10 +8728,10 @@
 </file>
 
 <file path=word/header2.xml><?xml version="1.0" encoding="utf-8"?>
-<w:hdr xmlns:wpc="http://schemas.microsoft.com/office/word/2010/wordprocessingCanvas" xmlns:cx="http://schemas.microsoft.com/office/drawing/2014/chartex" xmlns:cx1="http://schemas.microsoft.com/office/drawing/2015/9/8/chartex" xmlns:cx2="http://schemas.microsoft.com/office/drawing/2015/10/21/chartex" xmlns:cx3="http://schemas.microsoft.com/office/drawing/2016/5/9/chartex" xmlns:cx4="http://schemas.microsoft.com/office/drawing/2016/5/10/chartex" xmlns:cx5="http://schemas.microsoft.com/office/drawing/2016/5/11/chartex" xmlns:cx6="http://schemas.microsoft.com/office/drawing/2016/5/12/chartex" xmlns:cx7="http://schemas.microsoft.com/office/drawing/2016/5/13/chartex" xmlns:cx8="http://schemas.microsoft.com/office/drawing/2016/5/14/chartex" xmlns:mc="http://schemas.openxmlformats.org/markup-compatibility/2006" xmlns:aink="http://schemas.microsoft.com/office/drawing/2016/ink" xmlns:am3d="http://schemas.microsoft.com/office/drawing/2017/model3d" xmlns:o="urn:schemas-microsoft-com:office:office" xmlns:r="http://schemas.openxmlformats.org/officeDocument/2006/relationships" xmlns:m="http://schemas.openxmlformats.org/officeDocument/2006/math" xmlns:v="urn:schemas-microsoft-com:vml" xmlns:wp14="http://schemas.microsoft.com/office/word/2010/wordprocessingDrawing" xmlns:wp="http://schemas.openxmlformats.org/drawingml/2006/wordprocessingDrawing" xmlns:w10="urn:schemas-microsoft-com:office:word" xmlns:w="http://schemas.openxmlformats.org/wordprocessingml/2006/main" xmlns:w14="http://schemas.microsoft.com/office/word/2010/wordml" xmlns:w15="http://schemas.microsoft.com/office/word/2012/wordml" xmlns:w16cex="http://schemas.microsoft.com/office/word/2018/wordml/cex" xmlns:w16cid="http://schemas.microsoft.com/office/word/2016/wordml/cid" xmlns:w16="http://schemas.microsoft.com/office/word/2018/wordml" xmlns:w16sdtdh="http://schemas.microsoft.com/office/word/2020/wordml/sdtdatahash" xmlns:w16se="http://schemas.microsoft.com/office/word/2015/wordml/symex" xmlns:wpg="http://schemas.microsoft.com/office/word/2010/wordprocessingGroup" xmlns:wpi="http://schemas.microsoft.com/office/word/2010/wordprocessingInk" xmlns:wne="http://schemas.microsoft.com/office/word/2006/wordml" xmlns:wps="http://schemas.microsoft.com/office/word/2010/wordprocessingShape" mc:Ignorable="w14 w15 w16se w16cid w16 w16cex w16sdtdh wp14">
+<w:hdr xmlns:wpc="http://schemas.microsoft.com/office/word/2010/wordprocessingCanvas" xmlns:cx="http://schemas.microsoft.com/office/drawing/2014/chartex" xmlns:cx1="http://schemas.microsoft.com/office/drawing/2015/9/8/chartex" xmlns:cx2="http://schemas.microsoft.com/office/drawing/2015/10/21/chartex" xmlns:cx3="http://schemas.microsoft.com/office/drawing/2016/5/9/chartex" xmlns:cx4="http://schemas.microsoft.com/office/drawing/2016/5/10/chartex" xmlns:cx5="http://schemas.microsoft.com/office/drawing/2016/5/11/chartex" xmlns:cx6="http://schemas.microsoft.com/office/drawing/2016/5/12/chartex" xmlns:cx7="http://schemas.microsoft.com/office/drawing/2016/5/13/chartex" xmlns:cx8="http://schemas.microsoft.com/office/drawing/2016/5/14/chartex" xmlns:mc="http://schemas.openxmlformats.org/markup-compatibility/2006" xmlns:aink="http://schemas.microsoft.com/office/drawing/2016/ink" xmlns:am3d="http://schemas.microsoft.com/office/drawing/2017/model3d" xmlns:o="urn:schemas-microsoft-com:office:office" xmlns:oel="http://schemas.microsoft.com/office/2019/extlst" xmlns:r="http://schemas.openxmlformats.org/officeDocument/2006/relationships" xmlns:m="http://schemas.openxmlformats.org/officeDocument/2006/math" xmlns:v="urn:schemas-microsoft-com:vml" xmlns:wp14="http://schemas.microsoft.com/office/word/2010/wordprocessingDrawing" xmlns:wp="http://schemas.openxmlformats.org/drawingml/2006/wordprocessingDrawing" xmlns:w10="urn:schemas-microsoft-com:office:word" xmlns:w="http://schemas.openxmlformats.org/wordprocessingml/2006/main" xmlns:w14="http://schemas.microsoft.com/office/word/2010/wordml" xmlns:w15="http://schemas.microsoft.com/office/word/2012/wordml" xmlns:w16cex="http://schemas.microsoft.com/office/word/2018/wordml/cex" xmlns:w16cid="http://schemas.microsoft.com/office/word/2016/wordml/cid" xmlns:w16="http://schemas.microsoft.com/office/word/2018/wordml" xmlns:w16du="http://schemas.microsoft.com/office/word/2023/wordml/word16du" xmlns:w16sdtdh="http://schemas.microsoft.com/office/word/2020/wordml/sdtdatahash" xmlns:w16sdtfl="http://schemas.microsoft.com/office/word/2024/wordml/sdtformatlock" xmlns:w16se="http://schemas.microsoft.com/office/word/2015/wordml/symex" xmlns:wpg="http://schemas.microsoft.com/office/word/2010/wordprocessingGroup" xmlns:wpi="http://schemas.microsoft.com/office/word/2010/wordprocessingInk" xmlns:wne="http://schemas.microsoft.com/office/word/2006/wordml" xmlns:wps="http://schemas.microsoft.com/office/word/2010/wordprocessingShape" mc:Ignorable="w14 w15 w16se w16cid w16 w16cex w16sdtdh w16sdtfl w16du wp14">
   <w:p>
     <w:pPr>
-      <w:pStyle w:val="Header"/>
+      <w:pStyle w:val="a6"/>
     </w:pPr>
     <w:r>
       <w:drawing>
@@ -8238,7 +8788,7 @@
 </file>
 
 <file path=word/numbering.xml><?xml version="1.0" encoding="utf-8"?>
-<w:numbering xmlns:wpc="http://schemas.microsoft.com/office/word/2010/wordprocessingCanvas" xmlns:cx="http://schemas.microsoft.com/office/drawing/2014/chartex" xmlns:cx1="http://schemas.microsoft.com/office/drawing/2015/9/8/chartex" xmlns:cx2="http://schemas.microsoft.com/office/drawing/2015/10/21/chartex" xmlns:cx3="http://schemas.microsoft.com/office/drawing/2016/5/9/chartex" xmlns:cx4="http://schemas.microsoft.com/office/drawing/2016/5/10/chartex" xmlns:cx5="http://schemas.microsoft.com/office/drawing/2016/5/11/chartex" xmlns:cx6="http://schemas.microsoft.com/office/drawing/2016/5/12/chartex" xmlns:cx7="http://schemas.microsoft.com/office/drawing/2016/5/13/chartex" xmlns:cx8="http://schemas.microsoft.com/office/drawing/2016/5/14/chartex" xmlns:mc="http://schemas.openxmlformats.org/markup-compatibility/2006" xmlns:aink="http://schemas.microsoft.com/office/drawing/2016/ink" xmlns:am3d="http://schemas.microsoft.com/office/drawing/2017/model3d" xmlns:o="urn:schemas-microsoft-com:office:office" xmlns:r="http://schemas.openxmlformats.org/officeDocument/2006/relationships" xmlns:m="http://schemas.openxmlformats.org/officeDocument/2006/math" xmlns:v="urn:schemas-microsoft-com:vml" xmlns:wp14="http://schemas.microsoft.com/office/word/2010/wordprocessingDrawing" xmlns:wp="http://schemas.openxmlformats.org/drawingml/2006/wordprocessingDrawing" xmlns:w10="urn:schemas-microsoft-com:office:word" xmlns:w="http://schemas.openxmlformats.org/wordprocessingml/2006/main" xmlns:w14="http://schemas.microsoft.com/office/word/2010/wordml" xmlns:w15="http://schemas.microsoft.com/office/word/2012/wordml" xmlns:w16cex="http://schemas.microsoft.com/office/word/2018/wordml/cex" xmlns:w16cid="http://schemas.microsoft.com/office/word/2016/wordml/cid" xmlns:w16="http://schemas.microsoft.com/office/word/2018/wordml" xmlns:w16sdtdh="http://schemas.microsoft.com/office/word/2020/wordml/sdtdatahash" xmlns:w16se="http://schemas.microsoft.com/office/word/2015/wordml/symex" xmlns:wpg="http://schemas.microsoft.com/office/word/2010/wordprocessingGroup" xmlns:wpi="http://schemas.microsoft.com/office/word/2010/wordprocessingInk" xmlns:wne="http://schemas.microsoft.com/office/word/2006/wordml" xmlns:wps="http://schemas.microsoft.com/office/word/2010/wordprocessingShape" mc:Ignorable="w14 w15 w16se w16cid w16 w16cex w16sdtdh wp14">
+<w:numbering xmlns:wpc="http://schemas.microsoft.com/office/word/2010/wordprocessingCanvas" xmlns:cx="http://schemas.microsoft.com/office/drawing/2014/chartex" xmlns:cx1="http://schemas.microsoft.com/office/drawing/2015/9/8/chartex" xmlns:cx2="http://schemas.microsoft.com/office/drawing/2015/10/21/chartex" xmlns:cx3="http://schemas.microsoft.com/office/drawing/2016/5/9/chartex" xmlns:cx4="http://schemas.microsoft.com/office/drawing/2016/5/10/chartex" xmlns:cx5="http://schemas.microsoft.com/office/drawing/2016/5/11/chartex" xmlns:cx6="http://schemas.microsoft.com/office/drawing/2016/5/12/chartex" xmlns:cx7="http://schemas.microsoft.com/office/drawing/2016/5/13/chartex" xmlns:cx8="http://schemas.microsoft.com/office/drawing/2016/5/14/chartex" xmlns:mc="http://schemas.openxmlformats.org/markup-compatibility/2006" xmlns:aink="http://schemas.microsoft.com/office/drawing/2016/ink" xmlns:am3d="http://schemas.microsoft.com/office/drawing/2017/model3d" xmlns:o="urn:schemas-microsoft-com:office:office" xmlns:oel="http://schemas.microsoft.com/office/2019/extlst" xmlns:r="http://schemas.openxmlformats.org/officeDocument/2006/relationships" xmlns:m="http://schemas.openxmlformats.org/officeDocument/2006/math" xmlns:v="urn:schemas-microsoft-com:vml" xmlns:wp14="http://schemas.microsoft.com/office/word/2010/wordprocessingDrawing" xmlns:wp="http://schemas.openxmlformats.org/drawingml/2006/wordprocessingDrawing" xmlns:w10="urn:schemas-microsoft-com:office:word" xmlns:w="http://schemas.openxmlformats.org/wordprocessingml/2006/main" xmlns:w14="http://schemas.microsoft.com/office/word/2010/wordml" xmlns:w15="http://schemas.microsoft.com/office/word/2012/wordml" xmlns:w16cex="http://schemas.microsoft.com/office/word/2018/wordml/cex" xmlns:w16cid="http://schemas.microsoft.com/office/word/2016/wordml/cid" xmlns:w16="http://schemas.microsoft.com/office/word/2018/wordml" xmlns:w16du="http://schemas.microsoft.com/office/word/2023/wordml/word16du" xmlns:w16sdtdh="http://schemas.microsoft.com/office/word/2020/wordml/sdtdatahash" xmlns:w16sdtfl="http://schemas.microsoft.com/office/word/2024/wordml/sdtformatlock" xmlns:w16se="http://schemas.microsoft.com/office/word/2015/wordml/symex" xmlns:wpg="http://schemas.microsoft.com/office/word/2010/wordprocessingGroup" xmlns:wpi="http://schemas.microsoft.com/office/word/2010/wordprocessingInk" xmlns:wne="http://schemas.microsoft.com/office/word/2006/wordml" xmlns:wps="http://schemas.microsoft.com/office/word/2010/wordprocessingShape" mc:Ignorable="w14 w15 w16se w16cid w16 w16cex w16sdtdh w16sdtfl w16du wp14">
   <w:abstractNum w:abstractNumId="0" w15:restartNumberingAfterBreak="0">
     <w:nsid w:val="FFFFFFFE"/>
     <w:multiLevelType w:val="singleLevel"/>
@@ -8701,20 +9251,20 @@
     <w:lvl w:ilvl="0">
       <w:start w:val="1"/>
       <w:numFmt w:val="decimal"/>
-      <w:pStyle w:val="Heading1"/>
+      <w:pStyle w:val="1"/>
       <w:lvlText w:val="%1."/>
       <w:lvlJc w:val="center"/>
       <w:pPr>
         <w:tabs>
-          <w:tab w:val="num" w:pos="648"/>
+          <w:tab w:val="num" w:pos="643"/>
         </w:tabs>
-        <w:ind w:left="432" w:right="432" w:hanging="144"/>
+        <w:ind w:left="427" w:right="432" w:hanging="144"/>
       </w:pPr>
     </w:lvl>
     <w:lvl w:ilvl="1">
       <w:start w:val="1"/>
       <w:numFmt w:val="decimal"/>
-      <w:pStyle w:val="Heading2"/>
+      <w:pStyle w:val="2"/>
       <w:lvlText w:val="%1.%2"/>
       <w:lvlJc w:val="center"/>
       <w:pPr>
@@ -8727,7 +9277,7 @@
     <w:lvl w:ilvl="2">
       <w:start w:val="1"/>
       <w:numFmt w:val="decimal"/>
-      <w:pStyle w:val="Heading3"/>
+      <w:pStyle w:val="3"/>
       <w:lvlText w:val="%1.%2.%3"/>
       <w:lvlJc w:val="center"/>
       <w:pPr>
@@ -8740,7 +9290,7 @@
     <w:lvl w:ilvl="3">
       <w:start w:val="1"/>
       <w:numFmt w:val="decimal"/>
-      <w:pStyle w:val="Heading4"/>
+      <w:pStyle w:val="4"/>
       <w:lvlText w:val="%1.%2.%3.%4"/>
       <w:lvlJc w:val="center"/>
       <w:pPr>
@@ -8753,7 +9303,7 @@
     <w:lvl w:ilvl="4">
       <w:start w:val="1"/>
       <w:numFmt w:val="decimal"/>
-      <w:pStyle w:val="Heading5"/>
+      <w:pStyle w:val="5"/>
       <w:lvlText w:val="%1.%2.%3.%4.%5"/>
       <w:lvlJc w:val="center"/>
       <w:pPr>
@@ -8766,7 +9316,7 @@
     <w:lvl w:ilvl="5">
       <w:start w:val="1"/>
       <w:numFmt w:val="decimal"/>
-      <w:pStyle w:val="Heading6"/>
+      <w:pStyle w:val="6"/>
       <w:lvlText w:val="%1.%2.%3.%4.%5.%6"/>
       <w:lvlJc w:val="center"/>
       <w:pPr>
@@ -8779,7 +9329,7 @@
     <w:lvl w:ilvl="6">
       <w:start w:val="1"/>
       <w:numFmt w:val="decimal"/>
-      <w:pStyle w:val="Heading7"/>
+      <w:pStyle w:val="7"/>
       <w:lvlText w:val="%1.%2.%3.%4.%5.%6.%7"/>
       <w:lvlJc w:val="center"/>
       <w:pPr>
@@ -8792,7 +9342,7 @@
     <w:lvl w:ilvl="7">
       <w:start w:val="1"/>
       <w:numFmt w:val="decimal"/>
-      <w:pStyle w:val="Heading8"/>
+      <w:pStyle w:val="8"/>
       <w:lvlText w:val="%1.%2.%3.%4.%5.%6.%7.%8"/>
       <w:lvlJc w:val="center"/>
       <w:pPr>
@@ -8805,7 +9355,7 @@
     <w:lvl w:ilvl="8">
       <w:start w:val="1"/>
       <w:numFmt w:val="decimal"/>
-      <w:pStyle w:val="Heading9"/>
+      <w:pStyle w:val="9"/>
       <w:lvlText w:val="%1.%2.%3.%4.%5.%6.%7.%8.%9"/>
       <w:lvlJc w:val="center"/>
       <w:pPr>
@@ -8816,55 +9366,55 @@
       </w:pPr>
     </w:lvl>
   </w:abstractNum>
-  <w:num w:numId="1">
+  <w:num w:numId="1" w16cid:durableId="118838343">
     <w:abstractNumId w:val="7"/>
   </w:num>
-  <w:num w:numId="2">
+  <w:num w:numId="2" w16cid:durableId="1654488998">
     <w:abstractNumId w:val="8"/>
   </w:num>
-  <w:num w:numId="3">
+  <w:num w:numId="3" w16cid:durableId="777219415">
     <w:abstractNumId w:val="8"/>
   </w:num>
-  <w:num w:numId="4">
+  <w:num w:numId="4" w16cid:durableId="747461031">
     <w:abstractNumId w:val="8"/>
   </w:num>
-  <w:num w:numId="5">
+  <w:num w:numId="5" w16cid:durableId="1023363746">
     <w:abstractNumId w:val="8"/>
   </w:num>
-  <w:num w:numId="6">
+  <w:num w:numId="6" w16cid:durableId="1189291209">
     <w:abstractNumId w:val="8"/>
   </w:num>
-  <w:num w:numId="7">
+  <w:num w:numId="7" w16cid:durableId="1347903633">
     <w:abstractNumId w:val="8"/>
   </w:num>
-  <w:num w:numId="8">
+  <w:num w:numId="8" w16cid:durableId="2023975439">
     <w:abstractNumId w:val="8"/>
   </w:num>
-  <w:num w:numId="9">
+  <w:num w:numId="9" w16cid:durableId="178282399">
     <w:abstractNumId w:val="8"/>
   </w:num>
-  <w:num w:numId="10">
+  <w:num w:numId="10" w16cid:durableId="142085178">
     <w:abstractNumId w:val="8"/>
   </w:num>
-  <w:num w:numId="11">
+  <w:num w:numId="11" w16cid:durableId="1656447402">
     <w:abstractNumId w:val="1"/>
   </w:num>
-  <w:num w:numId="12">
+  <w:num w:numId="12" w16cid:durableId="105739299">
     <w:abstractNumId w:val="5"/>
   </w:num>
-  <w:num w:numId="13">
+  <w:num w:numId="13" w16cid:durableId="100150462">
     <w:abstractNumId w:val="6"/>
   </w:num>
-  <w:num w:numId="14">
+  <w:num w:numId="14" w16cid:durableId="644745915">
     <w:abstractNumId w:val="2"/>
     <w:lvlOverride w:ilvl="0">
       <w:startOverride w:val="1"/>
     </w:lvlOverride>
   </w:num>
-  <w:num w:numId="15">
+  <w:num w:numId="15" w16cid:durableId="1872187879">
     <w:abstractNumId w:val="3"/>
   </w:num>
-  <w:num w:numId="16">
+  <w:num w:numId="16" w16cid:durableId="1773436307">
     <w:abstractNumId w:val="0"/>
     <w:lvlOverride w:ilvl="0">
       <w:lvl w:ilvl="0">
@@ -8883,7 +9433,7 @@
       </w:lvl>
     </w:lvlOverride>
   </w:num>
-  <w:num w:numId="17">
+  <w:num w:numId="17" w16cid:durableId="1929579619">
     <w:abstractNumId w:val="0"/>
     <w:lvlOverride w:ilvl="0">
       <w:lvl w:ilvl="0">
@@ -8901,10 +9451,10 @@
       </w:lvl>
     </w:lvlOverride>
   </w:num>
-  <w:num w:numId="18">
+  <w:num w:numId="18" w16cid:durableId="1164511203">
     <w:abstractNumId w:val="4"/>
   </w:num>
-  <w:num w:numId="19">
+  <w:num w:numId="19" w16cid:durableId="1103037559">
     <w:abstractNumId w:val="8"/>
     <w:lvlOverride w:ilvl="0">
       <w:startOverride w:val="1"/>
@@ -8934,10 +9484,10 @@
       <w:startOverride w:val="1"/>
     </w:lvlOverride>
   </w:num>
-  <w:num w:numId="20">
+  <w:num w:numId="20" w16cid:durableId="515651804">
     <w:abstractNumId w:val="8"/>
   </w:num>
-  <w:num w:numId="21">
+  <w:num w:numId="21" w16cid:durableId="1329362344">
     <w:abstractNumId w:val="8"/>
     <w:lvlOverride w:ilvl="0">
       <w:startOverride w:val="1"/>
@@ -8967,10 +9517,10 @@
       <w:startOverride w:val="1"/>
     </w:lvlOverride>
   </w:num>
-  <w:num w:numId="22">
+  <w:num w:numId="22" w16cid:durableId="982810061">
     <w:abstractNumId w:val="8"/>
   </w:num>
-  <w:num w:numId="23">
+  <w:num w:numId="23" w16cid:durableId="164907394">
     <w:abstractNumId w:val="8"/>
     <w:lvlOverride w:ilvl="0">
       <w:startOverride w:val="1"/>
@@ -9000,16 +9550,16 @@
       <w:startOverride w:val="1"/>
     </w:lvlOverride>
   </w:num>
-  <w:num w:numId="24">
+  <w:num w:numId="24" w16cid:durableId="339938019">
     <w:abstractNumId w:val="8"/>
   </w:num>
-  <w:num w:numId="25">
+  <w:num w:numId="25" w16cid:durableId="24986407">
     <w:abstractNumId w:val="8"/>
   </w:num>
-  <w:num w:numId="26">
+  <w:num w:numId="26" w16cid:durableId="56057887">
     <w:abstractNumId w:val="8"/>
   </w:num>
-  <w:num w:numId="27">
+  <w:num w:numId="27" w16cid:durableId="1599287754">
     <w:abstractNumId w:val="8"/>
     <w:lvlOverride w:ilvl="0">
       <w:startOverride w:val="1"/>
@@ -9039,44 +9589,44 @@
       <w:startOverride w:val="1"/>
     </w:lvlOverride>
   </w:num>
-  <w:num w:numId="28">
+  <w:num w:numId="28" w16cid:durableId="629014787">
     <w:abstractNumId w:val="8"/>
   </w:num>
-  <w:num w:numId="29">
+  <w:num w:numId="29" w16cid:durableId="1040011373">
     <w:abstractNumId w:val="8"/>
   </w:num>
-  <w:num w:numId="30">
+  <w:num w:numId="30" w16cid:durableId="1572153430">
     <w:abstractNumId w:val="8"/>
   </w:num>
-  <w:num w:numId="31">
+  <w:num w:numId="31" w16cid:durableId="530993875">
     <w:abstractNumId w:val="8"/>
   </w:num>
-  <w:num w:numId="32">
+  <w:num w:numId="32" w16cid:durableId="1003750814">
     <w:abstractNumId w:val="8"/>
   </w:num>
-  <w:num w:numId="33">
+  <w:num w:numId="33" w16cid:durableId="763696090">
     <w:abstractNumId w:val="8"/>
   </w:num>
-  <w:num w:numId="34">
+  <w:num w:numId="34" w16cid:durableId="545261985">
     <w:abstractNumId w:val="8"/>
   </w:num>
-  <w:num w:numId="35">
+  <w:num w:numId="35" w16cid:durableId="520123102">
     <w:abstractNumId w:val="8"/>
   </w:num>
-  <w:num w:numId="36">
+  <w:num w:numId="36" w16cid:durableId="1233464664">
     <w:abstractNumId w:val="8"/>
   </w:num>
-  <w:num w:numId="37">
+  <w:num w:numId="37" w16cid:durableId="150875978">
     <w:abstractNumId w:val="8"/>
   </w:num>
-  <w:num w:numId="38">
+  <w:num w:numId="38" w16cid:durableId="1179736846">
     <w:abstractNumId w:val="8"/>
   </w:num>
 </w:numbering>
 </file>
 
 <file path=word/styles.xml><?xml version="1.0" encoding="utf-8"?>
-<w:styles xmlns:mc="http://schemas.openxmlformats.org/markup-compatibility/2006" xmlns:r="http://schemas.openxmlformats.org/officeDocument/2006/relationships" xmlns:w="http://schemas.openxmlformats.org/wordprocessingml/2006/main" xmlns:w14="http://schemas.microsoft.com/office/word/2010/wordml" xmlns:w15="http://schemas.microsoft.com/office/word/2012/wordml" xmlns:w16cex="http://schemas.microsoft.com/office/word/2018/wordml/cex" xmlns:w16cid="http://schemas.microsoft.com/office/word/2016/wordml/cid" xmlns:w16="http://schemas.microsoft.com/office/word/2018/wordml" xmlns:w16sdtdh="http://schemas.microsoft.com/office/word/2020/wordml/sdtdatahash" xmlns:w16se="http://schemas.microsoft.com/office/word/2015/wordml/symex" mc:Ignorable="w14 w15 w16se w16cid w16 w16cex w16sdtdh">
+<w:styles xmlns:mc="http://schemas.openxmlformats.org/markup-compatibility/2006" xmlns:r="http://schemas.openxmlformats.org/officeDocument/2006/relationships" xmlns:w="http://schemas.openxmlformats.org/wordprocessingml/2006/main" xmlns:w14="http://schemas.microsoft.com/office/word/2010/wordml" xmlns:w15="http://schemas.microsoft.com/office/word/2012/wordml" xmlns:w16cex="http://schemas.microsoft.com/office/word/2018/wordml/cex" xmlns:w16cid="http://schemas.microsoft.com/office/word/2016/wordml/cid" xmlns:w16="http://schemas.microsoft.com/office/word/2018/wordml" xmlns:w16du="http://schemas.microsoft.com/office/word/2023/wordml/word16du" xmlns:w16sdtdh="http://schemas.microsoft.com/office/word/2020/wordml/sdtdatahash" xmlns:w16sdtfl="http://schemas.microsoft.com/office/word/2024/wordml/sdtformatlock" xmlns:w16se="http://schemas.microsoft.com/office/word/2015/wordml/symex" mc:Ignorable="w14 w15 w16se w16cid w16 w16cex w16sdtdh w16sdtfl w16du">
   <w:docDefaults>
     <w:rPrDefault>
       <w:rPr>
@@ -9464,7 +10014,7 @@
     <w:lsdException w:name="Unresolved Mention" w:semiHidden="1" w:unhideWhenUsed="1"/>
     <w:lsdException w:name="Smart Link" w:semiHidden="1" w:unhideWhenUsed="1"/>
   </w:latentStyles>
-  <w:style w:type="paragraph" w:default="1" w:styleId="Normal">
+  <w:style w:type="paragraph" w:default="1" w:styleId="a">
     <w:name w:val="Normal"/>
     <w:qFormat/>
     <w:pPr>
@@ -9477,9 +10027,10 @@
       <w:lang w:bidi="ar-SA"/>
     </w:rPr>
   </w:style>
-  <w:style w:type="paragraph" w:styleId="Heading1">
+  <w:style w:type="paragraph" w:styleId="1">
     <w:name w:val="heading 1"/>
-    <w:next w:val="Normal"/>
+    <w:next w:val="a"/>
+    <w:link w:val="10"/>
     <w:qFormat/>
     <w:pPr>
       <w:numPr>
@@ -9498,10 +10049,10 @@
       <w:lang w:bidi="ar-SA"/>
     </w:rPr>
   </w:style>
-  <w:style w:type="paragraph" w:styleId="Heading2">
+  <w:style w:type="paragraph" w:styleId="2">
     <w:name w:val="heading 2"/>
-    <w:basedOn w:val="Heading1"/>
-    <w:next w:val="Normal"/>
+    <w:basedOn w:val="1"/>
+    <w:next w:val="a"/>
     <w:qFormat/>
     <w:pPr>
       <w:keepNext/>
@@ -9518,10 +10069,11 @@
       <w:szCs w:val="32"/>
     </w:rPr>
   </w:style>
-  <w:style w:type="paragraph" w:styleId="Heading3">
+  <w:style w:type="paragraph" w:styleId="3">
     <w:name w:val="heading 3"/>
-    <w:basedOn w:val="Heading2"/>
-    <w:next w:val="Normal"/>
+    <w:basedOn w:val="2"/>
+    <w:next w:val="a"/>
+    <w:link w:val="30"/>
     <w:qFormat/>
     <w:pPr>
       <w:numPr>
@@ -9535,10 +10087,10 @@
       <w:szCs w:val="28"/>
     </w:rPr>
   </w:style>
-  <w:style w:type="paragraph" w:styleId="Heading4">
+  <w:style w:type="paragraph" w:styleId="4">
     <w:name w:val="heading 4"/>
-    <w:basedOn w:val="Heading3"/>
-    <w:next w:val="Normal"/>
+    <w:basedOn w:val="3"/>
+    <w:next w:val="a"/>
     <w:qFormat/>
     <w:pPr>
       <w:numPr>
@@ -9554,10 +10106,10 @@
       <w:szCs w:val="24"/>
     </w:rPr>
   </w:style>
-  <w:style w:type="paragraph" w:styleId="Heading5">
+  <w:style w:type="paragraph" w:styleId="5">
     <w:name w:val="heading 5"/>
-    <w:basedOn w:val="Heading4"/>
-    <w:next w:val="Normal"/>
+    <w:basedOn w:val="4"/>
+    <w:next w:val="a"/>
     <w:qFormat/>
     <w:pPr>
       <w:numPr>
@@ -9571,10 +10123,10 @@
       <w:bCs w:val="0"/>
     </w:rPr>
   </w:style>
-  <w:style w:type="paragraph" w:styleId="Heading6">
+  <w:style w:type="paragraph" w:styleId="6">
     <w:name w:val="heading 6"/>
-    <w:basedOn w:val="Normal"/>
-    <w:next w:val="Normal"/>
+    <w:basedOn w:val="a"/>
+    <w:next w:val="a"/>
     <w:qFormat/>
     <w:pPr>
       <w:numPr>
@@ -9588,10 +10140,10 @@
       <w:u w:val="single"/>
     </w:rPr>
   </w:style>
-  <w:style w:type="paragraph" w:styleId="Heading7">
+  <w:style w:type="paragraph" w:styleId="7">
     <w:name w:val="heading 7"/>
-    <w:basedOn w:val="Normal"/>
-    <w:next w:val="Normal"/>
+    <w:basedOn w:val="a"/>
+    <w:next w:val="a"/>
     <w:qFormat/>
     <w:pPr>
       <w:numPr>
@@ -9606,10 +10158,10 @@
       <w:i/>
     </w:rPr>
   </w:style>
-  <w:style w:type="paragraph" w:styleId="Heading8">
+  <w:style w:type="paragraph" w:styleId="8">
     <w:name w:val="heading 8"/>
-    <w:basedOn w:val="Normal"/>
-    <w:next w:val="Normal"/>
+    <w:basedOn w:val="a"/>
+    <w:next w:val="a"/>
     <w:qFormat/>
     <w:pPr>
       <w:numPr>
@@ -9624,10 +10176,10 @@
       <w:i/>
     </w:rPr>
   </w:style>
-  <w:style w:type="paragraph" w:styleId="Heading9">
+  <w:style w:type="paragraph" w:styleId="9">
     <w:name w:val="heading 9"/>
-    <w:basedOn w:val="Normal"/>
-    <w:next w:val="Normal"/>
+    <w:basedOn w:val="a"/>
+    <w:next w:val="a"/>
     <w:qFormat/>
     <w:pPr>
       <w:numPr>
@@ -9642,13 +10194,12 @@
       <w:i/>
     </w:rPr>
   </w:style>
-  <w:style w:type="character" w:default="1" w:styleId="DefaultParagraphFont">
+  <w:style w:type="character" w:default="1" w:styleId="a0">
     <w:name w:val="Default Paragraph Font"/>
     <w:uiPriority w:val="1"/>
-    <w:semiHidden/>
     <w:unhideWhenUsed/>
   </w:style>
-  <w:style w:type="table" w:default="1" w:styleId="TableNormal">
+  <w:style w:type="table" w:default="1" w:styleId="a1">
     <w:name w:val="Normal Table"/>
     <w:uiPriority w:val="99"/>
     <w:semiHidden/>
@@ -9663,7 +10214,7 @@
       </w:tblCellMar>
     </w:tblPr>
   </w:style>
-  <w:style w:type="numbering" w:default="1" w:styleId="NoList">
+  <w:style w:type="numbering" w:default="1" w:styleId="a2">
     <w:name w:val="No List"/>
     <w:uiPriority w:val="99"/>
     <w:semiHidden/>
@@ -9671,8 +10222,8 @@
   </w:style>
   <w:style w:type="paragraph" w:customStyle="1" w:styleId="0">
     <w:name w:val="0"/>
-    <w:basedOn w:val="Normal"/>
-    <w:next w:val="Normal"/>
+    <w:basedOn w:val="a"/>
+    <w:next w:val="a"/>
     <w:pPr>
       <w:jc w:val="both"/>
     </w:pPr>
@@ -9682,7 +10233,7 @@
   </w:style>
   <w:style w:type="paragraph" w:customStyle="1" w:styleId="bullet">
     <w:name w:val="bullet"/>
-    <w:basedOn w:val="Normal"/>
+    <w:basedOn w:val="a"/>
     <w:pPr>
       <w:numPr>
         <w:numId w:val="1"/>
@@ -9696,7 +10247,7 @@
   </w:style>
   <w:style w:type="paragraph" w:customStyle="1" w:styleId="Bullet2">
     <w:name w:val="Bullet2"/>
-    <w:basedOn w:val="Normal"/>
+    <w:basedOn w:val="a"/>
     <w:pPr>
       <w:spacing w:before="100"/>
       <w:ind w:left="2694" w:hanging="425"/>
@@ -9706,10 +10257,10 @@
       <w:noProof/>
     </w:rPr>
   </w:style>
-  <w:style w:type="paragraph" w:styleId="Caption">
+  <w:style w:type="paragraph" w:styleId="a3">
     <w:name w:val="caption"/>
-    <w:basedOn w:val="Normal"/>
-    <w:next w:val="Normal"/>
+    <w:basedOn w:val="a"/>
+    <w:next w:val="a"/>
     <w:qFormat/>
     <w:pPr>
       <w:spacing w:before="120" w:after="120"/>
@@ -9723,8 +10274,8 @@
   </w:style>
   <w:style w:type="paragraph" w:customStyle="1" w:styleId="Note">
     <w:name w:val="Note"/>
-    <w:basedOn w:val="Normal"/>
-    <w:next w:val="Normal"/>
+    <w:basedOn w:val="a"/>
+    <w:next w:val="a"/>
     <w:pPr>
       <w:keepNext/>
       <w:keepLines/>
@@ -9743,12 +10294,12 @@
   <w:style w:type="paragraph" w:customStyle="1" w:styleId="caution">
     <w:name w:val="caution"/>
     <w:basedOn w:val="Note"/>
-    <w:next w:val="Normal"/>
+    <w:next w:val="a"/>
   </w:style>
   <w:style w:type="paragraph" w:customStyle="1" w:styleId="NoteText">
     <w:name w:val="Note Text"/>
-    <w:basedOn w:val="Normal"/>
-    <w:next w:val="Normal"/>
+    <w:basedOn w:val="a"/>
+    <w:next w:val="a"/>
     <w:pPr>
       <w:keepLines/>
       <w:pBdr>
@@ -9780,8 +10331,8 @@
   </w:style>
   <w:style w:type="paragraph" w:customStyle="1" w:styleId="FigureCaption">
     <w:name w:val="Figure Caption"/>
-    <w:basedOn w:val="Normal"/>
-    <w:next w:val="Normal"/>
+    <w:basedOn w:val="a"/>
+    <w:next w:val="a"/>
     <w:pPr>
       <w:tabs>
         <w:tab w:val="left" w:pos="1021"/>
@@ -9798,8 +10349,8 @@
   <w:style w:type="paragraph" w:customStyle="1" w:styleId="FigureSpace">
     <w:name w:val="Figure Space"/>
     <w:aliases w:val="fs"/>
-    <w:basedOn w:val="Normal"/>
-    <w:next w:val="Normal"/>
+    <w:basedOn w:val="a"/>
+    <w:next w:val="a"/>
     <w:pPr>
       <w:keepNext/>
     </w:pPr>
@@ -9809,9 +10360,9 @@
       <w:sz w:val="22"/>
     </w:rPr>
   </w:style>
-  <w:style w:type="paragraph" w:styleId="Footer">
+  <w:style w:type="paragraph" w:styleId="a4">
     <w:name w:val="footer"/>
-    <w:link w:val="FooterChar"/>
+    <w:link w:val="a5"/>
     <w:uiPriority w:val="99"/>
     <w:pPr>
       <w:pBdr>
@@ -9824,9 +10375,9 @@
       <w:lang w:bidi="ar-SA"/>
     </w:rPr>
   </w:style>
-  <w:style w:type="paragraph" w:styleId="Header">
+  <w:style w:type="paragraph" w:styleId="a6">
     <w:name w:val="header"/>
-    <w:link w:val="HeaderChar"/>
+    <w:link w:val="a7"/>
     <w:uiPriority w:val="99"/>
     <w:pPr>
       <w:pBdr>
@@ -9855,27 +10406,27 @@
       <w:lang w:bidi="ar-SA"/>
     </w:rPr>
   </w:style>
-  <w:style w:type="paragraph" w:styleId="List">
+  <w:style w:type="paragraph" w:styleId="a8">
     <w:name w:val="List"/>
-    <w:basedOn w:val="Normal"/>
+    <w:basedOn w:val="a"/>
     <w:semiHidden/>
     <w:pPr>
       <w:ind w:left="360" w:hanging="360"/>
       <w:jc w:val="both"/>
     </w:pPr>
   </w:style>
-  <w:style w:type="paragraph" w:styleId="List2">
+  <w:style w:type="paragraph" w:styleId="20">
     <w:name w:val="List 2"/>
-    <w:basedOn w:val="Normal"/>
+    <w:basedOn w:val="a"/>
     <w:semiHidden/>
     <w:pPr>
       <w:ind w:left="720" w:hanging="360"/>
       <w:jc w:val="both"/>
     </w:pPr>
   </w:style>
-  <w:style w:type="paragraph" w:styleId="List3">
+  <w:style w:type="paragraph" w:styleId="31">
     <w:name w:val="List 3"/>
-    <w:basedOn w:val="Normal"/>
+    <w:basedOn w:val="a"/>
     <w:semiHidden/>
     <w:pPr>
       <w:jc w:val="both"/>
@@ -9883,7 +10434,7 @@
   </w:style>
   <w:style w:type="paragraph" w:customStyle="1" w:styleId="Lista">
     <w:name w:val="List a"/>
-    <w:basedOn w:val="Normal"/>
+    <w:basedOn w:val="a"/>
     <w:autoRedefine/>
     <w:pPr>
       <w:numPr>
@@ -9894,36 +10445,36 @@
   </w:style>
   <w:style w:type="paragraph" w:customStyle="1" w:styleId="list1">
     <w:name w:val="list1"/>
-    <w:basedOn w:val="Normal"/>
+    <w:basedOn w:val="a"/>
     <w:pPr>
       <w:ind w:left="1134" w:hanging="425"/>
     </w:pPr>
   </w:style>
-  <w:style w:type="paragraph" w:customStyle="1" w:styleId="list20">
+  <w:style w:type="paragraph" w:customStyle="1" w:styleId="list2">
     <w:name w:val="list2"/>
-    <w:basedOn w:val="List2"/>
+    <w:basedOn w:val="20"/>
     <w:pPr>
       <w:ind w:left="1701" w:hanging="567"/>
       <w:jc w:val="left"/>
     </w:pPr>
   </w:style>
-  <w:style w:type="paragraph" w:customStyle="1" w:styleId="list30">
+  <w:style w:type="paragraph" w:customStyle="1" w:styleId="list3">
     <w:name w:val="list3"/>
-    <w:basedOn w:val="list20"/>
+    <w:basedOn w:val="list2"/>
     <w:pPr>
       <w:ind w:left="2552" w:hanging="851"/>
     </w:pPr>
   </w:style>
   <w:style w:type="paragraph" w:customStyle="1" w:styleId="list4">
     <w:name w:val="list4"/>
-    <w:basedOn w:val="list30"/>
+    <w:basedOn w:val="list3"/>
     <w:pPr>
       <w:ind w:left="3402" w:hanging="850"/>
     </w:pPr>
   </w:style>
   <w:style w:type="paragraph" w:customStyle="1" w:styleId="multilevelList">
     <w:name w:val="multi level List"/>
-    <w:basedOn w:val="Normal"/>
+    <w:basedOn w:val="a"/>
     <w:pPr>
       <w:numPr>
         <w:numId w:val="12"/>
@@ -9934,8 +10485,8 @@
   </w:style>
   <w:style w:type="paragraph" w:customStyle="1" w:styleId="offsetheader">
     <w:name w:val="offsetheader"/>
-    <w:basedOn w:val="Normal"/>
-    <w:next w:val="Normal"/>
+    <w:basedOn w:val="a"/>
+    <w:next w:val="a"/>
     <w:pPr>
       <w:pBdr>
         <w:top w:val="single" w:sz="6" w:space="1" w:color="auto"/>
@@ -9951,14 +10502,14 @@
       <w:sz w:val="40"/>
     </w:rPr>
   </w:style>
-  <w:style w:type="character" w:styleId="PageNumber">
+  <w:style w:type="character" w:styleId="a9">
     <w:name w:val="page number"/>
-    <w:basedOn w:val="DefaultParagraphFont"/>
+    <w:basedOn w:val="a0"/>
     <w:semiHidden/>
   </w:style>
   <w:style w:type="paragraph" w:customStyle="1" w:styleId="picture">
     <w:name w:val="picture"/>
-    <w:basedOn w:val="Normal"/>
+    <w:basedOn w:val="a"/>
     <w:pPr>
       <w:keepNext/>
       <w:spacing w:before="240" w:after="120"/>
@@ -9967,7 +10518,7 @@
   </w:style>
   <w:style w:type="paragraph" w:customStyle="1" w:styleId="smoffsetheader">
     <w:name w:val="smoffsetheader"/>
-    <w:basedOn w:val="Normal"/>
+    <w:basedOn w:val="a"/>
     <w:pPr>
       <w:spacing w:after="120" w:line="240" w:lineRule="atLeast"/>
       <w:ind w:left="-425"/>
@@ -9990,8 +10541,8 @@
   </w:style>
   <w:style w:type="paragraph" w:customStyle="1" w:styleId="Warning">
     <w:name w:val="Warning"/>
-    <w:basedOn w:val="Normal"/>
-    <w:next w:val="Normal"/>
+    <w:basedOn w:val="a"/>
+    <w:next w:val="a"/>
     <w:pPr>
       <w:pBdr>
         <w:left w:val="single" w:sz="18" w:space="4" w:color="000000"/>
@@ -10007,8 +10558,8 @@
   </w:style>
   <w:style w:type="paragraph" w:customStyle="1" w:styleId="WarningText">
     <w:name w:val="WarningText"/>
-    <w:basedOn w:val="Normal"/>
-    <w:next w:val="Normal"/>
+    <w:basedOn w:val="a"/>
+    <w:next w:val="a"/>
     <w:pPr>
       <w:keepLines/>
       <w:pBdr>
@@ -10022,14 +10573,14 @@
       <w:spacing w:val="-5"/>
     </w:rPr>
   </w:style>
-  <w:style w:type="paragraph" w:styleId="BodyTextIndent">
+  <w:style w:type="paragraph" w:styleId="aa">
     <w:name w:val="Body Text Indent"/>
-    <w:basedOn w:val="Normal"/>
+    <w:basedOn w:val="a"/>
     <w:semiHidden/>
   </w:style>
   <w:style w:type="paragraph" w:customStyle="1" w:styleId="List-Bulleted">
     <w:name w:val="List - Bulleted"/>
-    <w:basedOn w:val="Normal"/>
+    <w:basedOn w:val="a"/>
     <w:pPr>
       <w:overflowPunct w:val="0"/>
       <w:autoSpaceDE w:val="0"/>
@@ -10048,7 +10599,7 @@
   </w:style>
   <w:style w:type="paragraph" w:customStyle="1" w:styleId="Comment">
     <w:name w:val="Comment"/>
-    <w:basedOn w:val="Normal"/>
+    <w:basedOn w:val="a"/>
     <w:pPr>
       <w:spacing w:before="0" w:after="120"/>
       <w:ind w:left="0"/>
@@ -10063,10 +10614,10 @@
       <w:lang w:eastAsia="he-IL" w:bidi="he-IL"/>
     </w:rPr>
   </w:style>
-  <w:style w:type="paragraph" w:styleId="BodyText">
+  <w:style w:type="paragraph" w:styleId="ab">
     <w:name w:val="Body Text"/>
-    <w:basedOn w:val="Normal"/>
-    <w:link w:val="BodyTextChar"/>
+    <w:basedOn w:val="a"/>
+    <w:link w:val="ac"/>
     <w:uiPriority w:val="99"/>
     <w:semiHidden/>
     <w:unhideWhenUsed/>
@@ -10075,9 +10626,9 @@
       <w:spacing w:after="120"/>
     </w:pPr>
   </w:style>
-  <w:style w:type="character" w:customStyle="1" w:styleId="BodyTextChar">
-    <w:name w:val="Body Text Char"/>
-    <w:link w:val="BodyText"/>
+  <w:style w:type="character" w:customStyle="1" w:styleId="ac">
+    <w:name w:val="גוף טקסט תו"/>
+    <w:link w:val="ab"/>
     <w:uiPriority w:val="99"/>
     <w:semiHidden/>
     <w:rsid w:val="003F5A91"/>
@@ -10087,10 +10638,10 @@
       <w:lang w:bidi="ar-SA"/>
     </w:rPr>
   </w:style>
-  <w:style w:type="paragraph" w:styleId="TOCHeading">
+  <w:style w:type="paragraph" w:styleId="ad">
     <w:name w:val="TOC Heading"/>
-    <w:basedOn w:val="Heading1"/>
-    <w:next w:val="Normal"/>
+    <w:basedOn w:val="1"/>
+    <w:next w:val="a"/>
     <w:uiPriority w:val="39"/>
     <w:unhideWhenUsed/>
     <w:qFormat/>
@@ -10121,8 +10672,8 @@
   </w:style>
   <w:style w:type="paragraph" w:styleId="TOC2">
     <w:name w:val="toc 2"/>
-    <w:basedOn w:val="Normal"/>
-    <w:next w:val="Normal"/>
+    <w:basedOn w:val="a"/>
+    <w:next w:val="a"/>
     <w:autoRedefine/>
     <w:uiPriority w:val="39"/>
     <w:unhideWhenUsed/>
@@ -10133,8 +10684,8 @@
   </w:style>
   <w:style w:type="paragraph" w:styleId="TOC3">
     <w:name w:val="toc 3"/>
-    <w:basedOn w:val="Normal"/>
-    <w:next w:val="Normal"/>
+    <w:basedOn w:val="a"/>
+    <w:next w:val="a"/>
     <w:autoRedefine/>
     <w:uiPriority w:val="39"/>
     <w:unhideWhenUsed/>
@@ -10145,8 +10696,8 @@
   </w:style>
   <w:style w:type="paragraph" w:styleId="TOC1">
     <w:name w:val="toc 1"/>
-    <w:basedOn w:val="Normal"/>
-    <w:next w:val="Normal"/>
+    <w:basedOn w:val="a"/>
+    <w:next w:val="a"/>
     <w:autoRedefine/>
     <w:uiPriority w:val="39"/>
     <w:unhideWhenUsed/>
@@ -10165,9 +10716,9 @@
       <w:u w:val="single"/>
     </w:rPr>
   </w:style>
-  <w:style w:type="character" w:customStyle="1" w:styleId="HeaderChar">
-    <w:name w:val="Header Char"/>
-    <w:link w:val="Header"/>
+  <w:style w:type="character" w:customStyle="1" w:styleId="a7">
+    <w:name w:val="כותרת עליונה תו"/>
+    <w:link w:val="a6"/>
     <w:uiPriority w:val="99"/>
     <w:rsid w:val="00806EC8"/>
     <w:rPr>
@@ -10176,9 +10727,9 @@
       <w:lang w:val="en-US" w:eastAsia="en-US" w:bidi="ar-SA"/>
     </w:rPr>
   </w:style>
-  <w:style w:type="character" w:customStyle="1" w:styleId="FooterChar">
-    <w:name w:val="Footer Char"/>
-    <w:link w:val="Footer"/>
+  <w:style w:type="character" w:customStyle="1" w:styleId="a5">
+    <w:name w:val="כותרת תחתונה תו"/>
+    <w:link w:val="a4"/>
     <w:uiPriority w:val="99"/>
     <w:rsid w:val="00AD5286"/>
     <w:rPr>
@@ -10187,9 +10738,9 @@
       <w:lang w:val="en-US" w:eastAsia="en-US" w:bidi="ar-SA"/>
     </w:rPr>
   </w:style>
-  <w:style w:type="table" w:styleId="TableGrid">
+  <w:style w:type="table" w:styleId="ae">
     <w:name w:val="Table Grid"/>
-    <w:basedOn w:val="TableNormal"/>
+    <w:basedOn w:val="a1"/>
     <w:uiPriority w:val="59"/>
     <w:rsid w:val="009C496C"/>
     <w:tblPr>
@@ -10203,7 +10754,7 @@
       </w:tblBorders>
     </w:tblPr>
   </w:style>
-  <w:style w:type="character" w:styleId="UnresolvedMention">
+  <w:style w:type="character" w:styleId="af">
     <w:name w:val="Unresolved Mention"/>
     <w:uiPriority w:val="99"/>
     <w:semiHidden/>
@@ -10212,6 +10763,35 @@
     <w:rPr>
       <w:color w:val="605E5C"/>
       <w:shd w:val="clear" w:color="auto" w:fill="E1DFDD"/>
+    </w:rPr>
+  </w:style>
+  <w:style w:type="character" w:customStyle="1" w:styleId="10">
+    <w:name w:val="כותרת 1 תו"/>
+    <w:basedOn w:val="a0"/>
+    <w:link w:val="1"/>
+    <w:rsid w:val="00712B28"/>
+    <w:rPr>
+      <w:rFonts w:ascii="Arial" w:hAnsi="Arial" w:cs="Arial"/>
+      <w:b/>
+      <w:bCs/>
+      <w:smallCaps/>
+      <w:sz w:val="36"/>
+      <w:szCs w:val="36"/>
+      <w:lang w:bidi="ar-SA"/>
+    </w:rPr>
+  </w:style>
+  <w:style w:type="character" w:customStyle="1" w:styleId="30">
+    <w:name w:val="כותרת 3 תו"/>
+    <w:basedOn w:val="a0"/>
+    <w:link w:val="3"/>
+    <w:rsid w:val="00712B28"/>
+    <w:rPr>
+      <w:rFonts w:ascii="Arial" w:hAnsi="Arial" w:cs="Arial"/>
+      <w:b/>
+      <w:bCs/>
+      <w:sz w:val="28"/>
+      <w:szCs w:val="28"/>
+      <w:lang w:bidi="ar-SA"/>
     </w:rPr>
   </w:style>
 </w:styles>
@@ -10513,6 +11093,10 @@
 </file>
 
 <file path=customXml/item1.xml><?xml version="1.0" encoding="utf-8"?>
+<b:Sources xmlns:b="http://schemas.openxmlformats.org/officeDocument/2006/bibliography" xmlns="http://schemas.openxmlformats.org/officeDocument/2006/bibliography" SelectedStyle="\APASixthEditionOfficeOnline.xsl" StyleName="APA" Version="6"/>
+</file>
+
+<file path=customXml/item2.xml><?xml version="1.0" encoding="utf-8"?>
 <?mso-contentType ?>
 <FormTemplates xmlns="http://schemas.microsoft.com/sharepoint/v3/contenttype/forms">
   <Display>DocumentLibraryForm</Display>
@@ -10521,11 +11105,18 @@
 </FormTemplates>
 </file>
 
-<file path=customXml/item2.xml><?xml version="1.0" encoding="utf-8"?>
-<b:Sources xmlns:b="http://schemas.openxmlformats.org/officeDocument/2006/bibliography" xmlns="http://schemas.openxmlformats.org/officeDocument/2006/bibliography" SelectedStyle="\APASixthEditionOfficeOnline.xsl" StyleName="APA" Version="6"/>
+<file path=customXml/item3.xml><?xml version="1.0" encoding="utf-8"?>
+<p:properties xmlns:p="http://schemas.microsoft.com/office/2006/metadata/properties" xmlns:xsi="http://www.w3.org/2001/XMLSchema-instance" xmlns:pc="http://schemas.microsoft.com/office/infopath/2007/PartnerControls">
+  <documentManagement>
+    <lcf76f155ced4ddcb4097134ff3c332f xmlns="c0c9f81d-ef68-4e5d-9bcf-b103681cbac3">
+      <Terms xmlns="http://schemas.microsoft.com/office/infopath/2007/PartnerControls"/>
+    </lcf76f155ced4ddcb4097134ff3c332f>
+    <TaxCatchAll xmlns="f3a57e1c-1999-4156-b16e-d47b3124d557"/>
+  </documentManagement>
+</p:properties>
 </file>
 
-<file path=customXml/item3.xml><?xml version="1.0" encoding="utf-8"?>
+<file path=customXml/item4.xml><?xml version="1.0" encoding="utf-8"?>
 <ct:contentTypeSchema xmlns:ct="http://schemas.microsoft.com/office/2006/metadata/contentType" xmlns:ma="http://schemas.microsoft.com/office/2006/metadata/properties/metaAttributes" ct:_="" ma:_="" ma:contentTypeName="Document" ma:contentTypeID="0x0101000F67C5EAA0AAF94CAE02941BB00115D2" ma:contentTypeVersion="11" ma:contentTypeDescription="Create a new document." ma:contentTypeScope="" ma:versionID="7d5288bfced83754c62cf03f69334249">
   <xsd:schema xmlns:xsd="http://www.w3.org/2001/XMLSchema" xmlns:xs="http://www.w3.org/2001/XMLSchema" xmlns:p="http://schemas.microsoft.com/office/2006/metadata/properties" xmlns:ns2="c0c9f81d-ef68-4e5d-9bcf-b103681cbac3" xmlns:ns3="f3a57e1c-1999-4156-b16e-d47b3124d557" targetNamespace="http://schemas.microsoft.com/office/2006/metadata/properties" ma:root="true" ma:fieldsID="72cd722ef412a107c24fb233e63ad134" ns2:_="" ns3:_="">
     <xsd:import namespace="c0c9f81d-ef68-4e5d-9bcf-b103681cbac3"/>
@@ -10720,18 +11311,15 @@
 </ct:contentTypeSchema>
 </file>
 
-<file path=customXml/item4.xml><?xml version="1.0" encoding="utf-8"?>
-<p:properties xmlns:p="http://schemas.microsoft.com/office/2006/metadata/properties" xmlns:xsi="http://www.w3.org/2001/XMLSchema-instance" xmlns:pc="http://schemas.microsoft.com/office/infopath/2007/PartnerControls">
-  <documentManagement>
-    <lcf76f155ced4ddcb4097134ff3c332f xmlns="c0c9f81d-ef68-4e5d-9bcf-b103681cbac3">
-      <Terms xmlns="http://schemas.microsoft.com/office/infopath/2007/PartnerControls"/>
-    </lcf76f155ced4ddcb4097134ff3c332f>
-    <TaxCatchAll xmlns="f3a57e1c-1999-4156-b16e-d47b3124d557"/>
-  </documentManagement>
-</p:properties>
+<file path=customXml/itemProps1.xml><?xml version="1.0" encoding="utf-8"?>
+<ds:datastoreItem xmlns:ds="http://schemas.openxmlformats.org/officeDocument/2006/customXml" ds:itemID="{DAA25833-E489-41C8-8273-093C8BA8E8D8}">
+  <ds:schemaRefs>
+    <ds:schemaRef ds:uri="http://schemas.openxmlformats.org/officeDocument/2006/bibliography"/>
+  </ds:schemaRefs>
+</ds:datastoreItem>
 </file>
 
-<file path=customXml/itemProps1.xml><?xml version="1.0" encoding="utf-8"?>
+<file path=customXml/itemProps2.xml><?xml version="1.0" encoding="utf-8"?>
 <ds:datastoreItem xmlns:ds="http://schemas.openxmlformats.org/officeDocument/2006/customXml" ds:itemID="{CA5A7125-3DEA-4410-946E-E5090818D057}">
   <ds:schemaRefs>
     <ds:schemaRef ds:uri="http://schemas.microsoft.com/sharepoint/v3/contenttype/forms"/>
@@ -10739,15 +11327,18 @@
 </ds:datastoreItem>
 </file>
 
-<file path=customXml/itemProps2.xml><?xml version="1.0" encoding="utf-8"?>
-<ds:datastoreItem xmlns:ds="http://schemas.openxmlformats.org/officeDocument/2006/customXml" ds:itemID="{DAA25833-E489-41C8-8273-093C8BA8E8D8}">
+<file path=customXml/itemProps3.xml><?xml version="1.0" encoding="utf-8"?>
+<ds:datastoreItem xmlns:ds="http://schemas.openxmlformats.org/officeDocument/2006/customXml" ds:itemID="{EABDE521-F839-48BC-95EA-DE4C51012934}">
   <ds:schemaRefs>
-    <ds:schemaRef ds:uri="http://schemas.openxmlformats.org/officeDocument/2006/bibliography"/>
+    <ds:schemaRef ds:uri="http://schemas.microsoft.com/office/2006/metadata/properties"/>
+    <ds:schemaRef ds:uri="http://schemas.microsoft.com/office/infopath/2007/PartnerControls"/>
+    <ds:schemaRef ds:uri="c0c9f81d-ef68-4e5d-9bcf-b103681cbac3"/>
+    <ds:schemaRef ds:uri="f3a57e1c-1999-4156-b16e-d47b3124d557"/>
   </ds:schemaRefs>
 </ds:datastoreItem>
 </file>
 
-<file path=customXml/itemProps3.xml><?xml version="1.0" encoding="utf-8"?>
+<file path=customXml/itemProps4.xml><?xml version="1.0" encoding="utf-8"?>
 <ds:datastoreItem xmlns:ds="http://schemas.openxmlformats.org/officeDocument/2006/customXml" ds:itemID="{A5267C40-150B-4856-A43C-F3B2BDCA3715}">
   <ds:schemaRefs>
     <ds:schemaRef ds:uri="http://schemas.microsoft.com/office/2006/metadata/contentType"/>
@@ -10764,15 +11355,4 @@
     <ds:schemaRef ds:uri="http://schemas.microsoft.com/internal/obd"/>
   </ds:schemaRefs>
 </ds:datastoreItem>
-</file>
-
-<file path=customXml/itemProps4.xml><?xml version="1.0" encoding="utf-8"?>
-<ds:datastoreItem xmlns:ds="http://schemas.openxmlformats.org/officeDocument/2006/customXml" ds:itemID="{EABDE521-F839-48BC-95EA-DE4C51012934}">
-  <ds:schemaRefs>
-    <ds:schemaRef ds:uri="http://schemas.microsoft.com/office/2006/metadata/properties"/>
-    <ds:schemaRef ds:uri="http://schemas.microsoft.com/office/infopath/2007/PartnerControls"/>
-    <ds:schemaRef ds:uri="c0c9f81d-ef68-4e5d-9bcf-b103681cbac3"/>
-    <ds:schemaRef ds:uri="f3a57e1c-1999-4156-b16e-d47b3124d557"/>
-  </ds:schemaRefs>
-</ds:datastoreItem>
 </file>
</xml_diff>

<commit_message>
Error on previous commit, save project book
</commit_message>
<xml_diff>
--- a/Uri_Cohen_Project_book.docx
+++ b/Uri_Cohen_Project_book.docx
@@ -469,7 +469,7 @@
             <w:pPr>
               <w:bidi/>
               <w:rPr>
-                <w:rFonts w:ascii="Arial" w:hAnsi="Arial" w:hint="cs"/>
+                <w:rFonts w:ascii="Arial" w:hAnsi="Arial"/>
                 <w:szCs w:val="24"/>
                 <w:rtl/>
                 <w:lang w:bidi="he-IL"/>
@@ -2813,23 +2813,7 @@
             <w:rFonts w:ascii="Arial" w:hAnsi="Arial"/>
             <w:noProof/>
           </w:rPr>
-          <w:t>DB</w:t>
-        </w:r>
-        <w:r>
-          <w:rPr>
-            <w:rStyle w:val="Hyperlink"/>
-            <w:rFonts w:ascii="Arial" w:hAnsi="Arial"/>
-            <w:noProof/>
-          </w:rPr>
-          <w:t xml:space="preserve"> </w:t>
-        </w:r>
-        <w:r>
-          <w:rPr>
-            <w:rStyle w:val="Hyperlink"/>
-            <w:rFonts w:ascii="Arial" w:hAnsi="Arial"/>
-            <w:noProof/>
-          </w:rPr>
-          <w:t>tables</w:t>
+          <w:t>DB tables</w:t>
         </w:r>
         <w:r>
           <w:rPr>
@@ -3308,7 +3292,7 @@
           <w:tab w:val="right" w:leader="dot" w:pos="9061"/>
         </w:tabs>
         <w:rPr>
-          <w:rFonts w:ascii="Arial" w:hAnsi="Arial" w:hint="cs"/>
+          <w:rFonts w:ascii="Arial" w:hAnsi="Arial"/>
           <w:noProof/>
           <w:kern w:val="2"/>
           <w:szCs w:val="24"/>
@@ -4710,6 +4694,7 @@
       </w:pPr>
       <w:bookmarkStart w:id="4" w:name="_Toc186985899"/>
       <w:bookmarkStart w:id="5" w:name="_Toc209893724"/>
+      <w:proofErr w:type="spellStart"/>
       <w:r>
         <w:rPr>
           <w:rFonts w:ascii="Arial" w:hAnsi="Arial"/>
@@ -4717,16 +4702,19 @@
           <w:szCs w:val="28"/>
           <w:rtl/>
         </w:rPr>
-        <w:t>מטרתה של תוכנה זו היא להמיר בין מטבעות שונים. כידוע, ברחבי העולם משתמשים במטבעות רבים, ויחס ההמרה בין המטבעות משתנה באופן יומיומי. לדוגמה, בעת כתיבת שורות אלה דולר אמריקני אחד שווה ל-3.31 ש"ח, בעוד שבסוף 2023 הוא היה שווה 3.8 ש"ח ואף יותר מכך. לכן החלטתי להשתמש ב-</w:t>
-      </w:r>
+        <w:t>מטרתה</w:t>
+      </w:r>
+      <w:proofErr w:type="spellEnd"/>
       <w:r>
         <w:rPr>
           <w:rFonts w:ascii="Arial" w:hAnsi="Arial"/>
           <w:sz w:val="28"/>
           <w:szCs w:val="28"/>
-        </w:rPr>
-        <w:t>API</w:t>
-      </w:r>
+          <w:rtl/>
+        </w:rPr>
+        <w:t xml:space="preserve"> </w:t>
+      </w:r>
+      <w:proofErr w:type="spellStart"/>
       <w:r>
         <w:rPr>
           <w:rFonts w:ascii="Arial" w:hAnsi="Arial"/>
@@ -4734,6 +4722,203 @@
           <w:szCs w:val="28"/>
           <w:rtl/>
         </w:rPr>
+        <w:t>של</w:t>
+      </w:r>
+      <w:proofErr w:type="spellEnd"/>
+      <w:r>
+        <w:rPr>
+          <w:rFonts w:ascii="Arial" w:hAnsi="Arial"/>
+          <w:sz w:val="28"/>
+          <w:szCs w:val="28"/>
+          <w:rtl/>
+        </w:rPr>
+        <w:t xml:space="preserve"> </w:t>
+      </w:r>
+      <w:proofErr w:type="spellStart"/>
+      <w:r>
+        <w:rPr>
+          <w:rFonts w:ascii="Arial" w:hAnsi="Arial"/>
+          <w:sz w:val="28"/>
+          <w:szCs w:val="28"/>
+          <w:rtl/>
+        </w:rPr>
+        <w:t>תוכנה</w:t>
+      </w:r>
+      <w:proofErr w:type="spellEnd"/>
+      <w:r>
+        <w:rPr>
+          <w:rFonts w:ascii="Arial" w:hAnsi="Arial"/>
+          <w:sz w:val="28"/>
+          <w:szCs w:val="28"/>
+          <w:rtl/>
+        </w:rPr>
+        <w:t xml:space="preserve"> </w:t>
+      </w:r>
+      <w:proofErr w:type="spellStart"/>
+      <w:r>
+        <w:rPr>
+          <w:rFonts w:ascii="Arial" w:hAnsi="Arial"/>
+          <w:sz w:val="28"/>
+          <w:szCs w:val="28"/>
+          <w:rtl/>
+        </w:rPr>
+        <w:t>זו</w:t>
+      </w:r>
+      <w:proofErr w:type="spellEnd"/>
+      <w:r>
+        <w:rPr>
+          <w:rFonts w:ascii="Arial" w:hAnsi="Arial"/>
+          <w:sz w:val="28"/>
+          <w:szCs w:val="28"/>
+          <w:rtl/>
+        </w:rPr>
+        <w:t xml:space="preserve"> </w:t>
+      </w:r>
+      <w:proofErr w:type="spellStart"/>
+      <w:r>
+        <w:rPr>
+          <w:rFonts w:ascii="Arial" w:hAnsi="Arial"/>
+          <w:sz w:val="28"/>
+          <w:szCs w:val="28"/>
+          <w:rtl/>
+        </w:rPr>
+        <w:t>היא</w:t>
+      </w:r>
+      <w:proofErr w:type="spellEnd"/>
+      <w:r>
+        <w:rPr>
+          <w:rFonts w:ascii="Arial" w:hAnsi="Arial"/>
+          <w:sz w:val="28"/>
+          <w:szCs w:val="28"/>
+          <w:rtl/>
+        </w:rPr>
+        <w:t xml:space="preserve"> </w:t>
+      </w:r>
+      <w:proofErr w:type="spellStart"/>
+      <w:r>
+        <w:rPr>
+          <w:rFonts w:ascii="Arial" w:hAnsi="Arial"/>
+          <w:sz w:val="28"/>
+          <w:szCs w:val="28"/>
+          <w:rtl/>
+        </w:rPr>
+        <w:t>לה</w:t>
+      </w:r>
+      <w:r>
+        <w:rPr>
+          <w:rFonts w:ascii="Arial" w:hAnsi="Arial" w:hint="cs"/>
+          <w:sz w:val="28"/>
+          <w:szCs w:val="28"/>
+          <w:rtl/>
+          <w:lang w:bidi="he-IL"/>
+        </w:rPr>
+        <w:t>ציג</w:t>
+      </w:r>
+      <w:proofErr w:type="spellEnd"/>
+      <w:r>
+        <w:rPr>
+          <w:rFonts w:ascii="Arial" w:hAnsi="Arial" w:hint="cs"/>
+          <w:sz w:val="28"/>
+          <w:szCs w:val="28"/>
+          <w:rtl/>
+          <w:lang w:bidi="he-IL"/>
+        </w:rPr>
+        <w:t xml:space="preserve"> למשתמש מידע כלכלי בזמן אמת, כגון המרה</w:t>
+      </w:r>
+      <w:r>
+        <w:rPr>
+          <w:rFonts w:ascii="Arial" w:hAnsi="Arial"/>
+          <w:sz w:val="28"/>
+          <w:szCs w:val="28"/>
+          <w:rtl/>
+        </w:rPr>
+        <w:t xml:space="preserve"> </w:t>
+      </w:r>
+      <w:proofErr w:type="spellStart"/>
+      <w:r>
+        <w:rPr>
+          <w:rFonts w:ascii="Arial" w:hAnsi="Arial"/>
+          <w:sz w:val="28"/>
+          <w:szCs w:val="28"/>
+          <w:rtl/>
+        </w:rPr>
+        <w:t>בין</w:t>
+      </w:r>
+      <w:proofErr w:type="spellEnd"/>
+      <w:r>
+        <w:rPr>
+          <w:rFonts w:ascii="Arial" w:hAnsi="Arial"/>
+          <w:sz w:val="28"/>
+          <w:szCs w:val="28"/>
+          <w:rtl/>
+        </w:rPr>
+        <w:t xml:space="preserve"> </w:t>
+      </w:r>
+      <w:proofErr w:type="spellStart"/>
+      <w:r>
+        <w:rPr>
+          <w:rFonts w:ascii="Arial" w:hAnsi="Arial"/>
+          <w:sz w:val="28"/>
+          <w:szCs w:val="28"/>
+          <w:rtl/>
+        </w:rPr>
+        <w:t>מטבעות</w:t>
+      </w:r>
+      <w:proofErr w:type="spellEnd"/>
+      <w:r>
+        <w:rPr>
+          <w:rFonts w:ascii="Arial" w:hAnsi="Arial"/>
+          <w:sz w:val="28"/>
+          <w:szCs w:val="28"/>
+          <w:rtl/>
+        </w:rPr>
+        <w:t xml:space="preserve"> </w:t>
+      </w:r>
+      <w:proofErr w:type="spellStart"/>
+      <w:r>
+        <w:rPr>
+          <w:rFonts w:ascii="Arial" w:hAnsi="Arial"/>
+          <w:sz w:val="28"/>
+          <w:szCs w:val="28"/>
+          <w:rtl/>
+        </w:rPr>
+        <w:t>שונים</w:t>
+      </w:r>
+      <w:proofErr w:type="spellEnd"/>
+      <w:r>
+        <w:rPr>
+          <w:rFonts w:ascii="Arial" w:hAnsi="Arial" w:hint="cs"/>
+          <w:sz w:val="28"/>
+          <w:szCs w:val="28"/>
+          <w:rtl/>
+          <w:lang w:bidi="he-IL"/>
+        </w:rPr>
+        <w:t xml:space="preserve"> ומחירי המניות של החברות הגדולות בעולם</w:t>
+      </w:r>
+      <w:r>
+        <w:rPr>
+          <w:rFonts w:ascii="Arial" w:hAnsi="Arial"/>
+          <w:sz w:val="28"/>
+          <w:szCs w:val="28"/>
+          <w:rtl/>
+        </w:rPr>
+        <w:t>. כידוע, ברחבי העולם משתמשים במטבעות רבים, ויחס ההמרה בין המטבעות משתנה באופן יומיומי. לדוגמה, בעת כתיבת שורות אלה דולר אמריקני אחד שווה ל-3.31 ש"ח, בעוד שבסוף 2023 הוא היה שווה 3.8 ש"ח ואף יותר מכך. לכן החלטתי להשתמש ב-</w:t>
+      </w:r>
+      <w:r>
+        <w:rPr>
+          <w:rFonts w:ascii="Arial" w:hAnsi="Arial"/>
+          <w:sz w:val="28"/>
+          <w:szCs w:val="28"/>
+        </w:rPr>
+        <w:t>API</w:t>
+      </w:r>
+      <w:r>
+        <w:rPr>
+          <w:rFonts w:ascii="Arial" w:hAnsi="Arial"/>
+          <w:sz w:val="28"/>
+          <w:szCs w:val="28"/>
+          <w:rtl/>
+        </w:rPr>
         <w:t xml:space="preserve"> שיקשר את התוכנה למאגר מידע המכיל את שערי ההמרה בין המטבעות בעולם בזמן אמת. בנוסף, התוכנה גם מממשת מערכת של חשבונות משתמש, עם שם משתמש וסיסמה לכל חשבון.</w:t>
       </w:r>
     </w:p>
@@ -4826,7 +5011,29 @@
           <w:rtl/>
           <w:lang w:eastAsia="en-US"/>
         </w:rPr>
-        <w:t xml:space="preserve">. ניתן להתקין את הגרסה העדכנית של פייתון </w:t>
+        <w:t xml:space="preserve">. ניתן להתקין את הגרסה העדכנית של </w:t>
+      </w:r>
+      <w:proofErr w:type="spellStart"/>
+      <w:r>
+        <w:rPr>
+          <w:rFonts w:ascii="Arial" w:hAnsi="Arial" w:cs="Arial" w:hint="cs"/>
+          <w:i w:val="0"/>
+          <w:iCs w:val="0"/>
+          <w:rtl/>
+          <w:lang w:eastAsia="en-US"/>
+        </w:rPr>
+        <w:t>פייתון</w:t>
+      </w:r>
+      <w:proofErr w:type="spellEnd"/>
+      <w:r>
+        <w:rPr>
+          <w:rFonts w:ascii="Arial" w:hAnsi="Arial" w:cs="Arial" w:hint="cs"/>
+          <w:i w:val="0"/>
+          <w:iCs w:val="0"/>
+          <w:rtl/>
+          <w:lang w:eastAsia="en-US"/>
+        </w:rPr>
+        <w:t xml:space="preserve"> </w:t>
       </w:r>
       <w:hyperlink r:id="rId11" w:history="1">
         <w:r>
@@ -4849,7 +5056,16 @@
           <w:rtl/>
           <w:lang w:eastAsia="en-US"/>
         </w:rPr>
-        <w:t>. לפני הרצת השרת, יש ליצור חשבון</w:t>
+        <w:t xml:space="preserve">, ואת הספריות הדרושות לפעולת התוכנה ניתן למצוא בקובץ </w:t>
+      </w:r>
+      <w:r>
+        <w:rPr>
+          <w:rFonts w:ascii="Arial" w:hAnsi="Arial" w:cs="Arial"/>
+          <w:i w:val="0"/>
+          <w:iCs w:val="0"/>
+          <w:lang w:eastAsia="en-US"/>
+        </w:rPr>
+        <w:t>requirements.txt</w:t>
       </w:r>
       <w:r>
         <w:rPr>
@@ -4859,6 +5075,26 @@
           <w:rtl/>
           <w:lang w:eastAsia="en-US"/>
         </w:rPr>
+        <w:t>.</w:t>
+      </w:r>
+      <w:r>
+        <w:rPr>
+          <w:rFonts w:ascii="Arial" w:hAnsi="Arial" w:cs="Arial" w:hint="cs"/>
+          <w:i w:val="0"/>
+          <w:iCs w:val="0"/>
+          <w:rtl/>
+          <w:lang w:eastAsia="en-US"/>
+        </w:rPr>
+        <w:t xml:space="preserve"> לפני הרצת השרת, יש ליצור חשבון</w:t>
+      </w:r>
+      <w:r>
+        <w:rPr>
+          <w:rFonts w:ascii="Arial" w:hAnsi="Arial" w:cs="Arial" w:hint="cs"/>
+          <w:i w:val="0"/>
+          <w:iCs w:val="0"/>
+          <w:rtl/>
+          <w:lang w:eastAsia="en-US"/>
+        </w:rPr>
         <w:t xml:space="preserve"> גוגל</w:t>
       </w:r>
       <w:r>
@@ -4908,15 +5144,35 @@
           <w:rtl/>
           <w:lang w:eastAsia="en-US"/>
         </w:rPr>
-        <w:t xml:space="preserve"> וכן ליצור חשבון עם מפתח </w:t>
+        <w:t xml:space="preserve"> וכן ליצור חשבו</w:t>
       </w:r>
       <w:r>
         <w:rPr>
           <w:rFonts w:ascii="Arial" w:hAnsi="Arial" w:cs="Arial" w:hint="cs"/>
           <w:i w:val="0"/>
           <w:iCs w:val="0"/>
+          <w:rtl/>
           <w:lang w:eastAsia="en-US"/>
         </w:rPr>
+        <w:t>נות</w:t>
+      </w:r>
+      <w:r>
+        <w:rPr>
+          <w:rFonts w:ascii="Arial" w:hAnsi="Arial" w:cs="Arial" w:hint="cs"/>
+          <w:i w:val="0"/>
+          <w:iCs w:val="0"/>
+          <w:rtl/>
+          <w:lang w:eastAsia="en-US"/>
+        </w:rPr>
+        <w:t xml:space="preserve"> עם מפתח </w:t>
+      </w:r>
+      <w:r>
+        <w:rPr>
+          <w:rFonts w:ascii="Arial" w:hAnsi="Arial" w:cs="Arial" w:hint="cs"/>
+          <w:i w:val="0"/>
+          <w:iCs w:val="0"/>
+          <w:lang w:eastAsia="en-US"/>
+        </w:rPr>
         <w:t>API</w:t>
       </w:r>
       <w:r>
@@ -4955,7 +5211,38 @@
           <w:rtl/>
           <w:lang w:val="ru-RU" w:eastAsia="en-US"/>
         </w:rPr>
-        <w:t>. אלה ישמשו לקובץ ה-</w:t>
+        <w:t xml:space="preserve"> ובאתר </w:t>
+      </w:r>
+      <w:proofErr w:type="spellStart"/>
+      <w:r>
+        <w:rPr>
+          <w:rFonts w:ascii="Arial" w:hAnsi="Arial" w:cs="Arial"/>
+          <w:i w:val="0"/>
+          <w:iCs w:val="0"/>
+          <w:lang w:eastAsia="en-US"/>
+        </w:rPr>
+        <w:t>Finnhub</w:t>
+      </w:r>
+      <w:proofErr w:type="spellEnd"/>
+      <w:r>
+        <w:rPr>
+          <w:rFonts w:ascii="Arial" w:hAnsi="Arial" w:cs="Arial" w:hint="cs"/>
+          <w:i w:val="0"/>
+          <w:iCs w:val="0"/>
+          <w:rtl/>
+          <w:lang w:eastAsia="en-US"/>
+        </w:rPr>
+        <w:t>. חשבונות</w:t>
+      </w:r>
+      <w:r>
+        <w:rPr>
+          <w:rFonts w:ascii="Arial" w:hAnsi="Arial" w:cs="Arial" w:hint="cs"/>
+          <w:i w:val="0"/>
+          <w:iCs w:val="0"/>
+          <w:rtl/>
+          <w:lang w:val="ru-RU" w:eastAsia="en-US"/>
+        </w:rPr>
+        <w:t xml:space="preserve"> אלה ישמשו לקובץ ה-</w:t>
       </w:r>
       <w:r>
         <w:rPr>
@@ -5012,7 +5299,37 @@
           <w:rtl/>
           <w:lang w:eastAsia="en-US"/>
         </w:rPr>
-        <w:t>מיועד לכל אדם עם עניין כלשהו בכלכלה, שערי מטבעות,</w:t>
+        <w:t xml:space="preserve">תוכנה זו </w:t>
+      </w:r>
+      <w:r>
+        <w:rPr>
+          <w:rFonts w:ascii="Arial" w:hAnsi="Arial" w:cs="Arial" w:hint="cs"/>
+          <w:i w:val="0"/>
+          <w:iCs w:val="0"/>
+          <w:rtl/>
+          <w:lang w:eastAsia="en-US"/>
+        </w:rPr>
+        <w:t>מיועד</w:t>
+      </w:r>
+      <w:r>
+        <w:rPr>
+          <w:rFonts w:ascii="Arial" w:hAnsi="Arial" w:cs="Arial" w:hint="cs"/>
+          <w:i w:val="0"/>
+          <w:iCs w:val="0"/>
+          <w:rtl/>
+          <w:lang w:eastAsia="en-US"/>
+        </w:rPr>
+        <w:t>ת</w:t>
+      </w:r>
+      <w:r>
+        <w:rPr>
+          <w:rFonts w:ascii="Arial" w:hAnsi="Arial" w:cs="Arial" w:hint="cs"/>
+          <w:i w:val="0"/>
+          <w:iCs w:val="0"/>
+          <w:rtl/>
+          <w:lang w:eastAsia="en-US"/>
+        </w:rPr>
+        <w:t xml:space="preserve"> לכל אדם עם עניין כלשהו בכלכלה, שערי מטבעות,</w:t>
       </w:r>
       <w:r>
         <w:rPr>
@@ -5157,7 +5474,25 @@
           <w:iCs w:val="0"/>
           <w:lang w:eastAsia="en-US"/>
         </w:rPr>
-        <w:t>, email-validator</w:t>
+        <w:t>,</w:t>
+      </w:r>
+      <w:r>
+        <w:rPr>
+          <w:rFonts w:ascii="Arial" w:hAnsi="Arial" w:cs="Arial"/>
+          <w:i w:val="0"/>
+          <w:iCs w:val="0"/>
+          <w:lang w:eastAsia="en-US"/>
+        </w:rPr>
+        <w:t xml:space="preserve"> cryptography,</w:t>
+      </w:r>
+      <w:r>
+        <w:rPr>
+          <w:rFonts w:ascii="Arial" w:hAnsi="Arial" w:cs="Arial"/>
+          <w:i w:val="0"/>
+          <w:iCs w:val="0"/>
+          <w:lang w:eastAsia="en-US"/>
+        </w:rPr>
+        <w:t xml:space="preserve"> email-validator</w:t>
       </w:r>
       <w:r>
         <w:rPr>
@@ -5656,11 +5991,8 @@
     <w:p>
       <w:pPr>
         <w:pStyle w:val="Comment"/>
-        <w:numPr>
-          <w:ilvl w:val="0"/>
-          <w:numId w:val="18"/>
-        </w:numPr>
         <w:bidi/>
+        <w:ind w:right="720"/>
         <w:rPr>
           <w:rFonts w:ascii="Arial" w:hAnsi="Arial" w:cs="Arial"/>
           <w:i w:val="0"/>
@@ -5837,11 +6169,8 @@
     <w:p>
       <w:pPr>
         <w:pStyle w:val="Comment"/>
-        <w:numPr>
-          <w:ilvl w:val="0"/>
-          <w:numId w:val="18"/>
-        </w:numPr>
         <w:bidi/>
+        <w:ind w:right="720"/>
         <w:rPr>
           <w:rFonts w:ascii="Arial" w:hAnsi="Arial" w:cs="Arial"/>
           <w:i w:val="0"/>
@@ -6034,7 +6363,6 @@
       <w:bookmarkStart w:id="12" w:name="_Toc186985903"/>
       <w:bookmarkStart w:id="13" w:name="_Toc209893728"/>
       <w:r>
-        <w:lastRenderedPageBreak/>
         <w:t>Subsystem Architecture</w:t>
       </w:r>
       <w:bookmarkEnd w:id="12"/>
@@ -6043,6 +6371,10 @@
     <w:p>
       <w:pPr>
         <w:pStyle w:val="4"/>
+        <w:rPr>
+          <w:rtl/>
+          <w:lang w:bidi="he-IL"/>
+        </w:rPr>
       </w:pPr>
       <w:r>
         <w:t xml:space="preserve">Use Case – </w:t>
@@ -6058,6 +6390,76 @@
       </w:r>
       <w:r>
         <w:t xml:space="preserve"> Register</w:t>
+      </w:r>
+    </w:p>
+    <w:p>
+      <w:pPr>
+        <w:bidi/>
+        <w:rPr>
+          <w:rFonts w:hint="cs"/>
+          <w:rtl/>
+          <w:lang w:bidi="he-IL"/>
+        </w:rPr>
+      </w:pPr>
+      <w:r>
+        <w:rPr>
+          <w:rFonts w:hint="cs"/>
+          <w:rtl/>
+          <w:lang w:bidi="he-IL"/>
+        </w:rPr>
+        <w:t>הלקוח מזין שם משתמש, סיסמה, וכתובת דואר אלקטרוני. השרת מקבל נתונים אלו ובודק</w:t>
+      </w:r>
+      <w:r>
+        <w:rPr>
+          <w:rFonts w:hint="cs"/>
+          <w:rtl/>
+          <w:lang w:bidi="he-IL"/>
+        </w:rPr>
+        <w:t xml:space="preserve"> את תקינותם. אם שם המשתמש לא קיים כבר במערכת, הסיסמה בת 8 תווים לפחות, וגם כתובת המייל תקנית</w:t>
+      </w:r>
+      <w:r>
+        <w:rPr>
+          <w:rFonts w:hint="cs"/>
+          <w:rtl/>
+          <w:lang w:bidi="he-IL"/>
+        </w:rPr>
+        <w:t xml:space="preserve"> ולא נעשה בה שימוש ליצירת חשבון קודם</w:t>
+      </w:r>
+      <w:r>
+        <w:rPr>
+          <w:rFonts w:hint="cs"/>
+          <w:rtl/>
+          <w:lang w:bidi="he-IL"/>
+        </w:rPr>
+        <w:t>, השרת שומר את המשתמש בטבלת המשתמשים ושולח ללקוח הודעה על יצירת החשבון. אחרת, השרת שולח ללקוח הודעת שגיאה. בכל מקרה, ערך פונקציית ה-</w:t>
+      </w:r>
+      <w:r>
+        <w:rPr>
+          <w:lang w:bidi="he-IL"/>
+        </w:rPr>
+        <w:t>hash</w:t>
+      </w:r>
+      <w:r>
+        <w:rPr>
+          <w:rFonts w:hint="cs"/>
+          <w:rtl/>
+          <w:lang w:bidi="he-IL"/>
+        </w:rPr>
+        <w:t xml:space="preserve"> של הסיסמה הוא זה שנשמר (על פי אלגוריתם </w:t>
+      </w:r>
+      <w:r>
+        <w:rPr>
+          <w:lang w:bidi="he-IL"/>
+        </w:rPr>
+        <w:t>SHA</w:t>
+      </w:r>
+      <w:r>
+        <w:rPr>
+          <w:rFonts w:hint="cs"/>
+          <w:rtl/>
+          <w:lang w:bidi="he-IL"/>
+        </w:rPr>
+        <w:t>-256) ולא הסיסמה עצמה.</w:t>
       </w:r>
     </w:p>
     <w:p>
@@ -6071,6 +6473,7 @@
           <w:rFonts w:ascii="Arial" w:hAnsi="Arial"/>
           <w:noProof/>
         </w:rPr>
+        <w:lastRenderedPageBreak/>
         <w:drawing>
           <wp:inline distT="0" distB="0" distL="0" distR="0" wp14:anchorId="4F22AC8F" wp14:editId="06556E5E">
             <wp:extent cx="5753735" cy="2214880"/>
@@ -6124,12 +6527,62 @@
     <w:p>
       <w:pPr>
         <w:pStyle w:val="4"/>
+        <w:rPr>
+          <w:rtl/>
+          <w:lang w:bidi="he-IL"/>
+        </w:rPr>
       </w:pPr>
       <w:r>
         <w:t xml:space="preserve">Use Case – </w:t>
       </w:r>
       <w:r>
         <w:t>Login</w:t>
+      </w:r>
+    </w:p>
+    <w:p>
+      <w:pPr>
+        <w:bidi/>
+        <w:rPr>
+          <w:rFonts w:hint="cs"/>
+          <w:rtl/>
+          <w:lang w:bidi="he-IL"/>
+        </w:rPr>
+      </w:pPr>
+      <w:r>
+        <w:rPr>
+          <w:rFonts w:hint="cs"/>
+          <w:rtl/>
+          <w:lang w:bidi="he-IL"/>
+        </w:rPr>
+        <w:t xml:space="preserve">הלקוח מזין שם משתמש וסיסמה. הסיסמה עוברת </w:t>
+      </w:r>
+      <w:r>
+        <w:rPr>
+          <w:lang w:bidi="he-IL"/>
+        </w:rPr>
+        <w:t>hashing</w:t>
+      </w:r>
+      <w:r>
+        <w:rPr>
+          <w:rFonts w:hint="cs"/>
+          <w:rtl/>
+          <w:lang w:bidi="he-IL"/>
+        </w:rPr>
+        <w:t>, ואם ה-</w:t>
+      </w:r>
+      <w:r>
+        <w:rPr>
+          <w:lang w:bidi="he-IL"/>
+        </w:rPr>
+        <w:t>hash</w:t>
+      </w:r>
+      <w:r>
+        <w:rPr>
+          <w:rFonts w:hint="cs"/>
+          <w:rtl/>
+          <w:lang w:bidi="he-IL"/>
+        </w:rPr>
+        <w:t xml:space="preserve"> זהה לזה המופיע במערכת בעבור שם המשתמש הזה, הלקוח מוכנס לחשבון. אחרת, מוצגת הודעת שגיאה הקוראת ללקוח להזין שם משתמש וסיסמה חדשים, או לאפס את הסיסמה.</w:t>
       </w:r>
     </w:p>
     <w:p>
@@ -6196,13 +6649,116 @@
     <w:p>
       <w:pPr>
         <w:pStyle w:val="4"/>
-      </w:pPr>
-      <w:r>
-        <w:lastRenderedPageBreak/>
+        <w:rPr>
+          <w:rtl/>
+          <w:lang w:bidi="he-IL"/>
+        </w:rPr>
+      </w:pPr>
+      <w:r>
         <w:t xml:space="preserve">Sequence diagram – </w:t>
       </w:r>
       <w:r>
         <w:t>Convert currency</w:t>
+      </w:r>
+    </w:p>
+    <w:p>
+      <w:pPr>
+        <w:bidi/>
+        <w:rPr>
+          <w:rFonts w:hint="cs"/>
+          <w:rtl/>
+          <w:lang w:bidi="he-IL"/>
+        </w:rPr>
+      </w:pPr>
+      <w:r>
+        <w:rPr>
+          <w:rFonts w:hint="cs"/>
+          <w:rtl/>
+          <w:lang w:bidi="he-IL"/>
+        </w:rPr>
+        <w:t>הלקוח מזין מטבע מקור להמרה שלו, מטבע יעד וסכום להמרה. ראשית השרת בודק האם</w:t>
+      </w:r>
+      <w:r>
+        <w:rPr>
+          <w:rFonts w:hint="cs"/>
+          <w:rtl/>
+          <w:lang w:bidi="he-IL"/>
+        </w:rPr>
+        <w:t xml:space="preserve"> המטבעות הם תקינים ואכן הוזן מספר בשדה הסכום. מטבע תקין הוא מטבע המופיע ברשימת המטבעות שהתוכנה תומכת בהם. רשימה זו לקוחה מרשימת המטבעות שמערכת ה-</w:t>
+      </w:r>
+      <w:r>
+        <w:rPr>
+          <w:lang w:bidi="he-IL"/>
+        </w:rPr>
+        <w:t>API</w:t>
+      </w:r>
+      <w:r>
+        <w:rPr>
+          <w:rFonts w:hint="cs"/>
+          <w:rtl/>
+          <w:lang w:bidi="he-IL"/>
+        </w:rPr>
+        <w:t xml:space="preserve"> תומכת בה, וכוללת את המטבעות של מרבית המדינות והטריטוריות בעולם, ואף מטבעות </w:t>
+      </w:r>
+      <w:proofErr w:type="spellStart"/>
+      <w:r>
+        <w:rPr>
+          <w:rFonts w:hint="cs"/>
+          <w:rtl/>
+          <w:lang w:bidi="he-IL"/>
+        </w:rPr>
+        <w:t>קריפטו</w:t>
+      </w:r>
+      <w:proofErr w:type="spellEnd"/>
+      <w:r>
+        <w:rPr>
+          <w:rFonts w:hint="cs"/>
+          <w:rtl/>
+          <w:lang w:bidi="he-IL"/>
+        </w:rPr>
+        <w:t xml:space="preserve"> וכן מחירים שאינם מטבעות, כגון מחירה של אונקיית זהב (כ-31 גרם). אם הערכים לא תקינים מוצגת הודעת שגיאה.</w:t>
+      </w:r>
+      <w:r>
+        <w:rPr>
+          <w:lang w:bidi="he-IL"/>
+        </w:rPr>
+        <w:t xml:space="preserve"> </w:t>
+      </w:r>
+      <w:r>
+        <w:rPr>
+          <w:rFonts w:hint="cs"/>
+          <w:rtl/>
+          <w:lang w:bidi="he-IL"/>
+        </w:rPr>
+        <w:t xml:space="preserve"> אם הערכים תקינים, השרת שולח בקשה ל-</w:t>
+      </w:r>
+      <w:r>
+        <w:rPr>
+          <w:lang w:bidi="he-IL"/>
+        </w:rPr>
+        <w:t>API</w:t>
+      </w:r>
+      <w:r>
+        <w:rPr>
+          <w:rFonts w:hint="cs"/>
+          <w:rtl/>
+          <w:lang w:bidi="he-IL"/>
+        </w:rPr>
+        <w:t xml:space="preserve"> ומבקש את שערי המטבעות. בשל מגבלות הגרסה החינמית של ה-</w:t>
+      </w:r>
+      <w:r>
+        <w:rPr>
+          <w:lang w:bidi="he-IL"/>
+        </w:rPr>
+        <w:t>API</w:t>
+      </w:r>
+      <w:r>
+        <w:rPr>
+          <w:rFonts w:hint="cs"/>
+          <w:rtl/>
+          <w:lang w:bidi="he-IL"/>
+        </w:rPr>
+        <w:t xml:space="preserve"> בה השתמשתי, ניתן לבקש אך ורק את שער הדולר האמריקני במטבע מסוים (כמה יחידות מטבע שוות דולר אחד). עקפתי את זה על ידי בקשת שני השערים, של מטבע המוצא ושל מטבע היעד, בדולר ואז ביצוע החישובים המתאימים על מנת להגיע לערך המטבעות, אותו השרת מעביר ללקוח.</w:t>
       </w:r>
     </w:p>
     <w:p>
@@ -6223,6 +6779,7 @@
           <w:noProof/>
           <w:szCs w:val="20"/>
         </w:rPr>
+        <w:lastRenderedPageBreak/>
         <w:drawing>
           <wp:inline distT="0" distB="0" distL="0" distR="0" wp14:anchorId="1E6356C7" wp14:editId="3702F89B">
             <wp:extent cx="5753735" cy="2220595"/>
@@ -6276,6 +6833,10 @@
     <w:p>
       <w:pPr>
         <w:pStyle w:val="4"/>
+        <w:rPr>
+          <w:rtl/>
+          <w:lang w:bidi="he-IL"/>
+        </w:rPr>
       </w:pPr>
       <w:r>
         <w:t xml:space="preserve">Sequence diagram – </w:t>
@@ -6283,6 +6844,13 @@
       <w:r>
         <w:t>Reset password</w:t>
       </w:r>
+    </w:p>
+    <w:p>
+      <w:pPr>
+        <w:rPr>
+          <w:lang w:bidi="he-IL"/>
+        </w:rPr>
+      </w:pPr>
     </w:p>
     <w:p>
       <w:pPr>
@@ -10197,6 +10765,7 @@
   <w:style w:type="character" w:default="1" w:styleId="a0">
     <w:name w:val="Default Paragraph Font"/>
     <w:uiPriority w:val="1"/>
+    <w:semiHidden/>
     <w:unhideWhenUsed/>
   </w:style>
   <w:style w:type="table" w:default="1" w:styleId="a1">
@@ -11093,10 +11662,6 @@
 </file>
 
 <file path=customXml/item1.xml><?xml version="1.0" encoding="utf-8"?>
-<b:Sources xmlns:b="http://schemas.openxmlformats.org/officeDocument/2006/bibliography" xmlns="http://schemas.openxmlformats.org/officeDocument/2006/bibliography" SelectedStyle="\APASixthEditionOfficeOnline.xsl" StyleName="APA" Version="6"/>
-</file>
-
-<file path=customXml/item2.xml><?xml version="1.0" encoding="utf-8"?>
 <?mso-contentType ?>
 <FormTemplates xmlns="http://schemas.microsoft.com/sharepoint/v3/contenttype/forms">
   <Display>DocumentLibraryForm</Display>
@@ -11105,18 +11670,11 @@
 </FormTemplates>
 </file>
 
-<file path=customXml/item3.xml><?xml version="1.0" encoding="utf-8"?>
-<p:properties xmlns:p="http://schemas.microsoft.com/office/2006/metadata/properties" xmlns:xsi="http://www.w3.org/2001/XMLSchema-instance" xmlns:pc="http://schemas.microsoft.com/office/infopath/2007/PartnerControls">
-  <documentManagement>
-    <lcf76f155ced4ddcb4097134ff3c332f xmlns="c0c9f81d-ef68-4e5d-9bcf-b103681cbac3">
-      <Terms xmlns="http://schemas.microsoft.com/office/infopath/2007/PartnerControls"/>
-    </lcf76f155ced4ddcb4097134ff3c332f>
-    <TaxCatchAll xmlns="f3a57e1c-1999-4156-b16e-d47b3124d557"/>
-  </documentManagement>
-</p:properties>
+<file path=customXml/item2.xml><?xml version="1.0" encoding="utf-8"?>
+<b:Sources xmlns:b="http://schemas.openxmlformats.org/officeDocument/2006/bibliography" xmlns="http://schemas.openxmlformats.org/officeDocument/2006/bibliography" SelectedStyle="\APASixthEditionOfficeOnline.xsl" StyleName="APA" Version="6"/>
 </file>
 
-<file path=customXml/item4.xml><?xml version="1.0" encoding="utf-8"?>
+<file path=customXml/item3.xml><?xml version="1.0" encoding="utf-8"?>
 <ct:contentTypeSchema xmlns:ct="http://schemas.microsoft.com/office/2006/metadata/contentType" xmlns:ma="http://schemas.microsoft.com/office/2006/metadata/properties/metaAttributes" ct:_="" ma:_="" ma:contentTypeName="Document" ma:contentTypeID="0x0101000F67C5EAA0AAF94CAE02941BB00115D2" ma:contentTypeVersion="11" ma:contentTypeDescription="Create a new document." ma:contentTypeScope="" ma:versionID="7d5288bfced83754c62cf03f69334249">
   <xsd:schema xmlns:xsd="http://www.w3.org/2001/XMLSchema" xmlns:xs="http://www.w3.org/2001/XMLSchema" xmlns:p="http://schemas.microsoft.com/office/2006/metadata/properties" xmlns:ns2="c0c9f81d-ef68-4e5d-9bcf-b103681cbac3" xmlns:ns3="f3a57e1c-1999-4156-b16e-d47b3124d557" targetNamespace="http://schemas.microsoft.com/office/2006/metadata/properties" ma:root="true" ma:fieldsID="72cd722ef412a107c24fb233e63ad134" ns2:_="" ns3:_="">
     <xsd:import namespace="c0c9f81d-ef68-4e5d-9bcf-b103681cbac3"/>
@@ -11311,7 +11869,26 @@
 </ct:contentTypeSchema>
 </file>
 
+<file path=customXml/item4.xml><?xml version="1.0" encoding="utf-8"?>
+<p:properties xmlns:p="http://schemas.microsoft.com/office/2006/metadata/properties" xmlns:xsi="http://www.w3.org/2001/XMLSchema-instance" xmlns:pc="http://schemas.microsoft.com/office/infopath/2007/PartnerControls">
+  <documentManagement>
+    <lcf76f155ced4ddcb4097134ff3c332f xmlns="c0c9f81d-ef68-4e5d-9bcf-b103681cbac3">
+      <Terms xmlns="http://schemas.microsoft.com/office/infopath/2007/PartnerControls"/>
+    </lcf76f155ced4ddcb4097134ff3c332f>
+    <TaxCatchAll xmlns="f3a57e1c-1999-4156-b16e-d47b3124d557"/>
+  </documentManagement>
+</p:properties>
+</file>
+
 <file path=customXml/itemProps1.xml><?xml version="1.0" encoding="utf-8"?>
+<ds:datastoreItem xmlns:ds="http://schemas.openxmlformats.org/officeDocument/2006/customXml" ds:itemID="{CA5A7125-3DEA-4410-946E-E5090818D057}">
+  <ds:schemaRefs>
+    <ds:schemaRef ds:uri="http://schemas.microsoft.com/sharepoint/v3/contenttype/forms"/>
+  </ds:schemaRefs>
+</ds:datastoreItem>
+</file>
+
+<file path=customXml/itemProps2.xml><?xml version="1.0" encoding="utf-8"?>
 <ds:datastoreItem xmlns:ds="http://schemas.openxmlformats.org/officeDocument/2006/customXml" ds:itemID="{DAA25833-E489-41C8-8273-093C8BA8E8D8}">
   <ds:schemaRefs>
     <ds:schemaRef ds:uri="http://schemas.openxmlformats.org/officeDocument/2006/bibliography"/>
@@ -11319,26 +11896,7 @@
 </ds:datastoreItem>
 </file>
 
-<file path=customXml/itemProps2.xml><?xml version="1.0" encoding="utf-8"?>
-<ds:datastoreItem xmlns:ds="http://schemas.openxmlformats.org/officeDocument/2006/customXml" ds:itemID="{CA5A7125-3DEA-4410-946E-E5090818D057}">
-  <ds:schemaRefs>
-    <ds:schemaRef ds:uri="http://schemas.microsoft.com/sharepoint/v3/contenttype/forms"/>
-  </ds:schemaRefs>
-</ds:datastoreItem>
-</file>
-
 <file path=customXml/itemProps3.xml><?xml version="1.0" encoding="utf-8"?>
-<ds:datastoreItem xmlns:ds="http://schemas.openxmlformats.org/officeDocument/2006/customXml" ds:itemID="{EABDE521-F839-48BC-95EA-DE4C51012934}">
-  <ds:schemaRefs>
-    <ds:schemaRef ds:uri="http://schemas.microsoft.com/office/2006/metadata/properties"/>
-    <ds:schemaRef ds:uri="http://schemas.microsoft.com/office/infopath/2007/PartnerControls"/>
-    <ds:schemaRef ds:uri="c0c9f81d-ef68-4e5d-9bcf-b103681cbac3"/>
-    <ds:schemaRef ds:uri="f3a57e1c-1999-4156-b16e-d47b3124d557"/>
-  </ds:schemaRefs>
-</ds:datastoreItem>
-</file>
-
-<file path=customXml/itemProps4.xml><?xml version="1.0" encoding="utf-8"?>
 <ds:datastoreItem xmlns:ds="http://schemas.openxmlformats.org/officeDocument/2006/customXml" ds:itemID="{A5267C40-150B-4856-A43C-F3B2BDCA3715}">
   <ds:schemaRefs>
     <ds:schemaRef ds:uri="http://schemas.microsoft.com/office/2006/metadata/contentType"/>
@@ -11355,4 +11913,15 @@
     <ds:schemaRef ds:uri="http://schemas.microsoft.com/internal/obd"/>
   </ds:schemaRefs>
 </ds:datastoreItem>
+</file>
+
+<file path=customXml/itemProps4.xml><?xml version="1.0" encoding="utf-8"?>
+<ds:datastoreItem xmlns:ds="http://schemas.openxmlformats.org/officeDocument/2006/customXml" ds:itemID="{EABDE521-F839-48BC-95EA-DE4C51012934}">
+  <ds:schemaRefs>
+    <ds:schemaRef ds:uri="http://schemas.microsoft.com/office/2006/metadata/properties"/>
+    <ds:schemaRef ds:uri="http://schemas.microsoft.com/office/infopath/2007/PartnerControls"/>
+    <ds:schemaRef ds:uri="c0c9f81d-ef68-4e5d-9bcf-b103681cbac3"/>
+    <ds:schemaRef ds:uri="f3a57e1c-1999-4156-b16e-d47b3124d557"/>
+  </ds:schemaRefs>
+</ds:datastoreItem>
 </file>
</xml_diff>